<commit_message>
added  an ew files
</commit_message>
<xml_diff>
--- a/parse_functioons/data/Положение УКИЖИ.docx
+++ b/parse_functioons/data/Положение УКИЖИ.docx
@@ -336,7 +336,25 @@
           <w:sz w:val="28"/>
           <w:szCs w:val="28"/>
         </w:rPr>
-        <w:t>города Алматы»  (далее - Управление) является государственным органом Республики Казахстан, осуществляющим руководство в сфере жилищных отношений, безопасной технической эксплуатации опасных технических устройств, газопотребляющих систем и газового оборудования на объектах жилищно-коммунального хозяйства и формирования безопасной среды для комфортного проживания горожан на территории города Алматы.</w:t>
+        <w:t xml:space="preserve">города Алматы»  (далее - Управление) является государственным органом Республики Казахстан, осуществляющим руководство в сфере жилищных отношений, безопасной технической эксплуатации опасных технических устройств, </w:t>
+      </w:r>
+      <w:proofErr w:type="spellStart"/>
+      <w:r>
+        <w:rPr>
+          <w:rFonts w:ascii="Times New Roman" w:hAnsi="Times New Roman" w:cs="Times New Roman"/>
+          <w:sz w:val="28"/>
+          <w:szCs w:val="28"/>
+        </w:rPr>
+        <w:t>газопотребляющих</w:t>
+      </w:r>
+      <w:proofErr w:type="spellEnd"/>
+      <w:r>
+        <w:rPr>
+          <w:rFonts w:ascii="Times New Roman" w:hAnsi="Times New Roman" w:cs="Times New Roman"/>
+          <w:sz w:val="28"/>
+          <w:szCs w:val="28"/>
+        </w:rPr>
+        <w:t xml:space="preserve"> систем и газового оборудования на объектах жилищно-коммунального хозяйства и формирования безопасной среды для комфортного проживания горожан на территории города Алматы.</w:t>
       </w:r>
       <w:r>
         <w:rPr>
@@ -395,7 +413,25 @@
           <w:sz w:val="28"/>
           <w:szCs w:val="28"/>
         </w:rPr>
-        <w:t>Управление является юридическим лицом в организационно-правовой форме коммунального государственного учреждения, имеет печать с изображением Государственного Герба Республики Казахстан и штампы со своим наименованием на казахском языке, бланки установленного образца, счета в органах казначейства в соответствии с законодательством  Республики Казахстан.</w:t>
+        <w:t xml:space="preserve">Управление является юридическим лицом в организационно-правовой форме коммунального государственного учреждения, имеет печать с изображением Государственного Герба Республики Казахстан и штампы со своим наименованием на казахском языке, бланки установленного образца, счета в органах казначейства в соответствии с </w:t>
+      </w:r>
+      <w:proofErr w:type="gramStart"/>
+      <w:r>
+        <w:rPr>
+          <w:rFonts w:ascii="Times New Roman" w:hAnsi="Times New Roman" w:cs="Times New Roman"/>
+          <w:sz w:val="28"/>
+          <w:szCs w:val="28"/>
+        </w:rPr>
+        <w:t>законодательством  Республики</w:t>
+      </w:r>
+      <w:proofErr w:type="gramEnd"/>
+      <w:r>
+        <w:rPr>
+          <w:rFonts w:ascii="Times New Roman" w:hAnsi="Times New Roman" w:cs="Times New Roman"/>
+          <w:sz w:val="28"/>
+          <w:szCs w:val="28"/>
+        </w:rPr>
+        <w:t xml:space="preserve"> Казахстан.</w:t>
       </w:r>
     </w:p>
     <w:p>
@@ -527,7 +563,25 @@
           <w:sz w:val="28"/>
           <w:szCs w:val="28"/>
         </w:rPr>
-        <w:t>утверждаются в соответствии с законодательством  Республики  Казахстан.</w:t>
+        <w:t xml:space="preserve">утверждаются в соответствии с </w:t>
+      </w:r>
+      <w:proofErr w:type="gramStart"/>
+      <w:r>
+        <w:rPr>
+          <w:rFonts w:ascii="Times New Roman" w:hAnsi="Times New Roman" w:cs="Times New Roman"/>
+          <w:sz w:val="28"/>
+          <w:szCs w:val="28"/>
+        </w:rPr>
+        <w:t>законодательством  Республики</w:t>
+      </w:r>
+      <w:proofErr w:type="gramEnd"/>
+      <w:r>
+        <w:rPr>
+          <w:rFonts w:ascii="Times New Roman" w:hAnsi="Times New Roman" w:cs="Times New Roman"/>
+          <w:sz w:val="28"/>
+          <w:szCs w:val="28"/>
+        </w:rPr>
+        <w:t xml:space="preserve">  Казахстан.</w:t>
       </w:r>
       <w:r>
         <w:rPr>
@@ -569,881 +623,823 @@
           <w:sz w:val="28"/>
           <w:szCs w:val="28"/>
         </w:rPr>
-        <w:t>стонахождение Управления: 050021, город Алматы, Медеуский район, проспект Достык, 85.</w:t>
-      </w:r>
-    </w:p>
-    <w:p>
-      <w:pPr>
-        <w:spacing w:after="0" w:line="240" w:lineRule="auto"/>
+        <w:t xml:space="preserve">стонахождение Управления: 050021, город Алматы, Медеуский район, проспект </w:t>
+      </w:r>
+      <w:proofErr w:type="spellStart"/>
+      <w:r>
+        <w:rPr>
+          <w:rFonts w:ascii="Times New Roman" w:hAnsi="Times New Roman" w:cs="Times New Roman"/>
+          <w:sz w:val="28"/>
+          <w:szCs w:val="28"/>
+        </w:rPr>
+        <w:t>Достык</w:t>
+      </w:r>
+      <w:proofErr w:type="spellEnd"/>
+      <w:r>
+        <w:rPr>
+          <w:rFonts w:ascii="Times New Roman" w:hAnsi="Times New Roman" w:cs="Times New Roman"/>
+          <w:sz w:val="28"/>
+          <w:szCs w:val="28"/>
+        </w:rPr>
+        <w:t>, 85.</w:t>
+      </w:r>
+    </w:p>
+    <w:p>
+      <w:pPr>
+        <w:pStyle w:val="a4"/>
+        <w:numPr>
+          <w:ilvl w:val="0"/>
+          <w:numId w:val="2"/>
+        </w:numPr>
+        <w:tabs>
+          <w:tab w:val="left" w:pos="709"/>
+        </w:tabs>
+        <w:spacing w:after="0" w:line="240" w:lineRule="atLeast"/>
+        <w:ind w:left="0" w:firstLine="709"/>
+        <w:jc w:val="both"/>
+        <w:rPr>
+          <w:rFonts w:ascii="Times New Roman" w:hAnsi="Times New Roman" w:cs="Times New Roman"/>
+          <w:sz w:val="28"/>
+          <w:szCs w:val="28"/>
+        </w:rPr>
+      </w:pPr>
+      <w:r>
+        <w:rPr>
+          <w:rFonts w:ascii="Times New Roman" w:hAnsi="Times New Roman" w:cs="Times New Roman"/>
+          <w:sz w:val="28"/>
+          <w:szCs w:val="28"/>
+        </w:rPr>
+        <w:lastRenderedPageBreak/>
+        <w:t>Настоящее Положение является учредительным документом Управления.</w:t>
+      </w:r>
+    </w:p>
+    <w:p>
+      <w:pPr>
+        <w:pStyle w:val="a4"/>
+        <w:numPr>
+          <w:ilvl w:val="0"/>
+          <w:numId w:val="2"/>
+        </w:numPr>
+        <w:spacing w:after="0" w:line="240" w:lineRule="atLeast"/>
+        <w:ind w:left="0" w:firstLine="709"/>
+        <w:jc w:val="both"/>
+        <w:rPr>
+          <w:rFonts w:ascii="Times New Roman" w:hAnsi="Times New Roman" w:cs="Times New Roman"/>
+          <w:sz w:val="28"/>
+          <w:szCs w:val="28"/>
+        </w:rPr>
+      </w:pPr>
+      <w:r>
+        <w:rPr>
+          <w:rFonts w:ascii="Times New Roman" w:hAnsi="Times New Roman" w:cs="Times New Roman"/>
+          <w:sz w:val="28"/>
+          <w:szCs w:val="28"/>
+        </w:rPr>
+        <w:t>Финансирование деятельности Управления осуществляется из республиканского и местных бюджетов в соответствии с законодательством Республики Казахстан.</w:t>
+      </w:r>
+    </w:p>
+    <w:p>
+      <w:pPr>
+        <w:pStyle w:val="a4"/>
+        <w:numPr>
+          <w:ilvl w:val="0"/>
+          <w:numId w:val="2"/>
+        </w:numPr>
+        <w:spacing w:after="0" w:line="240" w:lineRule="atLeast"/>
+        <w:ind w:left="0" w:firstLine="709"/>
+        <w:jc w:val="both"/>
+        <w:rPr>
+          <w:rFonts w:ascii="Times New Roman" w:hAnsi="Times New Roman" w:cs="Times New Roman"/>
+          <w:sz w:val="28"/>
+          <w:szCs w:val="28"/>
+        </w:rPr>
+      </w:pPr>
+      <w:r>
+        <w:rPr>
+          <w:rFonts w:ascii="Times New Roman" w:hAnsi="Times New Roman" w:cs="Times New Roman"/>
+          <w:sz w:val="28"/>
+          <w:szCs w:val="28"/>
+        </w:rPr>
+        <w:t>Управлению запрещается вступать в договорные отношения с субъектами предпринимательства на предмет выполнения обязанностей, являющихся функциями Управления.</w:t>
+      </w:r>
+    </w:p>
+    <w:p>
+      <w:pPr>
+        <w:spacing w:after="0" w:line="240" w:lineRule="atLeast"/>
+        <w:ind w:firstLine="708"/>
+        <w:jc w:val="both"/>
+        <w:rPr>
+          <w:rFonts w:ascii="Times New Roman" w:hAnsi="Times New Roman" w:cs="Times New Roman"/>
+          <w:sz w:val="28"/>
+          <w:szCs w:val="28"/>
+        </w:rPr>
+      </w:pPr>
+      <w:r>
+        <w:rPr>
+          <w:rFonts w:ascii="Times New Roman" w:hAnsi="Times New Roman" w:cs="Times New Roman"/>
+          <w:sz w:val="28"/>
+          <w:szCs w:val="28"/>
+        </w:rPr>
+        <w:t>Если Управлению законодательными актами предоставлено право осуществлять приносящую доходы деятельность, то полученные доходы направляются в государственный бюджет, если иное не установлено законодательством Республики Казахстан.</w:t>
+      </w:r>
+    </w:p>
+    <w:p>
+      <w:pPr>
+        <w:spacing w:after="0" w:line="240" w:lineRule="atLeast"/>
         <w:jc w:val="center"/>
         <w:rPr>
-          <w:rFonts w:ascii="Times New Roman" w:hAnsi="Times New Roman"/>
-          <w:sz w:val="24"/>
-          <w:szCs w:val="24"/>
-        </w:rPr>
-      </w:pPr>
-      <w:r>
-        <w:rPr>
-          <w:rFonts w:ascii="Times New Roman" w:hAnsi="Times New Roman"/>
-          <w:sz w:val="24"/>
-          <w:szCs w:val="24"/>
+          <w:rFonts w:ascii="Times New Roman" w:hAnsi="Times New Roman" w:cs="Times New Roman"/>
+          <w:b/>
+          <w:sz w:val="28"/>
+          <w:szCs w:val="28"/>
+        </w:rPr>
+      </w:pPr>
+    </w:p>
+    <w:p>
+      <w:pPr>
+        <w:pStyle w:val="a4"/>
+        <w:numPr>
+          <w:ilvl w:val="0"/>
+          <w:numId w:val="1"/>
+        </w:numPr>
+        <w:spacing w:after="0" w:line="240" w:lineRule="atLeast"/>
+        <w:jc w:val="center"/>
+        <w:rPr>
+          <w:rFonts w:ascii="Times New Roman" w:hAnsi="Times New Roman" w:cs="Times New Roman"/>
+          <w:b/>
+          <w:sz w:val="28"/>
+          <w:szCs w:val="28"/>
+        </w:rPr>
+      </w:pPr>
+      <w:r>
+        <w:rPr>
+          <w:rFonts w:ascii="Times New Roman" w:hAnsi="Times New Roman" w:cs="Times New Roman"/>
+          <w:b/>
+          <w:sz w:val="28"/>
+          <w:szCs w:val="28"/>
+        </w:rPr>
+        <w:t xml:space="preserve">Задачи и полномочия </w:t>
+      </w:r>
+      <w:r>
+        <w:rPr>
+          <w:rFonts w:ascii="Times New Roman" w:hAnsi="Times New Roman" w:cs="Times New Roman"/>
+          <w:b/>
+          <w:sz w:val="28"/>
+          <w:szCs w:val="28"/>
+        </w:rPr>
+        <w:t>Управления</w:t>
+      </w:r>
+    </w:p>
+    <w:p>
+      <w:pPr>
+        <w:pStyle w:val="a4"/>
+        <w:spacing w:after="0" w:line="240" w:lineRule="atLeast"/>
+        <w:ind w:left="1080"/>
+        <w:rPr>
+          <w:rFonts w:ascii="Times New Roman" w:hAnsi="Times New Roman" w:cs="Times New Roman"/>
+          <w:b/>
+          <w:sz w:val="28"/>
+          <w:szCs w:val="28"/>
+        </w:rPr>
+      </w:pPr>
+    </w:p>
+    <w:p>
+      <w:pPr>
+        <w:pStyle w:val="a4"/>
+        <w:numPr>
+          <w:ilvl w:val="0"/>
+          <w:numId w:val="2"/>
+        </w:numPr>
+        <w:tabs>
+          <w:tab w:val="left" w:pos="709"/>
+        </w:tabs>
+        <w:spacing w:after="0" w:line="240" w:lineRule="atLeast"/>
+        <w:ind w:left="0" w:firstLine="709"/>
+        <w:jc w:val="both"/>
+        <w:rPr>
+          <w:rFonts w:ascii="Times New Roman" w:hAnsi="Times New Roman" w:cs="Times New Roman"/>
+          <w:sz w:val="28"/>
+          <w:szCs w:val="28"/>
+        </w:rPr>
+      </w:pPr>
+      <w:r>
+        <w:rPr>
+          <w:rFonts w:ascii="Times New Roman" w:hAnsi="Times New Roman" w:cs="Times New Roman"/>
+          <w:sz w:val="28"/>
+          <w:szCs w:val="28"/>
+        </w:rPr>
+        <w:t>Задачи:</w:t>
+      </w:r>
+    </w:p>
+    <w:p>
+      <w:pPr>
+        <w:tabs>
+          <w:tab w:val="left" w:pos="709"/>
+        </w:tabs>
+        <w:spacing w:after="0" w:line="240" w:lineRule="atLeast"/>
+        <w:ind w:firstLine="567"/>
+        <w:jc w:val="both"/>
+        <w:rPr>
+          <w:rFonts w:ascii="Times New Roman" w:hAnsi="Times New Roman" w:cs="Times New Roman"/>
+          <w:sz w:val="28"/>
+          <w:szCs w:val="28"/>
+        </w:rPr>
+      </w:pPr>
+      <w:r>
+        <w:rPr>
+          <w:rFonts w:ascii="Times New Roman" w:hAnsi="Times New Roman" w:cs="Times New Roman"/>
+          <w:sz w:val="28"/>
+          <w:szCs w:val="28"/>
+        </w:rPr>
+        <w:t xml:space="preserve">  1) обеспечение повышения качества условий проживания горожан</w:t>
+      </w:r>
+      <w:r>
+        <w:rPr>
+          <w:rFonts w:ascii="Times New Roman" w:hAnsi="Times New Roman" w:cs="Times New Roman"/>
+          <w:sz w:val="28"/>
+          <w:szCs w:val="28"/>
+        </w:rPr>
+        <w:t xml:space="preserve"> </w:t>
+      </w:r>
+      <w:r>
+        <w:rPr>
+          <w:rFonts w:ascii="Times New Roman" w:eastAsia="Times New Roman" w:hAnsi="Times New Roman" w:cs="Times New Roman"/>
+          <w:sz w:val="28"/>
+          <w:szCs w:val="28"/>
+        </w:rPr>
+        <w:t>на территории города;</w:t>
+      </w:r>
+    </w:p>
+    <w:p>
+      <w:pPr>
+        <w:spacing w:after="0" w:line="240" w:lineRule="atLeast"/>
+        <w:ind w:firstLine="708"/>
+        <w:jc w:val="both"/>
+        <w:rPr>
+          <w:rFonts w:ascii="Times New Roman" w:hAnsi="Times New Roman" w:cs="Times New Roman"/>
+          <w:sz w:val="28"/>
+          <w:szCs w:val="28"/>
+        </w:rPr>
+      </w:pPr>
+      <w:r>
+        <w:rPr>
+          <w:rFonts w:ascii="Times New Roman" w:hAnsi="Times New Roman" w:cs="Times New Roman"/>
+          <w:sz w:val="28"/>
+          <w:szCs w:val="28"/>
+        </w:rPr>
+        <w:t>2) модернизация жилья;</w:t>
+      </w:r>
+    </w:p>
+    <w:p>
+      <w:pPr>
+        <w:spacing w:after="0" w:line="240" w:lineRule="atLeast"/>
+        <w:ind w:firstLine="708"/>
+        <w:jc w:val="both"/>
+        <w:rPr>
+          <w:rFonts w:ascii="Times New Roman" w:hAnsi="Times New Roman" w:cs="Times New Roman"/>
+          <w:sz w:val="28"/>
+          <w:szCs w:val="28"/>
+        </w:rPr>
+      </w:pPr>
+      <w:r>
+        <w:rPr>
+          <w:rFonts w:ascii="Times New Roman" w:hAnsi="Times New Roman" w:cs="Times New Roman"/>
+          <w:sz w:val="28"/>
+          <w:szCs w:val="28"/>
+        </w:rPr>
+        <w:t>3) формирование бережного отношения населения к жилью и повышение активности жителей в вопросах жилищных отношений;</w:t>
+      </w:r>
+    </w:p>
+    <w:p>
+      <w:pPr>
+        <w:spacing w:after="0" w:line="240" w:lineRule="atLeast"/>
+        <w:ind w:firstLine="708"/>
+        <w:jc w:val="both"/>
+        <w:rPr>
+          <w:rFonts w:ascii="Times New Roman" w:hAnsi="Times New Roman" w:cs="Times New Roman"/>
+          <w:sz w:val="28"/>
+          <w:szCs w:val="28"/>
+        </w:rPr>
+      </w:pPr>
+      <w:r>
+        <w:rPr>
+          <w:rFonts w:ascii="Times New Roman" w:hAnsi="Times New Roman" w:cs="Times New Roman"/>
+          <w:sz w:val="28"/>
+          <w:szCs w:val="28"/>
+        </w:rPr>
+        <w:t>4) обеспечение безопасности в вопросах эксплуатации лифтового, газового и котельного оборудования;</w:t>
+      </w:r>
+    </w:p>
+    <w:p>
+      <w:pPr>
+        <w:spacing w:after="0" w:line="240" w:lineRule="atLeast"/>
+        <w:ind w:firstLine="708"/>
+        <w:jc w:val="both"/>
+        <w:rPr>
+          <w:rFonts w:ascii="Times New Roman" w:hAnsi="Times New Roman" w:cs="Times New Roman"/>
+          <w:sz w:val="28"/>
+          <w:szCs w:val="28"/>
+        </w:rPr>
+      </w:pPr>
+      <w:r>
+        <w:rPr>
+          <w:rFonts w:ascii="Times New Roman" w:hAnsi="Times New Roman" w:cs="Times New Roman"/>
+          <w:sz w:val="28"/>
+          <w:szCs w:val="28"/>
+        </w:rPr>
+        <w:t>5) полная прозрачность и открытость в вопросах распределения жилья для нуждающихся граждан;</w:t>
+      </w:r>
+    </w:p>
+    <w:p>
+      <w:pPr>
+        <w:spacing w:after="0" w:line="240" w:lineRule="atLeast"/>
+        <w:ind w:firstLine="708"/>
+        <w:jc w:val="both"/>
+        <w:rPr>
+          <w:rFonts w:ascii="Times New Roman" w:eastAsia="Times New Roman" w:hAnsi="Times New Roman" w:cs="Times New Roman"/>
+          <w:sz w:val="28"/>
+          <w:szCs w:val="28"/>
+        </w:rPr>
+      </w:pPr>
+      <w:r>
+        <w:rPr>
+          <w:rFonts w:ascii="Times New Roman" w:hAnsi="Times New Roman" w:cs="Times New Roman"/>
+          <w:sz w:val="28"/>
+          <w:szCs w:val="28"/>
+        </w:rPr>
+        <w:t xml:space="preserve">6) </w:t>
+      </w:r>
+      <w:r>
+        <w:rPr>
+          <w:rFonts w:ascii="Times New Roman" w:eastAsia="Times New Roman" w:hAnsi="Times New Roman" w:cs="Times New Roman"/>
+          <w:sz w:val="28"/>
+          <w:szCs w:val="28"/>
+        </w:rPr>
+        <w:t>улучшен</w:t>
+      </w:r>
+      <w:r>
+        <w:rPr>
+          <w:rFonts w:ascii="Times New Roman" w:eastAsia="Times New Roman" w:hAnsi="Times New Roman" w:cs="Times New Roman"/>
+          <w:sz w:val="28"/>
+          <w:szCs w:val="28"/>
+        </w:rPr>
+        <w:t>ие санитарного состояния города.</w:t>
+      </w:r>
+    </w:p>
+    <w:p>
+      <w:pPr>
+        <w:pStyle w:val="a4"/>
+        <w:numPr>
+          <w:ilvl w:val="0"/>
+          <w:numId w:val="2"/>
+        </w:numPr>
+        <w:spacing w:after="0" w:line="240" w:lineRule="atLeast"/>
+        <w:ind w:left="0" w:firstLine="709"/>
+        <w:jc w:val="both"/>
+        <w:rPr>
+          <w:rFonts w:ascii="Times New Roman" w:hAnsi="Times New Roman" w:cs="Times New Roman"/>
+          <w:sz w:val="28"/>
+          <w:szCs w:val="28"/>
+        </w:rPr>
+      </w:pPr>
+      <w:r>
+        <w:rPr>
+          <w:rFonts w:ascii="Times New Roman" w:hAnsi="Times New Roman" w:cs="Times New Roman"/>
+          <w:sz w:val="28"/>
+          <w:szCs w:val="28"/>
+        </w:rPr>
+        <w:t>Полномочия:</w:t>
+      </w:r>
+    </w:p>
+    <w:p>
+      <w:pPr>
+        <w:pStyle w:val="a4"/>
+        <w:numPr>
+          <w:ilvl w:val="0"/>
+          <w:numId w:val="6"/>
+        </w:numPr>
+        <w:spacing w:after="0" w:line="240" w:lineRule="atLeast"/>
+        <w:ind w:left="0" w:firstLine="709"/>
+        <w:jc w:val="both"/>
+        <w:rPr>
+          <w:rFonts w:ascii="Times New Roman" w:hAnsi="Times New Roman" w:cs="Times New Roman"/>
+          <w:sz w:val="28"/>
+          <w:szCs w:val="28"/>
+        </w:rPr>
+      </w:pPr>
+      <w:r>
+        <w:rPr>
+          <w:rFonts w:ascii="Times New Roman" w:hAnsi="Times New Roman" w:cs="Times New Roman"/>
+          <w:sz w:val="28"/>
+          <w:szCs w:val="28"/>
+        </w:rPr>
+        <w:t>права:</w:t>
+      </w:r>
+    </w:p>
+    <w:p>
+      <w:pPr>
+        <w:pStyle w:val="a4"/>
+        <w:spacing w:after="0" w:line="240" w:lineRule="atLeast"/>
+        <w:ind w:left="709"/>
+        <w:jc w:val="both"/>
+        <w:rPr>
+          <w:rFonts w:ascii="Times New Roman" w:hAnsi="Times New Roman" w:cs="Times New Roman"/>
+          <w:sz w:val="28"/>
+          <w:szCs w:val="28"/>
+        </w:rPr>
+      </w:pPr>
+      <w:r>
+        <w:rPr>
+          <w:rFonts w:ascii="Times New Roman" w:hAnsi="Times New Roman" w:cs="Times New Roman"/>
+          <w:sz w:val="28"/>
+          <w:szCs w:val="28"/>
+        </w:rPr>
+        <w:t>выступать в гражданско-правовых отношениях от собственного имени;</w:t>
+      </w:r>
+    </w:p>
+    <w:p>
+      <w:pPr>
+        <w:spacing w:after="0" w:line="240" w:lineRule="atLeast"/>
+        <w:ind w:firstLine="709"/>
+        <w:jc w:val="both"/>
+        <w:rPr>
+          <w:rFonts w:ascii="Times New Roman" w:hAnsi="Times New Roman" w:cs="Times New Roman"/>
+          <w:sz w:val="28"/>
+          <w:szCs w:val="28"/>
+        </w:rPr>
+      </w:pPr>
+      <w:r>
+        <w:rPr>
+          <w:rFonts w:ascii="Times New Roman" w:hAnsi="Times New Roman" w:cs="Times New Roman"/>
+          <w:sz w:val="28"/>
+          <w:szCs w:val="28"/>
+        </w:rPr>
+        <w:t xml:space="preserve">выступать стороной </w:t>
+      </w:r>
+      <w:r>
+        <w:rPr>
+          <w:rFonts w:ascii="Times New Roman" w:hAnsi="Times New Roman" w:cs="Times New Roman"/>
+          <w:sz w:val="28"/>
+          <w:szCs w:val="28"/>
+        </w:rPr>
+        <w:t xml:space="preserve">гражданско-правовых </w:t>
+      </w:r>
+      <w:r>
+        <w:rPr>
+          <w:rFonts w:ascii="Times New Roman" w:hAnsi="Times New Roman" w:cs="Times New Roman"/>
+          <w:sz w:val="28"/>
+          <w:szCs w:val="28"/>
+        </w:rPr>
+        <w:t xml:space="preserve">отношений от имени государства, </w:t>
+      </w:r>
+      <w:r>
+        <w:rPr>
+          <w:rFonts w:ascii="Times New Roman" w:hAnsi="Times New Roman" w:cs="Times New Roman"/>
+          <w:sz w:val="28"/>
+          <w:szCs w:val="28"/>
+        </w:rPr>
+        <w:t>если оно уполномочено на это</w:t>
+      </w:r>
+      <w:r>
+        <w:rPr>
+          <w:rFonts w:ascii="Times New Roman" w:hAnsi="Times New Roman" w:cs="Times New Roman"/>
+          <w:sz w:val="28"/>
+          <w:szCs w:val="28"/>
+        </w:rPr>
+        <w:t xml:space="preserve"> </w:t>
+      </w:r>
+      <w:r>
+        <w:rPr>
+          <w:rFonts w:ascii="Times New Roman" w:hAnsi="Times New Roman" w:cs="Times New Roman"/>
+          <w:sz w:val="28"/>
+          <w:szCs w:val="28"/>
+        </w:rPr>
+        <w:t>в соответствии с законодательством;</w:t>
+      </w:r>
+    </w:p>
+    <w:p>
+      <w:pPr>
+        <w:spacing w:after="0" w:line="240" w:lineRule="atLeast"/>
+        <w:ind w:firstLine="709"/>
+        <w:jc w:val="both"/>
+        <w:rPr>
+          <w:rFonts w:ascii="Times New Roman" w:hAnsi="Times New Roman" w:cs="Times New Roman"/>
+          <w:sz w:val="28"/>
+          <w:szCs w:val="28"/>
+        </w:rPr>
+      </w:pPr>
+      <w:r>
+        <w:rPr>
+          <w:rFonts w:ascii="Times New Roman" w:hAnsi="Times New Roman" w:cs="Times New Roman"/>
+          <w:sz w:val="28"/>
+          <w:szCs w:val="28"/>
+        </w:rPr>
+        <w:t>принимать решения, оформляемые приказами Управления и другими актами, в пределах своей компетенции согласно законодательству Республики Казахстан и настоящему Положению;</w:t>
+      </w:r>
+    </w:p>
+    <w:p>
+      <w:pPr>
+        <w:spacing w:after="0" w:line="240" w:lineRule="atLeast"/>
+        <w:ind w:firstLine="709"/>
+        <w:jc w:val="both"/>
+        <w:rPr>
+          <w:rFonts w:ascii="Times New Roman" w:hAnsi="Times New Roman" w:cs="Times New Roman"/>
+          <w:sz w:val="28"/>
+          <w:szCs w:val="28"/>
+        </w:rPr>
+      </w:pPr>
+      <w:r>
+        <w:rPr>
+          <w:rFonts w:ascii="Times New Roman" w:hAnsi="Times New Roman" w:cs="Times New Roman"/>
+          <w:sz w:val="28"/>
+          <w:szCs w:val="28"/>
+        </w:rPr>
+        <w:t>запрашивать и получать от государственных органов, иных организаций и физических лиц необходимую информацию;</w:t>
+      </w:r>
+    </w:p>
+    <w:p>
+      <w:pPr>
+        <w:spacing w:after="0" w:line="240" w:lineRule="atLeast"/>
+        <w:ind w:firstLine="709"/>
+        <w:jc w:val="both"/>
+        <w:rPr>
+          <w:rFonts w:ascii="Times New Roman" w:hAnsi="Times New Roman" w:cs="Times New Roman"/>
+          <w:sz w:val="28"/>
+          <w:szCs w:val="28"/>
+        </w:rPr>
+      </w:pPr>
+      <w:r>
+        <w:rPr>
+          <w:rFonts w:ascii="Times New Roman" w:hAnsi="Times New Roman" w:cs="Times New Roman"/>
+          <w:sz w:val="28"/>
+          <w:szCs w:val="28"/>
+        </w:rPr>
+        <w:t>посещать проверяемый объект во время проведения проверки;</w:t>
+      </w:r>
+    </w:p>
+    <w:p>
+      <w:pPr>
+        <w:spacing w:after="0" w:line="240" w:lineRule="atLeast"/>
+        <w:ind w:firstLine="709"/>
+        <w:jc w:val="both"/>
+        <w:rPr>
+          <w:rFonts w:ascii="Times New Roman" w:hAnsi="Times New Roman" w:cs="Times New Roman"/>
+          <w:sz w:val="28"/>
+          <w:szCs w:val="28"/>
+        </w:rPr>
+      </w:pPr>
+      <w:r>
+        <w:rPr>
+          <w:rFonts w:ascii="Times New Roman" w:hAnsi="Times New Roman" w:cs="Times New Roman"/>
+          <w:sz w:val="28"/>
+          <w:szCs w:val="28"/>
+        </w:rPr>
+        <w:t>запрашивать любую необходимую информацию при проведении проверок, знакомиться с оригиналами документов, относящихся к предмету проверки;</w:t>
+      </w:r>
+    </w:p>
+    <w:p>
+      <w:pPr>
+        <w:spacing w:after="0" w:line="240" w:lineRule="atLeast"/>
+        <w:ind w:firstLine="709"/>
+        <w:jc w:val="both"/>
+        <w:rPr>
+          <w:rFonts w:ascii="Times New Roman" w:hAnsi="Times New Roman" w:cs="Times New Roman"/>
+          <w:sz w:val="28"/>
+          <w:szCs w:val="28"/>
+        </w:rPr>
+      </w:pPr>
+      <w:r>
+        <w:rPr>
+          <w:rFonts w:ascii="Times New Roman" w:hAnsi="Times New Roman" w:cs="Times New Roman"/>
+          <w:sz w:val="28"/>
+          <w:szCs w:val="28"/>
+        </w:rPr>
+        <w:t>п</w:t>
+      </w:r>
+      <w:r>
+        <w:rPr>
+          <w:rFonts w:ascii="Times New Roman" w:hAnsi="Times New Roman" w:cs="Times New Roman"/>
+          <w:sz w:val="28"/>
+          <w:szCs w:val="28"/>
+        </w:rPr>
+        <w:t>ривлекать</w:t>
+      </w:r>
+      <w:r>
+        <w:rPr>
+          <w:rFonts w:ascii="Times New Roman" w:hAnsi="Times New Roman" w:cs="Times New Roman"/>
+          <w:sz w:val="28"/>
+          <w:szCs w:val="28"/>
+        </w:rPr>
+        <w:t xml:space="preserve">  </w:t>
+      </w:r>
+      <w:r>
+        <w:rPr>
+          <w:rFonts w:ascii="Times New Roman" w:hAnsi="Times New Roman" w:cs="Times New Roman"/>
+          <w:sz w:val="28"/>
+          <w:szCs w:val="28"/>
+          <w:lang w:val="kk-KZ"/>
+        </w:rPr>
+        <w:t xml:space="preserve"> </w:t>
+      </w:r>
+      <w:r>
+        <w:rPr>
+          <w:rFonts w:ascii="Times New Roman" w:hAnsi="Times New Roman" w:cs="Times New Roman"/>
+          <w:sz w:val="28"/>
+          <w:szCs w:val="28"/>
+        </w:rPr>
+        <w:t xml:space="preserve"> </w:t>
+      </w:r>
+      <w:r>
+        <w:rPr>
+          <w:rFonts w:ascii="Times New Roman" w:hAnsi="Times New Roman" w:cs="Times New Roman"/>
+          <w:sz w:val="28"/>
+          <w:szCs w:val="28"/>
+        </w:rPr>
+        <w:t>дополнительные</w:t>
+      </w:r>
+      <w:r>
+        <w:rPr>
+          <w:rFonts w:ascii="Times New Roman" w:hAnsi="Times New Roman" w:cs="Times New Roman"/>
+          <w:sz w:val="28"/>
+          <w:szCs w:val="28"/>
+        </w:rPr>
+        <w:t xml:space="preserve"> </w:t>
+      </w:r>
+      <w:r>
+        <w:rPr>
+          <w:rFonts w:ascii="Times New Roman" w:hAnsi="Times New Roman" w:cs="Times New Roman"/>
+          <w:sz w:val="28"/>
+          <w:szCs w:val="28"/>
+          <w:lang w:val="kk-KZ"/>
+        </w:rPr>
+        <w:t xml:space="preserve"> </w:t>
+      </w:r>
+      <w:r>
+        <w:rPr>
+          <w:rFonts w:ascii="Times New Roman" w:hAnsi="Times New Roman" w:cs="Times New Roman"/>
+          <w:sz w:val="28"/>
+          <w:szCs w:val="28"/>
+        </w:rPr>
+        <w:t xml:space="preserve"> </w:t>
+      </w:r>
+      <w:r>
+        <w:rPr>
+          <w:rFonts w:ascii="Times New Roman" w:hAnsi="Times New Roman" w:cs="Times New Roman"/>
+          <w:sz w:val="28"/>
+          <w:szCs w:val="28"/>
+        </w:rPr>
+        <w:t xml:space="preserve"> </w:t>
+      </w:r>
+      <w:r>
+        <w:rPr>
+          <w:rFonts w:ascii="Times New Roman" w:hAnsi="Times New Roman" w:cs="Times New Roman"/>
+          <w:sz w:val="28"/>
+          <w:szCs w:val="28"/>
+        </w:rPr>
+        <w:t>ресурсы</w:t>
+      </w:r>
+      <w:proofErr w:type="gramStart"/>
+      <w:r>
+        <w:rPr>
+          <w:rFonts w:ascii="Times New Roman" w:hAnsi="Times New Roman" w:cs="Times New Roman"/>
+          <w:sz w:val="28"/>
+          <w:szCs w:val="28"/>
+        </w:rPr>
+        <w:t xml:space="preserve">  </w:t>
+      </w:r>
+      <w:r>
+        <w:rPr>
+          <w:rFonts w:ascii="Times New Roman" w:hAnsi="Times New Roman" w:cs="Times New Roman"/>
+          <w:sz w:val="28"/>
+          <w:szCs w:val="28"/>
+        </w:rPr>
+        <w:t xml:space="preserve"> (</w:t>
+      </w:r>
+      <w:proofErr w:type="gramEnd"/>
+      <w:r>
+        <w:rPr>
+          <w:rFonts w:ascii="Times New Roman" w:hAnsi="Times New Roman" w:cs="Times New Roman"/>
+          <w:sz w:val="28"/>
+          <w:szCs w:val="28"/>
+        </w:rPr>
+        <w:t xml:space="preserve">специализированная </w:t>
+      </w:r>
+      <w:r>
+        <w:rPr>
+          <w:rFonts w:ascii="Times New Roman" w:hAnsi="Times New Roman" w:cs="Times New Roman"/>
+          <w:sz w:val="28"/>
+          <w:szCs w:val="28"/>
+        </w:rPr>
+        <w:t xml:space="preserve"> </w:t>
+      </w:r>
+      <w:r>
+        <w:rPr>
+          <w:rFonts w:ascii="Times New Roman" w:hAnsi="Times New Roman" w:cs="Times New Roman"/>
+          <w:sz w:val="28"/>
+          <w:szCs w:val="28"/>
+        </w:rPr>
+        <w:t xml:space="preserve"> </w:t>
+      </w:r>
+      <w:r>
+        <w:rPr>
+          <w:rFonts w:ascii="Times New Roman" w:hAnsi="Times New Roman" w:cs="Times New Roman"/>
+          <w:sz w:val="28"/>
+          <w:szCs w:val="28"/>
+        </w:rPr>
+        <w:t>техника,</w:t>
+      </w:r>
+    </w:p>
+    <w:p>
+      <w:pPr>
+        <w:spacing w:after="0" w:line="240" w:lineRule="atLeast"/>
+        <w:jc w:val="both"/>
+        <w:rPr>
+          <w:rFonts w:ascii="Times New Roman" w:hAnsi="Times New Roman" w:cs="Times New Roman"/>
+          <w:sz w:val="28"/>
+          <w:szCs w:val="28"/>
+        </w:rPr>
+      </w:pPr>
+      <w:r>
+        <w:rPr>
+          <w:rFonts w:ascii="Times New Roman" w:hAnsi="Times New Roman" w:cs="Times New Roman"/>
+          <w:sz w:val="28"/>
+          <w:szCs w:val="28"/>
+        </w:rPr>
+        <w:t xml:space="preserve">дорожные рабочие) в период особых метеоусловий за счет средств местного бюджета; </w:t>
+      </w:r>
+    </w:p>
+    <w:p>
+      <w:pPr>
+        <w:tabs>
+          <w:tab w:val="left" w:pos="709"/>
+        </w:tabs>
+        <w:spacing w:after="0" w:line="240" w:lineRule="atLeast"/>
+        <w:ind w:firstLine="709"/>
+        <w:jc w:val="both"/>
+        <w:rPr>
+          <w:rFonts w:ascii="Times New Roman" w:hAnsi="Times New Roman" w:cs="Times New Roman"/>
+          <w:sz w:val="28"/>
+          <w:szCs w:val="28"/>
+        </w:rPr>
+      </w:pPr>
+      <w:r>
+        <w:rPr>
+          <w:rFonts w:ascii="Times New Roman" w:hAnsi="Times New Roman" w:cs="Times New Roman"/>
+          <w:sz w:val="28"/>
+          <w:szCs w:val="28"/>
+        </w:rPr>
+        <w:t>осуществлять иные права и обязанности в соответствии с законодательством Республики Казахстан.</w:t>
+      </w:r>
+    </w:p>
+    <w:p>
+      <w:pPr>
+        <w:pStyle w:val="a4"/>
+        <w:numPr>
+          <w:ilvl w:val="0"/>
+          <w:numId w:val="6"/>
+        </w:numPr>
+        <w:tabs>
+          <w:tab w:val="left" w:pos="709"/>
+        </w:tabs>
+        <w:spacing w:after="0" w:line="240" w:lineRule="atLeast"/>
+        <w:ind w:left="0" w:firstLine="709"/>
+        <w:jc w:val="both"/>
+        <w:rPr>
+          <w:rFonts w:ascii="Times New Roman" w:hAnsi="Times New Roman" w:cs="Times New Roman"/>
+          <w:sz w:val="28"/>
+          <w:szCs w:val="28"/>
+        </w:rPr>
+      </w:pPr>
+      <w:r>
+        <w:rPr>
+          <w:rFonts w:ascii="Times New Roman" w:hAnsi="Times New Roman" w:cs="Times New Roman"/>
+          <w:sz w:val="28"/>
+          <w:szCs w:val="28"/>
+        </w:rPr>
+        <w:t>обязанности:</w:t>
+      </w:r>
+    </w:p>
+    <w:p>
+      <w:pPr>
+        <w:tabs>
+          <w:tab w:val="left" w:pos="0"/>
+        </w:tabs>
+        <w:spacing w:after="0" w:line="240" w:lineRule="atLeast"/>
+        <w:ind w:firstLine="708"/>
+        <w:jc w:val="both"/>
+        <w:rPr>
+          <w:rFonts w:ascii="Times New Roman" w:hAnsi="Times New Roman" w:cs="Times New Roman"/>
+          <w:sz w:val="28"/>
+          <w:szCs w:val="28"/>
+        </w:rPr>
+      </w:pPr>
+      <w:r>
+        <w:rPr>
+          <w:rFonts w:ascii="Times New Roman" w:hAnsi="Times New Roman" w:cs="Times New Roman"/>
+          <w:sz w:val="28"/>
+          <w:szCs w:val="28"/>
         </w:rPr>
         <w:lastRenderedPageBreak/>
-        <w:t>3</w:t>
-      </w:r>
-    </w:p>
-    <w:p>
-      <w:pPr>
-        <w:spacing w:after="0" w:line="240" w:lineRule="auto"/>
-        <w:ind w:firstLine="709"/>
-        <w:jc w:val="center"/>
-        <w:rPr>
-          <w:rFonts w:ascii="Times New Roman" w:hAnsi="Times New Roman"/>
-          <w:b/>
-          <w:sz w:val="24"/>
-          <w:szCs w:val="24"/>
-        </w:rPr>
-      </w:pPr>
-    </w:p>
-    <w:p>
-      <w:pPr>
-        <w:pStyle w:val="a4"/>
-        <w:numPr>
-          <w:ilvl w:val="0"/>
-          <w:numId w:val="2"/>
-        </w:numPr>
-        <w:tabs>
-          <w:tab w:val="left" w:pos="709"/>
-        </w:tabs>
-        <w:spacing w:after="0" w:line="240" w:lineRule="atLeast"/>
-        <w:ind w:left="0" w:firstLine="709"/>
-        <w:jc w:val="both"/>
-        <w:rPr>
-          <w:rFonts w:ascii="Times New Roman" w:hAnsi="Times New Roman" w:cs="Times New Roman"/>
-          <w:sz w:val="28"/>
-          <w:szCs w:val="28"/>
-        </w:rPr>
-      </w:pPr>
-      <w:r>
-        <w:rPr>
-          <w:rFonts w:ascii="Times New Roman" w:hAnsi="Times New Roman" w:cs="Times New Roman"/>
-          <w:sz w:val="28"/>
-          <w:szCs w:val="28"/>
-        </w:rPr>
-        <w:t>Настоящее Положение является учредительным документом Управления.</w:t>
-      </w:r>
-    </w:p>
-    <w:p>
-      <w:pPr>
-        <w:pStyle w:val="a4"/>
-        <w:numPr>
-          <w:ilvl w:val="0"/>
-          <w:numId w:val="2"/>
-        </w:numPr>
-        <w:spacing w:after="0" w:line="240" w:lineRule="atLeast"/>
-        <w:ind w:left="0" w:firstLine="709"/>
-        <w:jc w:val="both"/>
-        <w:rPr>
-          <w:rFonts w:ascii="Times New Roman" w:hAnsi="Times New Roman" w:cs="Times New Roman"/>
-          <w:sz w:val="28"/>
-          <w:szCs w:val="28"/>
-        </w:rPr>
-      </w:pPr>
-      <w:r>
-        <w:rPr>
-          <w:rFonts w:ascii="Times New Roman" w:hAnsi="Times New Roman" w:cs="Times New Roman"/>
-          <w:sz w:val="28"/>
-          <w:szCs w:val="28"/>
-        </w:rPr>
-        <w:t>Финансирование деятельности Управления осуществляется из республиканского и местных бюджетов в соответствии с законодательством Республики Казахстан.</w:t>
-      </w:r>
-    </w:p>
-    <w:p>
-      <w:pPr>
-        <w:pStyle w:val="a4"/>
-        <w:numPr>
-          <w:ilvl w:val="0"/>
-          <w:numId w:val="2"/>
-        </w:numPr>
-        <w:spacing w:after="0" w:line="240" w:lineRule="atLeast"/>
-        <w:ind w:left="0" w:firstLine="709"/>
-        <w:jc w:val="both"/>
-        <w:rPr>
-          <w:rFonts w:ascii="Times New Roman" w:hAnsi="Times New Roman" w:cs="Times New Roman"/>
-          <w:sz w:val="28"/>
-          <w:szCs w:val="28"/>
-        </w:rPr>
-      </w:pPr>
-      <w:r>
-        <w:rPr>
-          <w:rFonts w:ascii="Times New Roman" w:hAnsi="Times New Roman" w:cs="Times New Roman"/>
-          <w:sz w:val="28"/>
-          <w:szCs w:val="28"/>
-        </w:rPr>
-        <w:t>Управлению запрещается вступать в договорные отношения с субъектами предпринимательства на предмет выполнения обязанностей, являющихся функциями Управления.</w:t>
-      </w:r>
-    </w:p>
-    <w:p>
-      <w:pPr>
-        <w:spacing w:after="0" w:line="240" w:lineRule="atLeast"/>
-        <w:ind w:firstLine="708"/>
-        <w:jc w:val="both"/>
-        <w:rPr>
-          <w:rFonts w:ascii="Times New Roman" w:hAnsi="Times New Roman" w:cs="Times New Roman"/>
-          <w:sz w:val="28"/>
-          <w:szCs w:val="28"/>
-        </w:rPr>
-      </w:pPr>
-      <w:r>
-        <w:rPr>
-          <w:rFonts w:ascii="Times New Roman" w:hAnsi="Times New Roman" w:cs="Times New Roman"/>
-          <w:sz w:val="28"/>
-          <w:szCs w:val="28"/>
-        </w:rPr>
-        <w:t>Если Управлению законодательными актами предоставлено право осуществлять приносящую доходы деятельность, то полученные доходы направляются в государственный бюджет, если иное не установлено законодательством Республики Казахстан.</w:t>
-      </w:r>
-    </w:p>
-    <w:p>
-      <w:pPr>
-        <w:spacing w:after="0" w:line="240" w:lineRule="atLeast"/>
-        <w:jc w:val="center"/>
-        <w:rPr>
-          <w:rFonts w:ascii="Times New Roman" w:hAnsi="Times New Roman" w:cs="Times New Roman"/>
-          <w:b/>
-          <w:sz w:val="28"/>
-          <w:szCs w:val="28"/>
-        </w:rPr>
-      </w:pPr>
-    </w:p>
-    <w:p>
-      <w:pPr>
-        <w:pStyle w:val="a4"/>
-        <w:numPr>
-          <w:ilvl w:val="0"/>
-          <w:numId w:val="1"/>
-        </w:numPr>
-        <w:spacing w:after="0" w:line="240" w:lineRule="atLeast"/>
-        <w:jc w:val="center"/>
-        <w:rPr>
-          <w:rFonts w:ascii="Times New Roman" w:hAnsi="Times New Roman" w:cs="Times New Roman"/>
-          <w:b/>
-          <w:sz w:val="28"/>
-          <w:szCs w:val="28"/>
-        </w:rPr>
-      </w:pPr>
-      <w:r>
-        <w:rPr>
-          <w:rFonts w:ascii="Times New Roman" w:hAnsi="Times New Roman" w:cs="Times New Roman"/>
-          <w:b/>
-          <w:sz w:val="28"/>
-          <w:szCs w:val="28"/>
-        </w:rPr>
-        <w:t xml:space="preserve">Задачи и полномочия </w:t>
-      </w:r>
-      <w:r>
-        <w:rPr>
-          <w:rFonts w:ascii="Times New Roman" w:hAnsi="Times New Roman" w:cs="Times New Roman"/>
-          <w:b/>
-          <w:sz w:val="28"/>
-          <w:szCs w:val="28"/>
-        </w:rPr>
-        <w:t>Управления</w:t>
-      </w:r>
-    </w:p>
-    <w:p>
-      <w:pPr>
-        <w:pStyle w:val="a4"/>
-        <w:spacing w:after="0" w:line="240" w:lineRule="atLeast"/>
-        <w:ind w:left="1080"/>
-        <w:rPr>
-          <w:rFonts w:ascii="Times New Roman" w:hAnsi="Times New Roman" w:cs="Times New Roman"/>
-          <w:b/>
-          <w:sz w:val="28"/>
-          <w:szCs w:val="28"/>
-        </w:rPr>
-      </w:pPr>
-    </w:p>
-    <w:p>
-      <w:pPr>
-        <w:pStyle w:val="a4"/>
-        <w:numPr>
-          <w:ilvl w:val="0"/>
-          <w:numId w:val="2"/>
-        </w:numPr>
-        <w:tabs>
-          <w:tab w:val="left" w:pos="709"/>
-        </w:tabs>
-        <w:spacing w:after="0" w:line="240" w:lineRule="atLeast"/>
-        <w:ind w:left="0" w:firstLine="709"/>
-        <w:jc w:val="both"/>
-        <w:rPr>
-          <w:rFonts w:ascii="Times New Roman" w:hAnsi="Times New Roman" w:cs="Times New Roman"/>
-          <w:sz w:val="28"/>
-          <w:szCs w:val="28"/>
-        </w:rPr>
-      </w:pPr>
-      <w:r>
-        <w:rPr>
-          <w:rFonts w:ascii="Times New Roman" w:hAnsi="Times New Roman" w:cs="Times New Roman"/>
-          <w:sz w:val="28"/>
-          <w:szCs w:val="28"/>
-        </w:rPr>
-        <w:t>Задачи:</w:t>
-      </w:r>
-    </w:p>
-    <w:p>
-      <w:pPr>
-        <w:tabs>
-          <w:tab w:val="left" w:pos="709"/>
-        </w:tabs>
-        <w:spacing w:after="0" w:line="240" w:lineRule="atLeast"/>
-        <w:ind w:firstLine="567"/>
-        <w:jc w:val="both"/>
-        <w:rPr>
-          <w:rFonts w:ascii="Times New Roman" w:hAnsi="Times New Roman" w:cs="Times New Roman"/>
-          <w:sz w:val="28"/>
-          <w:szCs w:val="28"/>
-        </w:rPr>
-      </w:pPr>
-      <w:r>
-        <w:rPr>
-          <w:rFonts w:ascii="Times New Roman" w:hAnsi="Times New Roman" w:cs="Times New Roman"/>
-          <w:sz w:val="28"/>
-          <w:szCs w:val="28"/>
-        </w:rPr>
-        <w:t xml:space="preserve">  1) обеспечение повышения качества условий проживания горожан</w:t>
-      </w:r>
-      <w:r>
-        <w:rPr>
-          <w:rFonts w:ascii="Times New Roman" w:hAnsi="Times New Roman" w:cs="Times New Roman"/>
-          <w:sz w:val="28"/>
-          <w:szCs w:val="28"/>
-        </w:rPr>
-        <w:t xml:space="preserve"> </w:t>
-      </w:r>
-      <w:r>
-        <w:rPr>
-          <w:rFonts w:ascii="Times New Roman" w:eastAsia="Times New Roman" w:hAnsi="Times New Roman" w:cs="Times New Roman"/>
-          <w:sz w:val="28"/>
-          <w:szCs w:val="28"/>
-        </w:rPr>
-        <w:t>на территории города;</w:t>
-      </w:r>
-    </w:p>
-    <w:p>
-      <w:pPr>
-        <w:spacing w:after="0" w:line="240" w:lineRule="atLeast"/>
-        <w:ind w:firstLine="708"/>
-        <w:jc w:val="both"/>
-        <w:rPr>
-          <w:rFonts w:ascii="Times New Roman" w:hAnsi="Times New Roman" w:cs="Times New Roman"/>
-          <w:sz w:val="28"/>
-          <w:szCs w:val="28"/>
-        </w:rPr>
-      </w:pPr>
-      <w:r>
-        <w:rPr>
-          <w:rFonts w:ascii="Times New Roman" w:hAnsi="Times New Roman" w:cs="Times New Roman"/>
-          <w:sz w:val="28"/>
-          <w:szCs w:val="28"/>
-        </w:rPr>
-        <w:t>2) модернизация жилья;</w:t>
-      </w:r>
-    </w:p>
-    <w:p>
-      <w:pPr>
-        <w:spacing w:after="0" w:line="240" w:lineRule="atLeast"/>
-        <w:ind w:firstLine="708"/>
-        <w:jc w:val="both"/>
-        <w:rPr>
-          <w:rFonts w:ascii="Times New Roman" w:hAnsi="Times New Roman" w:cs="Times New Roman"/>
-          <w:sz w:val="28"/>
-          <w:szCs w:val="28"/>
-        </w:rPr>
-      </w:pPr>
-      <w:r>
-        <w:rPr>
-          <w:rFonts w:ascii="Times New Roman" w:hAnsi="Times New Roman" w:cs="Times New Roman"/>
-          <w:sz w:val="28"/>
-          <w:szCs w:val="28"/>
-        </w:rPr>
-        <w:t>3) формирование бережного отношения населения к жилью и повышение активности жителей в вопросах жилищных отношений;</w:t>
-      </w:r>
-    </w:p>
-    <w:p>
-      <w:pPr>
-        <w:spacing w:after="0" w:line="240" w:lineRule="atLeast"/>
-        <w:ind w:firstLine="708"/>
-        <w:jc w:val="both"/>
-        <w:rPr>
-          <w:rFonts w:ascii="Times New Roman" w:hAnsi="Times New Roman" w:cs="Times New Roman"/>
-          <w:sz w:val="28"/>
-          <w:szCs w:val="28"/>
-        </w:rPr>
-      </w:pPr>
-      <w:r>
-        <w:rPr>
-          <w:rFonts w:ascii="Times New Roman" w:hAnsi="Times New Roman" w:cs="Times New Roman"/>
-          <w:sz w:val="28"/>
-          <w:szCs w:val="28"/>
-        </w:rPr>
-        <w:t>4) обеспечение безопасности в вопросах эксплуатации лифтового, газового и котельного оборудования;</w:t>
-      </w:r>
-    </w:p>
-    <w:p>
-      <w:pPr>
-        <w:spacing w:after="0" w:line="240" w:lineRule="atLeast"/>
-        <w:ind w:firstLine="708"/>
-        <w:jc w:val="both"/>
-        <w:rPr>
-          <w:rFonts w:ascii="Times New Roman" w:hAnsi="Times New Roman" w:cs="Times New Roman"/>
-          <w:sz w:val="28"/>
-          <w:szCs w:val="28"/>
-        </w:rPr>
-      </w:pPr>
-      <w:r>
-        <w:rPr>
-          <w:rFonts w:ascii="Times New Roman" w:hAnsi="Times New Roman" w:cs="Times New Roman"/>
-          <w:sz w:val="28"/>
-          <w:szCs w:val="28"/>
-        </w:rPr>
-        <w:t>5) полная прозрачность и открытость в вопросах распределения жилья для нуждающихся граждан;</w:t>
-      </w:r>
-    </w:p>
-    <w:p>
-      <w:pPr>
-        <w:spacing w:after="0" w:line="240" w:lineRule="atLeast"/>
-        <w:ind w:firstLine="708"/>
-        <w:jc w:val="both"/>
-        <w:rPr>
-          <w:rFonts w:ascii="Times New Roman" w:eastAsia="Times New Roman" w:hAnsi="Times New Roman" w:cs="Times New Roman"/>
-          <w:sz w:val="28"/>
-          <w:szCs w:val="28"/>
-        </w:rPr>
-      </w:pPr>
-      <w:r>
-        <w:rPr>
-          <w:rFonts w:ascii="Times New Roman" w:hAnsi="Times New Roman" w:cs="Times New Roman"/>
-          <w:sz w:val="28"/>
-          <w:szCs w:val="28"/>
-        </w:rPr>
-        <w:t xml:space="preserve">6) </w:t>
-      </w:r>
-      <w:r>
-        <w:rPr>
-          <w:rFonts w:ascii="Times New Roman" w:eastAsia="Times New Roman" w:hAnsi="Times New Roman" w:cs="Times New Roman"/>
-          <w:sz w:val="28"/>
-          <w:szCs w:val="28"/>
-        </w:rPr>
-        <w:t>улучшен</w:t>
-      </w:r>
-      <w:r>
-        <w:rPr>
-          <w:rFonts w:ascii="Times New Roman" w:eastAsia="Times New Roman" w:hAnsi="Times New Roman" w:cs="Times New Roman"/>
-          <w:sz w:val="28"/>
-          <w:szCs w:val="28"/>
-        </w:rPr>
-        <w:t>ие санитарного состояния города.</w:t>
-      </w:r>
-    </w:p>
-    <w:p>
-      <w:pPr>
-        <w:pStyle w:val="a4"/>
-        <w:numPr>
-          <w:ilvl w:val="0"/>
-          <w:numId w:val="2"/>
-        </w:numPr>
-        <w:spacing w:after="0" w:line="240" w:lineRule="atLeast"/>
-        <w:ind w:left="0" w:firstLine="709"/>
-        <w:jc w:val="both"/>
-        <w:rPr>
-          <w:rFonts w:ascii="Times New Roman" w:hAnsi="Times New Roman" w:cs="Times New Roman"/>
-          <w:sz w:val="28"/>
-          <w:szCs w:val="28"/>
-        </w:rPr>
-      </w:pPr>
-      <w:r>
-        <w:rPr>
-          <w:rFonts w:ascii="Times New Roman" w:hAnsi="Times New Roman" w:cs="Times New Roman"/>
-          <w:sz w:val="28"/>
-          <w:szCs w:val="28"/>
-        </w:rPr>
-        <w:t>Полномочия:</w:t>
-      </w:r>
-    </w:p>
-    <w:p>
-      <w:pPr>
-        <w:pStyle w:val="a4"/>
-        <w:numPr>
-          <w:ilvl w:val="0"/>
-          <w:numId w:val="6"/>
-        </w:numPr>
-        <w:spacing w:after="0" w:line="240" w:lineRule="atLeast"/>
-        <w:ind w:left="0" w:firstLine="709"/>
-        <w:jc w:val="both"/>
-        <w:rPr>
-          <w:rFonts w:ascii="Times New Roman" w:hAnsi="Times New Roman" w:cs="Times New Roman"/>
-          <w:sz w:val="28"/>
-          <w:szCs w:val="28"/>
-        </w:rPr>
-      </w:pPr>
-      <w:r>
-        <w:rPr>
-          <w:rFonts w:ascii="Times New Roman" w:hAnsi="Times New Roman" w:cs="Times New Roman"/>
-          <w:sz w:val="28"/>
-          <w:szCs w:val="28"/>
-        </w:rPr>
-        <w:t>права:</w:t>
-      </w:r>
-    </w:p>
-    <w:p>
-      <w:pPr>
-        <w:pStyle w:val="a4"/>
-        <w:spacing w:after="0" w:line="240" w:lineRule="atLeast"/>
-        <w:ind w:left="709"/>
-        <w:jc w:val="both"/>
-        <w:rPr>
-          <w:rFonts w:ascii="Times New Roman" w:hAnsi="Times New Roman" w:cs="Times New Roman"/>
-          <w:sz w:val="28"/>
-          <w:szCs w:val="28"/>
-        </w:rPr>
-      </w:pPr>
-      <w:r>
-        <w:rPr>
-          <w:rFonts w:ascii="Times New Roman" w:hAnsi="Times New Roman" w:cs="Times New Roman"/>
-          <w:sz w:val="28"/>
-          <w:szCs w:val="28"/>
-        </w:rPr>
-        <w:t>выступать в гражданско-правовых отношениях от собственного имени;</w:t>
-      </w:r>
-    </w:p>
-    <w:p>
-      <w:pPr>
-        <w:spacing w:after="0" w:line="240" w:lineRule="atLeast"/>
-        <w:ind w:firstLine="709"/>
-        <w:jc w:val="both"/>
-        <w:rPr>
-          <w:rFonts w:ascii="Times New Roman" w:hAnsi="Times New Roman" w:cs="Times New Roman"/>
-          <w:sz w:val="28"/>
-          <w:szCs w:val="28"/>
-        </w:rPr>
-      </w:pPr>
-      <w:r>
-        <w:rPr>
-          <w:rFonts w:ascii="Times New Roman" w:hAnsi="Times New Roman" w:cs="Times New Roman"/>
-          <w:sz w:val="28"/>
-          <w:szCs w:val="28"/>
-        </w:rPr>
-        <w:t xml:space="preserve">выступать стороной </w:t>
-      </w:r>
-      <w:r>
-        <w:rPr>
-          <w:rFonts w:ascii="Times New Roman" w:hAnsi="Times New Roman" w:cs="Times New Roman"/>
-          <w:sz w:val="28"/>
-          <w:szCs w:val="28"/>
-        </w:rPr>
-        <w:t xml:space="preserve">гражданско-правовых </w:t>
-      </w:r>
-      <w:r>
-        <w:rPr>
-          <w:rFonts w:ascii="Times New Roman" w:hAnsi="Times New Roman" w:cs="Times New Roman"/>
-          <w:sz w:val="28"/>
-          <w:szCs w:val="28"/>
-        </w:rPr>
-        <w:t xml:space="preserve">отношений от имени государства, </w:t>
-      </w:r>
-      <w:r>
-        <w:rPr>
-          <w:rFonts w:ascii="Times New Roman" w:hAnsi="Times New Roman" w:cs="Times New Roman"/>
-          <w:sz w:val="28"/>
-          <w:szCs w:val="28"/>
-        </w:rPr>
-        <w:t>если оно уполномочено на это</w:t>
-      </w:r>
-      <w:r>
-        <w:rPr>
-          <w:rFonts w:ascii="Times New Roman" w:hAnsi="Times New Roman" w:cs="Times New Roman"/>
-          <w:sz w:val="28"/>
-          <w:szCs w:val="28"/>
-        </w:rPr>
-        <w:t xml:space="preserve"> </w:t>
-      </w:r>
-      <w:r>
-        <w:rPr>
-          <w:rFonts w:ascii="Times New Roman" w:hAnsi="Times New Roman" w:cs="Times New Roman"/>
-          <w:sz w:val="28"/>
-          <w:szCs w:val="28"/>
-        </w:rPr>
-        <w:t>в соответствии с законодательством;</w:t>
-      </w:r>
-    </w:p>
-    <w:p>
-      <w:pPr>
-        <w:spacing w:after="0" w:line="240" w:lineRule="atLeast"/>
-        <w:ind w:firstLine="709"/>
-        <w:jc w:val="both"/>
-        <w:rPr>
-          <w:rFonts w:ascii="Times New Roman" w:hAnsi="Times New Roman" w:cs="Times New Roman"/>
-          <w:sz w:val="28"/>
-          <w:szCs w:val="28"/>
-        </w:rPr>
-      </w:pPr>
-      <w:r>
-        <w:rPr>
-          <w:rFonts w:ascii="Times New Roman" w:hAnsi="Times New Roman" w:cs="Times New Roman"/>
-          <w:sz w:val="28"/>
-          <w:szCs w:val="28"/>
-        </w:rPr>
-        <w:t>принимать решения, оформляемые приказами Управления и другими актами, в пределах своей компетенции согласно законодательству Республики Казахстан и настоящему Положению;</w:t>
-      </w:r>
-    </w:p>
-    <w:p>
-      <w:pPr>
-        <w:spacing w:after="0" w:line="240" w:lineRule="atLeast"/>
-        <w:ind w:firstLine="709"/>
-        <w:jc w:val="both"/>
-        <w:rPr>
-          <w:rFonts w:ascii="Times New Roman" w:hAnsi="Times New Roman" w:cs="Times New Roman"/>
-          <w:sz w:val="28"/>
-          <w:szCs w:val="28"/>
-        </w:rPr>
-      </w:pPr>
-      <w:r>
-        <w:rPr>
-          <w:rFonts w:ascii="Times New Roman" w:hAnsi="Times New Roman" w:cs="Times New Roman"/>
-          <w:sz w:val="28"/>
-          <w:szCs w:val="28"/>
-        </w:rPr>
-        <w:t>запрашивать и получать от государственных органов, иных организаций и физических лиц необходимую информацию;</w:t>
-      </w:r>
-    </w:p>
-    <w:p>
-      <w:pPr>
-        <w:spacing w:after="0" w:line="240" w:lineRule="atLeast"/>
-        <w:ind w:firstLine="709"/>
-        <w:jc w:val="both"/>
-        <w:rPr>
-          <w:rFonts w:ascii="Times New Roman" w:hAnsi="Times New Roman" w:cs="Times New Roman"/>
-          <w:sz w:val="28"/>
-          <w:szCs w:val="28"/>
-        </w:rPr>
-      </w:pPr>
-      <w:r>
-        <w:rPr>
-          <w:rFonts w:ascii="Times New Roman" w:hAnsi="Times New Roman" w:cs="Times New Roman"/>
-          <w:sz w:val="28"/>
-          <w:szCs w:val="28"/>
-        </w:rPr>
-        <w:t>посещать проверяемый объект во время проведения проверки;</w:t>
-      </w:r>
-    </w:p>
-    <w:p>
-      <w:pPr>
-        <w:spacing w:after="0" w:line="240" w:lineRule="atLeast"/>
-        <w:ind w:firstLine="709"/>
-        <w:jc w:val="both"/>
-        <w:rPr>
-          <w:rFonts w:ascii="Times New Roman" w:hAnsi="Times New Roman" w:cs="Times New Roman"/>
-          <w:sz w:val="28"/>
-          <w:szCs w:val="28"/>
-        </w:rPr>
-      </w:pPr>
-      <w:r>
-        <w:rPr>
-          <w:rFonts w:ascii="Times New Roman" w:hAnsi="Times New Roman" w:cs="Times New Roman"/>
-          <w:sz w:val="28"/>
-          <w:szCs w:val="28"/>
-        </w:rPr>
-        <w:t>запрашивать любую необходимую информацию при проведении проверок, знакомиться с оригиналами документов, относящихся к предмету проверки;</w:t>
-      </w:r>
-    </w:p>
-    <w:p>
-      <w:pPr>
-        <w:spacing w:after="0" w:line="240" w:lineRule="atLeast"/>
-        <w:ind w:firstLine="709"/>
-        <w:jc w:val="both"/>
-        <w:rPr>
-          <w:rFonts w:ascii="Times New Roman" w:hAnsi="Times New Roman" w:cs="Times New Roman"/>
-          <w:sz w:val="28"/>
-          <w:szCs w:val="28"/>
-        </w:rPr>
-      </w:pPr>
-      <w:r>
-        <w:rPr>
-          <w:rFonts w:ascii="Times New Roman" w:hAnsi="Times New Roman" w:cs="Times New Roman"/>
-          <w:sz w:val="28"/>
-          <w:szCs w:val="28"/>
-        </w:rPr>
-        <w:t>п</w:t>
-      </w:r>
-      <w:r>
-        <w:rPr>
-          <w:rFonts w:ascii="Times New Roman" w:hAnsi="Times New Roman" w:cs="Times New Roman"/>
-          <w:sz w:val="28"/>
-          <w:szCs w:val="28"/>
-        </w:rPr>
-        <w:t>ривлекать</w:t>
-      </w:r>
-      <w:r>
-        <w:rPr>
-          <w:rFonts w:ascii="Times New Roman" w:hAnsi="Times New Roman" w:cs="Times New Roman"/>
-          <w:sz w:val="28"/>
-          <w:szCs w:val="28"/>
-        </w:rPr>
-        <w:t xml:space="preserve">  </w:t>
-      </w:r>
-      <w:r>
-        <w:rPr>
-          <w:rFonts w:ascii="Times New Roman" w:hAnsi="Times New Roman" w:cs="Times New Roman"/>
-          <w:sz w:val="28"/>
-          <w:szCs w:val="28"/>
-          <w:lang w:val="kk-KZ"/>
-        </w:rPr>
-        <w:t xml:space="preserve"> </w:t>
-      </w:r>
-      <w:r>
-        <w:rPr>
-          <w:rFonts w:ascii="Times New Roman" w:hAnsi="Times New Roman" w:cs="Times New Roman"/>
-          <w:sz w:val="28"/>
-          <w:szCs w:val="28"/>
-        </w:rPr>
-        <w:t xml:space="preserve"> </w:t>
-      </w:r>
-      <w:r>
-        <w:rPr>
-          <w:rFonts w:ascii="Times New Roman" w:hAnsi="Times New Roman" w:cs="Times New Roman"/>
-          <w:sz w:val="28"/>
-          <w:szCs w:val="28"/>
-        </w:rPr>
-        <w:t>дополнительные</w:t>
-      </w:r>
-      <w:r>
-        <w:rPr>
-          <w:rFonts w:ascii="Times New Roman" w:hAnsi="Times New Roman" w:cs="Times New Roman"/>
-          <w:sz w:val="28"/>
-          <w:szCs w:val="28"/>
-        </w:rPr>
-        <w:t xml:space="preserve"> </w:t>
-      </w:r>
-      <w:r>
-        <w:rPr>
-          <w:rFonts w:ascii="Times New Roman" w:hAnsi="Times New Roman" w:cs="Times New Roman"/>
-          <w:sz w:val="28"/>
-          <w:szCs w:val="28"/>
-          <w:lang w:val="kk-KZ"/>
-        </w:rPr>
-        <w:t xml:space="preserve"> </w:t>
-      </w:r>
-      <w:r>
-        <w:rPr>
-          <w:rFonts w:ascii="Times New Roman" w:hAnsi="Times New Roman" w:cs="Times New Roman"/>
-          <w:sz w:val="28"/>
-          <w:szCs w:val="28"/>
-        </w:rPr>
-        <w:t xml:space="preserve"> </w:t>
-      </w:r>
-      <w:r>
-        <w:rPr>
-          <w:rFonts w:ascii="Times New Roman" w:hAnsi="Times New Roman" w:cs="Times New Roman"/>
-          <w:sz w:val="28"/>
-          <w:szCs w:val="28"/>
-        </w:rPr>
-        <w:t xml:space="preserve"> </w:t>
-      </w:r>
-      <w:r>
-        <w:rPr>
-          <w:rFonts w:ascii="Times New Roman" w:hAnsi="Times New Roman" w:cs="Times New Roman"/>
-          <w:sz w:val="28"/>
-          <w:szCs w:val="28"/>
-        </w:rPr>
-        <w:t>ресурсы</w:t>
-      </w:r>
-      <w:r>
-        <w:rPr>
-          <w:rFonts w:ascii="Times New Roman" w:hAnsi="Times New Roman" w:cs="Times New Roman"/>
-          <w:sz w:val="28"/>
-          <w:szCs w:val="28"/>
-        </w:rPr>
-        <w:t xml:space="preserve">  </w:t>
-      </w:r>
-      <w:r>
-        <w:rPr>
-          <w:rFonts w:ascii="Times New Roman" w:hAnsi="Times New Roman" w:cs="Times New Roman"/>
-          <w:sz w:val="28"/>
-          <w:szCs w:val="28"/>
-        </w:rPr>
-        <w:t xml:space="preserve"> (специализированная </w:t>
-      </w:r>
-      <w:r>
-        <w:rPr>
-          <w:rFonts w:ascii="Times New Roman" w:hAnsi="Times New Roman" w:cs="Times New Roman"/>
-          <w:sz w:val="28"/>
-          <w:szCs w:val="28"/>
-        </w:rPr>
-        <w:t xml:space="preserve"> </w:t>
-      </w:r>
-      <w:r>
-        <w:rPr>
-          <w:rFonts w:ascii="Times New Roman" w:hAnsi="Times New Roman" w:cs="Times New Roman"/>
-          <w:sz w:val="28"/>
-          <w:szCs w:val="28"/>
-        </w:rPr>
-        <w:t xml:space="preserve"> </w:t>
-      </w:r>
-      <w:r>
-        <w:rPr>
-          <w:rFonts w:ascii="Times New Roman" w:hAnsi="Times New Roman" w:cs="Times New Roman"/>
-          <w:sz w:val="28"/>
-          <w:szCs w:val="28"/>
-        </w:rPr>
-        <w:t xml:space="preserve">техника, </w:t>
-      </w:r>
-    </w:p>
-    <w:p>
-      <w:pPr>
-        <w:spacing w:after="0" w:line="240" w:lineRule="atLeast"/>
-        <w:jc w:val="both"/>
-        <w:rPr>
-          <w:rFonts w:ascii="Times New Roman" w:hAnsi="Times New Roman" w:cs="Times New Roman"/>
-          <w:sz w:val="28"/>
-          <w:szCs w:val="28"/>
-        </w:rPr>
-      </w:pPr>
-    </w:p>
-    <w:p>
-      <w:pPr>
-        <w:spacing w:after="0" w:line="240" w:lineRule="atLeast"/>
-        <w:jc w:val="center"/>
-        <w:rPr>
-          <w:rFonts w:ascii="Times New Roman" w:hAnsi="Times New Roman" w:cs="Times New Roman"/>
-          <w:b/>
-          <w:sz w:val="24"/>
-          <w:szCs w:val="24"/>
-        </w:rPr>
-      </w:pPr>
-    </w:p>
-    <w:p>
-      <w:pPr>
-        <w:spacing w:after="0" w:line="240" w:lineRule="atLeast"/>
-        <w:jc w:val="center"/>
-        <w:rPr>
-          <w:rFonts w:ascii="Times New Roman" w:hAnsi="Times New Roman" w:cs="Times New Roman"/>
-          <w:sz w:val="24"/>
-          <w:szCs w:val="24"/>
-        </w:rPr>
-      </w:pPr>
-      <w:r>
-        <w:rPr>
-          <w:rFonts w:ascii="Times New Roman" w:hAnsi="Times New Roman" w:cs="Times New Roman"/>
-          <w:sz w:val="24"/>
-          <w:szCs w:val="24"/>
-        </w:rPr>
-        <w:lastRenderedPageBreak/>
-        <w:t>4</w:t>
-      </w:r>
-    </w:p>
-    <w:p>
-      <w:pPr>
-        <w:spacing w:after="0" w:line="240" w:lineRule="atLeast"/>
-        <w:jc w:val="center"/>
-        <w:rPr>
-          <w:rFonts w:ascii="Times New Roman" w:hAnsi="Times New Roman" w:cs="Times New Roman"/>
-          <w:b/>
-          <w:sz w:val="24"/>
-          <w:szCs w:val="24"/>
-        </w:rPr>
-      </w:pPr>
-    </w:p>
-    <w:p>
-      <w:pPr>
-        <w:spacing w:after="0" w:line="240" w:lineRule="atLeast"/>
-        <w:jc w:val="both"/>
-        <w:rPr>
-          <w:rFonts w:ascii="Times New Roman" w:hAnsi="Times New Roman" w:cs="Times New Roman"/>
-          <w:sz w:val="28"/>
-          <w:szCs w:val="28"/>
-        </w:rPr>
-      </w:pPr>
-      <w:r>
-        <w:rPr>
-          <w:rFonts w:ascii="Times New Roman" w:hAnsi="Times New Roman" w:cs="Times New Roman"/>
-          <w:sz w:val="28"/>
-          <w:szCs w:val="28"/>
-        </w:rPr>
-        <w:t xml:space="preserve">дорожные рабочие) в период особых метеоусловий за счет средств местного бюджета; </w:t>
-      </w:r>
-    </w:p>
-    <w:p>
-      <w:pPr>
-        <w:tabs>
-          <w:tab w:val="left" w:pos="709"/>
-        </w:tabs>
-        <w:spacing w:after="0" w:line="240" w:lineRule="atLeast"/>
-        <w:ind w:firstLine="709"/>
-        <w:jc w:val="both"/>
-        <w:rPr>
-          <w:rFonts w:ascii="Times New Roman" w:hAnsi="Times New Roman" w:cs="Times New Roman"/>
-          <w:sz w:val="28"/>
-          <w:szCs w:val="28"/>
-        </w:rPr>
-      </w:pPr>
-      <w:r>
-        <w:rPr>
-          <w:rFonts w:ascii="Times New Roman" w:hAnsi="Times New Roman" w:cs="Times New Roman"/>
-          <w:sz w:val="28"/>
-          <w:szCs w:val="28"/>
-        </w:rPr>
-        <w:t>осуществлять иные права и обязанности в соответствии с законодательством Республики Казахстан.</w:t>
-      </w:r>
-    </w:p>
-    <w:p>
-      <w:pPr>
-        <w:pStyle w:val="a4"/>
-        <w:numPr>
-          <w:ilvl w:val="0"/>
-          <w:numId w:val="6"/>
-        </w:numPr>
-        <w:tabs>
-          <w:tab w:val="left" w:pos="709"/>
-        </w:tabs>
-        <w:spacing w:after="0" w:line="240" w:lineRule="atLeast"/>
-        <w:ind w:left="0" w:firstLine="709"/>
-        <w:jc w:val="both"/>
-        <w:rPr>
-          <w:rFonts w:ascii="Times New Roman" w:hAnsi="Times New Roman" w:cs="Times New Roman"/>
-          <w:sz w:val="28"/>
-          <w:szCs w:val="28"/>
-        </w:rPr>
-      </w:pPr>
-      <w:r>
-        <w:rPr>
-          <w:rFonts w:ascii="Times New Roman" w:hAnsi="Times New Roman" w:cs="Times New Roman"/>
-          <w:sz w:val="28"/>
-          <w:szCs w:val="28"/>
-        </w:rPr>
-        <w:t>обязанности:</w:t>
-      </w:r>
-    </w:p>
-    <w:p>
-      <w:pPr>
-        <w:tabs>
-          <w:tab w:val="left" w:pos="0"/>
-        </w:tabs>
-        <w:spacing w:after="0" w:line="240" w:lineRule="atLeast"/>
-        <w:ind w:firstLine="708"/>
-        <w:jc w:val="both"/>
-        <w:rPr>
-          <w:rFonts w:ascii="Times New Roman" w:hAnsi="Times New Roman" w:cs="Times New Roman"/>
-          <w:sz w:val="28"/>
-          <w:szCs w:val="28"/>
-        </w:rPr>
-      </w:pPr>
-      <w:r>
-        <w:rPr>
-          <w:rFonts w:ascii="Times New Roman" w:hAnsi="Times New Roman" w:cs="Times New Roman"/>
-          <w:sz w:val="28"/>
-          <w:szCs w:val="28"/>
-        </w:rPr>
         <w:t>обеспечить оптимальное и эффективное расходование денежных средств, выделенных из бюджета города Алматы Управлению и обеспечить приобретение товаров, работ и услуг в соответствии с законодательством Республики Казахстан о государственных закупах;</w:t>
       </w:r>
     </w:p>
@@ -1906,7 +1902,25 @@
           <w:sz w:val="28"/>
           <w:szCs w:val="28"/>
         </w:rPr>
-        <w:t>5) принятие участия в разработке проектно-сметной документации по строительству, реконструкции и сейсмоусилению социальных объектов, осуществляемых уполномоченным органом в сфере строительства города Алматы;</w:t>
+        <w:t xml:space="preserve">5) принятие участия в разработке проектно-сметной документации по строительству, реконструкции и </w:t>
+      </w:r>
+      <w:proofErr w:type="spellStart"/>
+      <w:r>
+        <w:rPr>
+          <w:rFonts w:ascii="Times New Roman" w:hAnsi="Times New Roman" w:cs="Times New Roman"/>
+          <w:sz w:val="28"/>
+          <w:szCs w:val="28"/>
+        </w:rPr>
+        <w:t>сейсмоусилению</w:t>
+      </w:r>
+      <w:proofErr w:type="spellEnd"/>
+      <w:r>
+        <w:rPr>
+          <w:rFonts w:ascii="Times New Roman" w:hAnsi="Times New Roman" w:cs="Times New Roman"/>
+          <w:sz w:val="28"/>
+          <w:szCs w:val="28"/>
+        </w:rPr>
+        <w:t xml:space="preserve"> социальных объектов, осуществляемых уполномоченным органом в сфере строительства города Алматы;</w:t>
       </w:r>
     </w:p>
     <w:p>
@@ -1988,53 +2002,6 @@
         </w:rPr>
         <w:t>координация проводимой в городе работы по благоустройству;</w:t>
       </w:r>
-    </w:p>
-    <w:p>
-      <w:pPr>
-        <w:pStyle w:val="a5"/>
-        <w:tabs>
-          <w:tab w:val="left" w:pos="0"/>
-          <w:tab w:val="left" w:pos="851"/>
-        </w:tabs>
-        <w:spacing w:before="0" w:beforeAutospacing="0" w:after="0" w:afterAutospacing="0"/>
-        <w:jc w:val="center"/>
-        <w:rPr>
-          <w:color w:val="000000"/>
-        </w:rPr>
-      </w:pPr>
-    </w:p>
-    <w:p>
-      <w:pPr>
-        <w:pStyle w:val="a5"/>
-        <w:tabs>
-          <w:tab w:val="left" w:pos="0"/>
-          <w:tab w:val="left" w:pos="851"/>
-        </w:tabs>
-        <w:spacing w:before="0" w:beforeAutospacing="0" w:after="0" w:afterAutospacing="0"/>
-        <w:jc w:val="center"/>
-        <w:rPr>
-          <w:color w:val="000000"/>
-        </w:rPr>
-      </w:pPr>
-      <w:r>
-        <w:rPr>
-          <w:color w:val="000000"/>
-        </w:rPr>
-        <w:lastRenderedPageBreak/>
-        <w:t>5</w:t>
-      </w:r>
-    </w:p>
-    <w:p>
-      <w:pPr>
-        <w:spacing w:after="0" w:line="240" w:lineRule="atLeast"/>
-        <w:ind w:firstLine="567"/>
-        <w:jc w:val="both"/>
-        <w:rPr>
-          <w:rFonts w:ascii="Times New Roman" w:hAnsi="Times New Roman" w:cs="Times New Roman"/>
-          <w:sz w:val="28"/>
-          <w:szCs w:val="28"/>
-        </w:rPr>
-      </w:pPr>
     </w:p>
     <w:p>
       <w:pPr>
@@ -2154,6 +2121,7 @@
           <w:sz w:val="28"/>
           <w:szCs w:val="28"/>
         </w:rPr>
+        <w:lastRenderedPageBreak/>
         <w:t xml:space="preserve">  </w:t>
       </w:r>
       <w:r>
@@ -2267,7 +2235,16 @@
           <w:sz w:val="28"/>
           <w:szCs w:val="28"/>
         </w:rPr>
-        <w:t xml:space="preserve">осуществление контроля за техническим состоянием общего имущества объекта кондоминиума и его инженерного оборудования, своевременным выполнением работ по его содержанию и ремонту в </w:t>
+        <w:t xml:space="preserve">осуществление контроля за техническим состоянием общего имущества объекта кондоминиума и его инженерного оборудования, своевременным выполнением работ по его содержанию и ремонту </w:t>
+      </w:r>
+      <w:proofErr w:type="gramStart"/>
+      <w:r>
+        <w:rPr>
+          <w:color w:val="000000"/>
+          <w:sz w:val="28"/>
+          <w:szCs w:val="28"/>
+        </w:rPr>
+        <w:t xml:space="preserve">в </w:t>
       </w:r>
       <w:r>
         <w:rPr>
@@ -2282,7 +2259,16 @@
           <w:sz w:val="28"/>
           <w:szCs w:val="28"/>
         </w:rPr>
-        <w:t>оответствии с действующими нормативно-техническими и проектными документами в области строительства и жилищно-коммунального хозяйства;</w:t>
+        <w:t>оответствии</w:t>
+      </w:r>
+      <w:proofErr w:type="gramEnd"/>
+      <w:r>
+        <w:rPr>
+          <w:color w:val="000000"/>
+          <w:sz w:val="28"/>
+          <w:szCs w:val="28"/>
+        </w:rPr>
+        <w:t xml:space="preserve"> с действующими нормативно-техническими и проектными документами в области строительства и жилищно-коммунального хозяйства;</w:t>
       </w:r>
     </w:p>
     <w:p>
@@ -2318,7 +2304,16 @@
           <w:sz w:val="28"/>
           <w:szCs w:val="28"/>
         </w:rPr>
-        <w:t xml:space="preserve">ля за </w:t>
+        <w:t xml:space="preserve">ля </w:t>
+      </w:r>
+      <w:proofErr w:type="gramStart"/>
+      <w:r>
+        <w:rPr>
+          <w:color w:val="000000"/>
+          <w:sz w:val="28"/>
+          <w:szCs w:val="28"/>
+        </w:rPr>
+        <w:t xml:space="preserve">за </w:t>
       </w:r>
       <w:r>
         <w:rPr>
@@ -2334,7 +2329,16 @@
           <w:sz w:val="28"/>
           <w:szCs w:val="28"/>
         </w:rPr>
-        <w:t xml:space="preserve">проведением </w:t>
+        <w:t>проведением</w:t>
+      </w:r>
+      <w:proofErr w:type="gramEnd"/>
+      <w:r>
+        <w:rPr>
+          <w:color w:val="000000"/>
+          <w:sz w:val="28"/>
+          <w:szCs w:val="28"/>
+        </w:rPr>
+        <w:t xml:space="preserve"> </w:t>
       </w:r>
       <w:r>
         <w:rPr>
@@ -2587,7 +2591,29 @@
           <w:szCs w:val="28"/>
           <w:lang w:eastAsia="en-US"/>
         </w:rPr>
-        <w:t>осуществление государственного контроля за соблюдением требований безопасной эксплуатации газопотребляющих систем и газового оборудования бытовых и коммунально-бытовых потребителей;</w:t>
+        <w:t xml:space="preserve">осуществление государственного контроля за соблюдением требований безопасной эксплуатации </w:t>
+      </w:r>
+      <w:proofErr w:type="spellStart"/>
+      <w:r>
+        <w:rPr>
+          <w:rFonts w:eastAsia="Calibri"/>
+          <w:spacing w:val="1"/>
+          <w:sz w:val="28"/>
+          <w:szCs w:val="28"/>
+          <w:lang w:eastAsia="en-US"/>
+        </w:rPr>
+        <w:t>газопотребляющих</w:t>
+      </w:r>
+      <w:proofErr w:type="spellEnd"/>
+      <w:r>
+        <w:rPr>
+          <w:rFonts w:eastAsia="Calibri"/>
+          <w:spacing w:val="1"/>
+          <w:sz w:val="28"/>
+          <w:szCs w:val="28"/>
+          <w:lang w:eastAsia="en-US"/>
+        </w:rPr>
+        <w:t xml:space="preserve"> систем и газового оборудования бытовых и коммунально-бытовых потребителей;</w:t>
       </w:r>
     </w:p>
     <w:p>
@@ -2669,8 +2695,9 @@
           <w:szCs w:val="28"/>
           <w:lang w:eastAsia="en-US"/>
         </w:rPr>
-        <w:t>/или отдельных видов деятельности индивидуальных</w:t>
-      </w:r>
+        <w:t xml:space="preserve">/или отдельных видов деятельности </w:t>
+      </w:r>
+      <w:proofErr w:type="gramStart"/>
       <w:r>
         <w:rPr>
           <w:rFonts w:eastAsia="Calibri"/>
@@ -2679,7 +2706,7 @@
           <w:szCs w:val="28"/>
           <w:lang w:eastAsia="en-US"/>
         </w:rPr>
-        <w:t xml:space="preserve"> </w:t>
+        <w:t>индивидуальных</w:t>
       </w:r>
       <w:r>
         <w:rPr>
@@ -2689,7 +2716,7 @@
           <w:szCs w:val="28"/>
           <w:lang w:eastAsia="en-US"/>
         </w:rPr>
-        <w:t xml:space="preserve"> предпринимателей,</w:t>
+        <w:t xml:space="preserve"> </w:t>
       </w:r>
       <w:r>
         <w:rPr>
@@ -2699,8 +2726,9 @@
           <w:szCs w:val="28"/>
           <w:lang w:eastAsia="en-US"/>
         </w:rPr>
-        <w:t xml:space="preserve"> </w:t>
-      </w:r>
+        <w:t xml:space="preserve"> предпринимателей</w:t>
+      </w:r>
+      <w:proofErr w:type="gramEnd"/>
       <w:r>
         <w:rPr>
           <w:rFonts w:eastAsia="Calibri"/>
@@ -2709,71 +2737,165 @@
           <w:szCs w:val="28"/>
           <w:lang w:eastAsia="en-US"/>
         </w:rPr>
-        <w:t xml:space="preserve"> организаций, связанных с эксплуатацией </w:t>
+        <w:t>,</w:t>
+      </w:r>
+      <w:r>
+        <w:rPr>
+          <w:rFonts w:eastAsia="Calibri"/>
+          <w:spacing w:val="1"/>
+          <w:sz w:val="28"/>
+          <w:szCs w:val="28"/>
+          <w:lang w:eastAsia="en-US"/>
+        </w:rPr>
+        <w:t xml:space="preserve"> </w:t>
+      </w:r>
+      <w:r>
+        <w:rPr>
+          <w:rFonts w:eastAsia="Calibri"/>
+          <w:spacing w:val="1"/>
+          <w:sz w:val="28"/>
+          <w:szCs w:val="28"/>
+          <w:lang w:eastAsia="en-US"/>
+        </w:rPr>
+        <w:t xml:space="preserve"> организаций, связанных с эксплуатацией</w:t>
+      </w:r>
+      <w:r>
+        <w:rPr>
+          <w:rFonts w:eastAsia="Calibri"/>
+          <w:spacing w:val="1"/>
+          <w:sz w:val="28"/>
+          <w:szCs w:val="28"/>
+          <w:lang w:eastAsia="en-US"/>
+        </w:rPr>
+        <w:t xml:space="preserve"> </w:t>
+      </w:r>
+      <w:r>
+        <w:rPr>
+          <w:rFonts w:eastAsia="Calibri"/>
+          <w:spacing w:val="1"/>
+          <w:sz w:val="28"/>
+          <w:szCs w:val="28"/>
+          <w:lang w:eastAsia="en-US"/>
+        </w:rPr>
+        <w:t>опасных производственных объектов, технических устройств, на срок не более трех дней, с обязательным предъявлением в указанный срок искового заявления в суд;</w:t>
       </w:r>
     </w:p>
     <w:p>
       <w:pPr>
         <w:pStyle w:val="a5"/>
+        <w:numPr>
+          <w:ilvl w:val="0"/>
+          <w:numId w:val="8"/>
+        </w:numPr>
         <w:tabs>
           <w:tab w:val="left" w:pos="0"/>
           <w:tab w:val="left" w:pos="851"/>
         </w:tabs>
         <w:spacing w:before="0" w:beforeAutospacing="0" w:after="0" w:afterAutospacing="0"/>
-        <w:jc w:val="center"/>
-        <w:rPr>
-          <w:color w:val="000000"/>
-        </w:rPr>
-      </w:pPr>
-      <w:r>
-        <w:rPr>
-          <w:color w:val="000000"/>
+        <w:ind w:left="0" w:firstLine="709"/>
+        <w:jc w:val="both"/>
+        <w:rPr>
+          <w:color w:val="000000"/>
+          <w:sz w:val="28"/>
+          <w:szCs w:val="28"/>
+        </w:rPr>
+      </w:pPr>
+      <w:r>
+        <w:rPr>
+          <w:rFonts w:eastAsia="Calibri"/>
+          <w:spacing w:val="1"/>
+          <w:sz w:val="28"/>
+          <w:szCs w:val="28"/>
+          <w:lang w:eastAsia="en-US"/>
+        </w:rPr>
+        <w:t xml:space="preserve">осуществление государственного надзора за </w:t>
+      </w:r>
+      <w:r>
+        <w:rPr>
+          <w:rFonts w:eastAsia="Calibri"/>
+          <w:spacing w:val="1"/>
+          <w:sz w:val="28"/>
+          <w:szCs w:val="28"/>
+          <w:lang w:eastAsia="en-US"/>
+        </w:rPr>
+        <w:t>эксплуатацией</w:t>
+      </w:r>
+      <w:r>
+        <w:rPr>
+          <w:rFonts w:eastAsia="Calibri"/>
+          <w:spacing w:val="1"/>
+          <w:sz w:val="28"/>
+          <w:szCs w:val="28"/>
+          <w:lang w:eastAsia="en-US"/>
+        </w:rPr>
+        <w:t xml:space="preserve">, технического обслуживания, технического освидетельствования, технического диагностирования лифтов, эскалаторов, траволаторов и подъемников для инвалидов в соответствии с национальными стандартами, а также технического </w:t>
+      </w:r>
+      <w:r>
+        <w:rPr>
+          <w:rFonts w:eastAsia="Calibri"/>
+          <w:spacing w:val="1"/>
+          <w:sz w:val="28"/>
+          <w:szCs w:val="28"/>
+          <w:lang w:eastAsia="en-US"/>
         </w:rPr>
         <w:lastRenderedPageBreak/>
-        <w:t>6</w:t>
+        <w:t>освидетельствования опасных технических устройств на объектах социальной инфраструктуры;</w:t>
       </w:r>
     </w:p>
     <w:p>
       <w:pPr>
         <w:pStyle w:val="a5"/>
+        <w:numPr>
+          <w:ilvl w:val="0"/>
+          <w:numId w:val="8"/>
+        </w:numPr>
         <w:tabs>
           <w:tab w:val="left" w:pos="0"/>
           <w:tab w:val="left" w:pos="851"/>
         </w:tabs>
         <w:spacing w:before="0" w:beforeAutospacing="0" w:after="0" w:afterAutospacing="0"/>
-        <w:ind w:left="709"/>
-        <w:jc w:val="both"/>
-        <w:rPr>
-          <w:color w:val="000000"/>
-          <w:sz w:val="28"/>
-          <w:szCs w:val="28"/>
-        </w:rPr>
-      </w:pPr>
+        <w:ind w:left="0" w:firstLine="709"/>
+        <w:jc w:val="both"/>
+        <w:rPr>
+          <w:color w:val="000000"/>
+          <w:sz w:val="28"/>
+          <w:szCs w:val="28"/>
+        </w:rPr>
+      </w:pPr>
+      <w:r>
+        <w:rPr>
+          <w:sz w:val="28"/>
+          <w:szCs w:val="28"/>
+        </w:rPr>
+        <w:t>организация профилактических мероприятий, направленных на предотвращение и предупреждение аварийных ситуаций на объектах социальной инфраструктуры;</w:t>
+      </w:r>
     </w:p>
     <w:p>
       <w:pPr>
         <w:pStyle w:val="a5"/>
+        <w:numPr>
+          <w:ilvl w:val="0"/>
+          <w:numId w:val="8"/>
+        </w:numPr>
         <w:tabs>
           <w:tab w:val="left" w:pos="0"/>
           <w:tab w:val="left" w:pos="851"/>
         </w:tabs>
         <w:spacing w:before="0" w:beforeAutospacing="0" w:after="0" w:afterAutospacing="0"/>
-        <w:jc w:val="both"/>
-        <w:rPr>
-          <w:color w:val="000000"/>
-          <w:sz w:val="28"/>
-          <w:szCs w:val="28"/>
-        </w:rPr>
-      </w:pPr>
-      <w:r>
-        <w:rPr>
-          <w:rFonts w:eastAsia="Calibri"/>
-          <w:spacing w:val="1"/>
-          <w:sz w:val="28"/>
-          <w:szCs w:val="28"/>
-          <w:lang w:eastAsia="en-US"/>
-        </w:rPr>
-        <w:t>опасных производственных объектов, технических устройств, на срок не более трех дней, с обязательным предъявлением в указанный срок искового заявления в суд;</w:t>
+        <w:ind w:left="0" w:firstLine="709"/>
+        <w:jc w:val="both"/>
+        <w:rPr>
+          <w:color w:val="000000"/>
+          <w:sz w:val="28"/>
+          <w:szCs w:val="28"/>
+        </w:rPr>
+      </w:pPr>
+      <w:r>
+        <w:rPr>
+          <w:sz w:val="28"/>
+          <w:szCs w:val="28"/>
+        </w:rPr>
+        <w:t>участие в расследовании аварий опасных технических устройств совместно с заинтересованными государственными органами в пределах своей компетенции;</w:t>
       </w:r>
     </w:p>
     <w:p>
@@ -2798,33 +2920,10 @@
       </w:pPr>
       <w:r>
         <w:rPr>
-          <w:rFonts w:eastAsia="Calibri"/>
-          <w:spacing w:val="1"/>
-          <w:sz w:val="28"/>
-          <w:szCs w:val="28"/>
-          <w:lang w:eastAsia="en-US"/>
-        </w:rPr>
-        <w:t xml:space="preserve">осуществление государственного надзора за </w:t>
-      </w:r>
-      <w:r>
-        <w:rPr>
-          <w:rFonts w:eastAsia="Calibri"/>
-          <w:spacing w:val="1"/>
-          <w:sz w:val="28"/>
-          <w:szCs w:val="28"/>
-          <w:lang w:eastAsia="en-US"/>
-        </w:rPr>
-        <w:t>эксплуатацией</w:t>
-      </w:r>
-      <w:r>
-        <w:rPr>
-          <w:rFonts w:eastAsia="Calibri"/>
-          <w:spacing w:val="1"/>
-          <w:sz w:val="28"/>
-          <w:szCs w:val="28"/>
-          <w:lang w:eastAsia="en-US"/>
-        </w:rPr>
-        <w:t>, технического обслуживания, технического освидетельствования, технического диагностирования лифтов, эскалаторов, траволаторов и подъемников для инвалидов в соответствии с национальными стандартами, а также технического освидетельствования опасных технических устройств на объектах социальной инфраструктуры;</w:t>
+          <w:sz w:val="28"/>
+          <w:szCs w:val="28"/>
+        </w:rPr>
+        <w:t>проведение работ по повышению качества оказываемых государственных услуг путем оптимизации и автоматизации;</w:t>
       </w:r>
     </w:p>
     <w:p>
@@ -2852,7 +2951,21 @@
           <w:sz w:val="28"/>
           <w:szCs w:val="28"/>
         </w:rPr>
-        <w:t>организация профилактических мероприятий, направленных на предотвращение и предупреждение аварийных ситуаций на объектах социальной инфраструктуры;</w:t>
+        <w:t>оформление правоустанавливающих документов гражданам</w:t>
+      </w:r>
+      <w:r>
+        <w:rPr>
+          <w:sz w:val="28"/>
+          <w:szCs w:val="28"/>
+        </w:rPr>
+        <w:t>,</w:t>
+      </w:r>
+      <w:r>
+        <w:rPr>
+          <w:sz w:val="28"/>
+          <w:szCs w:val="28"/>
+        </w:rPr>
+        <w:t xml:space="preserve"> получившим жилье в рамках государственных жилищных программ;</w:t>
       </w:r>
     </w:p>
     <w:p>
@@ -2880,7 +2993,33 @@
           <w:sz w:val="28"/>
           <w:szCs w:val="28"/>
         </w:rPr>
-        <w:t>участие в расследовании аварий опасных технических устройств совместно с заинтересованными государственными органами в пределах своей компетенции;</w:t>
+        <w:t>обеспечение</w:t>
+      </w:r>
+      <w:r>
+        <w:rPr>
+          <w:color w:val="000000"/>
+          <w:sz w:val="28"/>
+          <w:szCs w:val="28"/>
+        </w:rPr>
+        <w:t xml:space="preserve"> соблюдения требований стандарта по государственной </w:t>
+      </w:r>
+      <w:proofErr w:type="gramStart"/>
+      <w:r>
+        <w:rPr>
+          <w:color w:val="000000"/>
+          <w:sz w:val="28"/>
+          <w:szCs w:val="28"/>
+        </w:rPr>
+        <w:t>услуге  выдача</w:t>
+      </w:r>
+      <w:proofErr w:type="gramEnd"/>
+      <w:r>
+        <w:rPr>
+          <w:color w:val="000000"/>
+          <w:sz w:val="28"/>
+          <w:szCs w:val="28"/>
+        </w:rPr>
+        <w:t xml:space="preserve"> жилищных сертификатов;</w:t>
       </w:r>
     </w:p>
     <w:p>
@@ -2905,10 +3044,29 @@
       </w:pPr>
       <w:r>
         <w:rPr>
-          <w:sz w:val="28"/>
-          <w:szCs w:val="28"/>
-        </w:rPr>
-        <w:t>проведение работ по повышению качества оказываемых государственных услуг путем оптимизации и автоматизации;</w:t>
+          <w:color w:val="000000"/>
+          <w:sz w:val="28"/>
+          <w:szCs w:val="28"/>
+        </w:rPr>
+        <w:t xml:space="preserve">осуществление мониторинга целевого использования </w:t>
+      </w:r>
+      <w:proofErr w:type="gramStart"/>
+      <w:r>
+        <w:rPr>
+          <w:color w:val="000000"/>
+          <w:sz w:val="28"/>
+          <w:szCs w:val="28"/>
+        </w:rPr>
+        <w:t>арендного  жилья</w:t>
+      </w:r>
+      <w:proofErr w:type="gramEnd"/>
+      <w:r>
+        <w:rPr>
+          <w:color w:val="000000"/>
+          <w:sz w:val="28"/>
+          <w:szCs w:val="28"/>
+        </w:rPr>
+        <w:t xml:space="preserve"> арендаторами не реже одного раза в квартал;</w:t>
       </w:r>
     </w:p>
     <w:p>
@@ -2936,21 +3094,7 @@
           <w:sz w:val="28"/>
           <w:szCs w:val="28"/>
         </w:rPr>
-        <w:t>оформление правоустанавливающих документов гражданам</w:t>
-      </w:r>
-      <w:r>
-        <w:rPr>
-          <w:sz w:val="28"/>
-          <w:szCs w:val="28"/>
-        </w:rPr>
-        <w:t>,</w:t>
-      </w:r>
-      <w:r>
-        <w:rPr>
-          <w:sz w:val="28"/>
-          <w:szCs w:val="28"/>
-        </w:rPr>
-        <w:t xml:space="preserve"> получившим жилье в рамках государственных жилищных программ;</w:t>
+        <w:t>регистрация квартир, построенных в рамках государственных жилищных программ, на баланс Управления;</w:t>
       </w:r>
     </w:p>
     <w:p>
@@ -2978,15 +3122,7 @@
           <w:sz w:val="28"/>
           <w:szCs w:val="28"/>
         </w:rPr>
-        <w:t>обеспечение</w:t>
-      </w:r>
-      <w:r>
-        <w:rPr>
-          <w:color w:val="000000"/>
-          <w:sz w:val="28"/>
-          <w:szCs w:val="28"/>
-        </w:rPr>
-        <w:t xml:space="preserve"> соблюдения требований стандарта по государственной услуге  выдача жилищных сертификатов;</w:t>
+        <w:t>осуществление выдачи направлений для проверки банковской квалификации в финансовые организации;</w:t>
       </w:r>
     </w:p>
     <w:p>
@@ -3011,11 +3147,10 @@
       </w:pPr>
       <w:r>
         <w:rPr>
-          <w:color w:val="000000"/>
-          <w:sz w:val="28"/>
-          <w:szCs w:val="28"/>
-        </w:rPr>
-        <w:t>осуществление мониторинга целевого использования арендного  жилья арендаторами не реже одного раза в квартал;</w:t>
+          <w:sz w:val="28"/>
+          <w:szCs w:val="28"/>
+        </w:rPr>
+        <w:t>предоставление в установленном порядке интересы Управления в суде, а также в государственных органах, государственных и общественных организациях при рассмотрении правовых вопросов деятельности Управления;</w:t>
       </w:r>
     </w:p>
     <w:p>
@@ -3043,7 +3178,23 @@
           <w:sz w:val="28"/>
           <w:szCs w:val="28"/>
         </w:rPr>
-        <w:t>регистрация квартир, построенных в рамках государственных жилищных программ, на баланс Управления;</w:t>
+        <w:t xml:space="preserve">осуществление передачи в собственность гражданам Республики Казахстан жилищ из коммунального жилищного фонда на условиях, предусмотренных законом Республики </w:t>
+      </w:r>
+      <w:proofErr w:type="gramStart"/>
+      <w:r>
+        <w:rPr>
+          <w:sz w:val="28"/>
+          <w:szCs w:val="28"/>
+        </w:rPr>
+        <w:t>Казахстан  «</w:t>
+      </w:r>
+      <w:proofErr w:type="gramEnd"/>
+      <w:r>
+        <w:rPr>
+          <w:sz w:val="28"/>
+          <w:szCs w:val="28"/>
+        </w:rPr>
+        <w:t>О жилищных отношениях», и в порядке, определяемом Правительством Республики Казахстан;</w:t>
       </w:r>
     </w:p>
     <w:p>
@@ -3071,7 +3222,7 @@
           <w:sz w:val="28"/>
           <w:szCs w:val="28"/>
         </w:rPr>
-        <w:t>осуществление выдачи направлений для проверки банковской квалификации в финансовые организации;</w:t>
+        <w:t>оформление договора найма на жилище из государственного жилищного фонда;</w:t>
       </w:r>
     </w:p>
     <w:p>
@@ -3099,7 +3250,7 @@
           <w:sz w:val="28"/>
           <w:szCs w:val="28"/>
         </w:rPr>
-        <w:t>предоставление в установленном порядке интересы Управления в суде, а также в государственных органах, государственных и общественных организациях при рассмотрении правовых вопросов деятельности Управления;</w:t>
+        <w:t>оказание государственной услуги «приватизация жилищ из государственного жилищного фонда»;</w:t>
       </w:r>
     </w:p>
     <w:p>
@@ -3127,7 +3278,7 @@
           <w:sz w:val="28"/>
           <w:szCs w:val="28"/>
         </w:rPr>
-        <w:t>осуществление передачи в собственность гражданам Республики Казахстан жилищ из коммунального жилищного фонда на условиях, предусмотренных законом Республики Казахстан  «О жилищных отношениях», и в порядке, определяемом Правительством Республики Казахстан;</w:t>
+        <w:t>организация технического обследования многоквартирного жилого дома;</w:t>
       </w:r>
     </w:p>
     <w:p>
@@ -3155,131 +3306,8 @@
           <w:sz w:val="28"/>
           <w:szCs w:val="28"/>
         </w:rPr>
-        <w:t>оформление договора найма на жилище из государственного жилищного фонда;</w:t>
-      </w:r>
-    </w:p>
-    <w:p>
-      <w:pPr>
-        <w:pStyle w:val="a5"/>
-        <w:numPr>
-          <w:ilvl w:val="0"/>
-          <w:numId w:val="8"/>
-        </w:numPr>
-        <w:tabs>
-          <w:tab w:val="left" w:pos="0"/>
-          <w:tab w:val="left" w:pos="851"/>
-        </w:tabs>
-        <w:spacing w:before="0" w:beforeAutospacing="0" w:after="0" w:afterAutospacing="0"/>
-        <w:ind w:left="0" w:firstLine="709"/>
-        <w:jc w:val="both"/>
-        <w:rPr>
-          <w:color w:val="000000"/>
-          <w:sz w:val="28"/>
-          <w:szCs w:val="28"/>
-        </w:rPr>
-      </w:pPr>
-      <w:r>
-        <w:rPr>
-          <w:sz w:val="28"/>
-          <w:szCs w:val="28"/>
-        </w:rPr>
-        <w:t>оказание государственной услуги «приватизация жилищ из государственного жилищного фонда»;</w:t>
-      </w:r>
-    </w:p>
-    <w:p>
-      <w:pPr>
-        <w:pStyle w:val="a5"/>
-        <w:numPr>
-          <w:ilvl w:val="0"/>
-          <w:numId w:val="8"/>
-        </w:numPr>
-        <w:tabs>
-          <w:tab w:val="left" w:pos="0"/>
-          <w:tab w:val="left" w:pos="851"/>
-        </w:tabs>
-        <w:spacing w:before="0" w:beforeAutospacing="0" w:after="0" w:afterAutospacing="0"/>
-        <w:ind w:left="0" w:firstLine="709"/>
-        <w:jc w:val="both"/>
-        <w:rPr>
-          <w:color w:val="000000"/>
-          <w:sz w:val="28"/>
-          <w:szCs w:val="28"/>
-        </w:rPr>
-      </w:pPr>
-      <w:r>
-        <w:rPr>
-          <w:sz w:val="28"/>
-          <w:szCs w:val="28"/>
-        </w:rPr>
-        <w:t>организация технического обследования многоквартирного жилого дома;</w:t>
-      </w:r>
-    </w:p>
-    <w:p>
-      <w:pPr>
-        <w:pStyle w:val="a5"/>
-        <w:numPr>
-          <w:ilvl w:val="0"/>
-          <w:numId w:val="8"/>
-        </w:numPr>
-        <w:tabs>
-          <w:tab w:val="left" w:pos="0"/>
-          <w:tab w:val="left" w:pos="851"/>
-        </w:tabs>
-        <w:spacing w:before="0" w:beforeAutospacing="0" w:after="0" w:afterAutospacing="0"/>
-        <w:ind w:left="0" w:firstLine="709"/>
-        <w:jc w:val="both"/>
-        <w:rPr>
-          <w:color w:val="000000"/>
-          <w:sz w:val="28"/>
-          <w:szCs w:val="28"/>
-        </w:rPr>
-      </w:pPr>
-      <w:r>
-        <w:rPr>
-          <w:sz w:val="28"/>
-          <w:szCs w:val="28"/>
-        </w:rPr>
         <w:t>определение перечня, периодов и очередности проведения отдельных видов капитального ремонта общего имущества объекта кондоминиума;</w:t>
       </w:r>
-    </w:p>
-    <w:p>
-      <w:pPr>
-        <w:pStyle w:val="a5"/>
-        <w:tabs>
-          <w:tab w:val="left" w:pos="0"/>
-          <w:tab w:val="left" w:pos="851"/>
-        </w:tabs>
-        <w:spacing w:before="0" w:beforeAutospacing="0" w:after="0" w:afterAutospacing="0"/>
-        <w:ind w:left="709" w:hanging="709"/>
-        <w:jc w:val="center"/>
-        <w:rPr>
-          <w:color w:val="000000"/>
-        </w:rPr>
-      </w:pPr>
-      <w:r>
-        <w:rPr>
-          <w:color w:val="000000"/>
-        </w:rPr>
-        <w:lastRenderedPageBreak/>
-        <w:t>7</w:t>
-      </w:r>
-    </w:p>
-    <w:p>
-      <w:pPr>
-        <w:pStyle w:val="a5"/>
-        <w:tabs>
-          <w:tab w:val="left" w:pos="0"/>
-          <w:tab w:val="left" w:pos="851"/>
-        </w:tabs>
-        <w:spacing w:before="0" w:beforeAutospacing="0" w:after="0" w:afterAutospacing="0"/>
-        <w:ind w:left="709" w:hanging="709"/>
-        <w:jc w:val="center"/>
-        <w:rPr>
-          <w:color w:val="000000"/>
-          <w:sz w:val="28"/>
-          <w:szCs w:val="28"/>
-        </w:rPr>
-      </w:pPr>
     </w:p>
     <w:p>
       <w:pPr>
@@ -3440,6 +3468,7 @@
           <w:sz w:val="28"/>
           <w:szCs w:val="28"/>
         </w:rPr>
+        <w:lastRenderedPageBreak/>
         <w:t>квартир, нежилых помещений в объекте кондоминиума и территорий прилегающей к объекту кондоминиума;</w:t>
       </w:r>
     </w:p>
@@ -3685,7 +3714,23 @@
           <w:sz w:val="28"/>
           <w:szCs w:val="28"/>
         </w:rPr>
-        <w:t>осуществление производств по делам об административных правонарушениях в сфере жилищных отношений и безопасной технической эксплуатации опасных технических устройств, газопотребляющих систем и газового оборудования на объектах жилищно-коммунального хозяйства</w:t>
+        <w:t xml:space="preserve">осуществление производств по делам об административных правонарушениях в сфере жилищных отношений и безопасной технической эксплуатации опасных технических устройств, </w:t>
+      </w:r>
+      <w:proofErr w:type="spellStart"/>
+      <w:r>
+        <w:rPr>
+          <w:sz w:val="28"/>
+          <w:szCs w:val="28"/>
+        </w:rPr>
+        <w:t>газопотребляющих</w:t>
+      </w:r>
+      <w:proofErr w:type="spellEnd"/>
+      <w:r>
+        <w:rPr>
+          <w:sz w:val="28"/>
+          <w:szCs w:val="28"/>
+        </w:rPr>
+        <w:t xml:space="preserve"> систем и газового оборудования на объектах жилищно-коммунального хозяйства</w:t>
       </w:r>
       <w:r>
         <w:rPr>
@@ -3797,57 +3842,100 @@
     <w:p>
       <w:pPr>
         <w:pStyle w:val="a5"/>
+        <w:numPr>
+          <w:ilvl w:val="0"/>
+          <w:numId w:val="8"/>
+        </w:numPr>
         <w:tabs>
           <w:tab w:val="left" w:pos="0"/>
           <w:tab w:val="left" w:pos="851"/>
         </w:tabs>
         <w:spacing w:before="0" w:beforeAutospacing="0" w:after="0" w:afterAutospacing="0"/>
-        <w:ind w:left="709"/>
-        <w:jc w:val="both"/>
-        <w:rPr>
-          <w:sz w:val="28"/>
-          <w:szCs w:val="28"/>
-        </w:rPr>
-      </w:pPr>
+        <w:ind w:left="0" w:firstLine="709"/>
+        <w:jc w:val="both"/>
+        <w:rPr>
+          <w:color w:val="000000"/>
+          <w:sz w:val="28"/>
+          <w:szCs w:val="28"/>
+        </w:rPr>
+      </w:pPr>
+      <w:r>
+        <w:rPr>
+          <w:sz w:val="28"/>
+          <w:szCs w:val="28"/>
+        </w:rPr>
+        <w:t>осуществление мониторинга и координации работ городских служб благоустройства по санитарной очистке улично-дорожной сети для безопасного проживания и жизнедеятельности человека на территории города, в пределах действующего законодательства и компетенции;</w:t>
+      </w:r>
     </w:p>
     <w:p>
       <w:pPr>
         <w:pStyle w:val="a5"/>
+        <w:numPr>
+          <w:ilvl w:val="0"/>
+          <w:numId w:val="8"/>
+        </w:numPr>
         <w:tabs>
           <w:tab w:val="left" w:pos="0"/>
           <w:tab w:val="left" w:pos="851"/>
         </w:tabs>
         <w:spacing w:before="0" w:beforeAutospacing="0" w:after="0" w:afterAutospacing="0"/>
-        <w:ind w:left="709" w:hanging="709"/>
-        <w:jc w:val="center"/>
-        <w:rPr>
-          <w:color w:val="000000"/>
-        </w:rPr>
-      </w:pPr>
-      <w:r>
-        <w:rPr>
-          <w:color w:val="000000"/>
-        </w:rPr>
-        <w:lastRenderedPageBreak/>
-        <w:t>8</w:t>
+        <w:ind w:left="0" w:firstLine="709"/>
+        <w:jc w:val="both"/>
+        <w:rPr>
+          <w:color w:val="000000"/>
+          <w:sz w:val="28"/>
+          <w:szCs w:val="28"/>
+        </w:rPr>
+      </w:pPr>
+      <w:r>
+        <w:rPr>
+          <w:sz w:val="28"/>
+          <w:szCs w:val="28"/>
+        </w:rPr>
+        <w:t>координация и содействие организациям, осуществляющим уборку и соответствующее санитарное состояние городских территорий;</w:t>
       </w:r>
     </w:p>
     <w:p>
       <w:pPr>
         <w:pStyle w:val="a5"/>
+        <w:numPr>
+          <w:ilvl w:val="0"/>
+          <w:numId w:val="8"/>
+        </w:numPr>
         <w:tabs>
           <w:tab w:val="left" w:pos="0"/>
           <w:tab w:val="left" w:pos="851"/>
         </w:tabs>
         <w:spacing w:before="0" w:beforeAutospacing="0" w:after="0" w:afterAutospacing="0"/>
-        <w:ind w:left="709"/>
-        <w:jc w:val="both"/>
-        <w:rPr>
-          <w:color w:val="000000"/>
-          <w:sz w:val="28"/>
-          <w:szCs w:val="28"/>
-        </w:rPr>
-      </w:pPr>
+        <w:ind w:left="0" w:firstLine="709"/>
+        <w:jc w:val="both"/>
+        <w:rPr>
+          <w:color w:val="000000"/>
+          <w:sz w:val="28"/>
+          <w:szCs w:val="28"/>
+        </w:rPr>
+      </w:pPr>
+      <w:r>
+        <w:rPr>
+          <w:sz w:val="28"/>
+          <w:szCs w:val="28"/>
+        </w:rPr>
+        <w:t>осуществление координации в пределах своей компетенции работы аппаратов акимов р</w:t>
+      </w:r>
+      <w:r>
+        <w:rPr>
+          <w:sz w:val="28"/>
+          <w:szCs w:val="28"/>
+        </w:rPr>
+        <w:t>айоно</w:t>
+      </w:r>
+      <w:r>
+        <w:rPr>
+          <w:sz w:val="28"/>
+          <w:szCs w:val="28"/>
+        </w:rPr>
+        <w:t>в, физических и юридических лиц за ходом выполнения работ по санитарной очистке территории города;</w:t>
+      </w:r>
     </w:p>
     <w:p>
       <w:pPr>
@@ -3874,7 +3962,7 @@
           <w:sz w:val="28"/>
           <w:szCs w:val="28"/>
         </w:rPr>
-        <w:t>осуществление мониторинга и координации работ городских служб благоустройства по санитарной очистке улично-дорожной сети для безопасного проживания и жизнедеятельности человека на территории города, в пределах действующего законодательства и компетенции;</w:t>
+        <w:t>мониторинг за деятельностью аппаратов акимов районов и подрядных организаций по санитарной очистке городских территорий;</w:t>
       </w:r>
     </w:p>
     <w:p>
@@ -3902,7 +3990,8 @@
           <w:sz w:val="28"/>
           <w:szCs w:val="28"/>
         </w:rPr>
-        <w:t>координация и содействие организациям, осуществляющим уборку и соответствующее санитарное состояние городских территорий;</w:t>
+        <w:lastRenderedPageBreak/>
+        <w:t>осуществление мониторинга намечаемых к строительству (реконструкции, расширению, модернизации и капитальному ремонту) объектов на подведомственной территории объектов и комплексов;</w:t>
       </w:r>
     </w:p>
     <w:p>
@@ -3930,21 +4019,7 @@
           <w:sz w:val="28"/>
           <w:szCs w:val="28"/>
         </w:rPr>
-        <w:t>осуществление координации в пределах своей компетенции работы аппаратов акимов р</w:t>
-      </w:r>
-      <w:r>
-        <w:rPr>
-          <w:sz w:val="28"/>
-          <w:szCs w:val="28"/>
-        </w:rPr>
-        <w:t>айоно</w:t>
-      </w:r>
-      <w:r>
-        <w:rPr>
-          <w:sz w:val="28"/>
-          <w:szCs w:val="28"/>
-        </w:rPr>
-        <w:t>в, физических и юридических лиц за ходом выполнения работ по санитарной очистке территории города;</w:t>
+        <w:t>создание комфортной и безопасной среды для проживания и жизнедеятельности населения на территории города;</w:t>
       </w:r>
     </w:p>
     <w:p>
@@ -3972,7 +4047,7 @@
           <w:sz w:val="28"/>
           <w:szCs w:val="28"/>
         </w:rPr>
-        <w:t>мониторинг за деятельностью аппаратов акимов районов и подрядных организаций по санитарной очистке городских территорий;</w:t>
+        <w:t>организация и проведение общегородских субботников и сезонных (весенне-осенних) мероприятий по санитарной очистке и благоустройству;</w:t>
       </w:r>
     </w:p>
     <w:p>
@@ -4000,7 +4075,7 @@
           <w:sz w:val="28"/>
           <w:szCs w:val="28"/>
         </w:rPr>
-        <w:t>осуществление мониторинга намечаемых к строительству (реконструкции, расширению, модернизации и капитальному ремонту) объектов на подведомственной территории объектов и комплексов;</w:t>
+        <w:t>подготовка планов и документации по обновлению парка специализированной коммунальной уборочной техники;</w:t>
       </w:r>
     </w:p>
     <w:p>
@@ -4028,7 +4103,7 @@
           <w:sz w:val="28"/>
           <w:szCs w:val="28"/>
         </w:rPr>
-        <w:t>создание комфортной и безопасной среды для проживания и жизнедеятельности населения на территории города;</w:t>
+        <w:t>представление интересов Управления и местного исполнительного органа в судебных органах в порядке, предусмотренном процессуальным законодательством, с правом подачи исков в судебные органы в целях защиты нарушенных прав государства и граждан;</w:t>
       </w:r>
     </w:p>
     <w:p>
@@ -4056,7 +4131,7 @@
           <w:sz w:val="28"/>
           <w:szCs w:val="28"/>
         </w:rPr>
-        <w:t>организация и проведение общегородских субботников и сезонных (весенне-осенних) мероприятий по санитарной очистке и благоустройству;</w:t>
+        <w:t>подготовка материалов акиму города Алматы по вопросам, входящим в компетенцию Управления;</w:t>
       </w:r>
     </w:p>
     <w:p>
@@ -4084,7 +4159,7 @@
           <w:sz w:val="28"/>
           <w:szCs w:val="28"/>
         </w:rPr>
-        <w:t>подготовка планов и документации по обновлению парка специализированной коммунальной уборочной техники;</w:t>
+        <w:t>в соответствии со статьей 1083 Гражданского Кодекса Республики Казахстан обращаться с иском в судебные органы по признанию имущества (жилые помещения) выморочным;</w:t>
       </w:r>
     </w:p>
     <w:p>
@@ -4112,7 +4187,7 @@
           <w:sz w:val="28"/>
           <w:szCs w:val="28"/>
         </w:rPr>
-        <w:t>представление интересов Управления и местного исполнительного органа в судебных органах в порядке, предусмотренном процессуальным законодательством, с правом подачи исков в судебные органы в целях защиты нарушенных прав государства и граждан;</w:t>
+        <w:t>подача заявлений о принятии на учет бесхозяйных недвижимых имуществ (жилых помещений) в орган, осуществляющий государственную регистрацию прав на недвижимое имущество в соответствии со статьей 242 Гражданского Кодекса Республики Казахстан;</w:t>
       </w:r>
     </w:p>
     <w:p>
@@ -4140,7 +4215,7 @@
           <w:sz w:val="28"/>
           <w:szCs w:val="28"/>
         </w:rPr>
-        <w:t>подготовка материалов акиму города Алматы по вопросам, входящим в компетенцию Управления;</w:t>
+        <w:t>по решению местного исполнительного органа выступает участником товариществ с ограниченной ответственностью;</w:t>
       </w:r>
     </w:p>
     <w:p>
@@ -4168,7 +4243,7 @@
           <w:sz w:val="28"/>
           <w:szCs w:val="28"/>
         </w:rPr>
-        <w:t>в соответствии со статьей 1083 Гражданского Кодекса Республики Казахстан обращаться с иском в судебные органы по признанию имущества (жилые помещения) выморочным;</w:t>
+        <w:t>осуществление от лица местного исполнительного органа права на участие государства как участника в управлении товариществом с ограниченной ответственностью;</w:t>
       </w:r>
     </w:p>
     <w:p>
@@ -4196,7 +4271,7 @@
           <w:sz w:val="28"/>
           <w:szCs w:val="28"/>
         </w:rPr>
-        <w:t>подача заявлений о принятии на учет бесхозяйных недвижимых имуществ (жилых помещений) в орган, осуществляющий государственную регистрацию прав на недвижимое имущество в соответствии со статьей 242 Гражданского Кодекса Республики Казахстан;</w:t>
+        <w:t>организация и проведение мониторинга функционирования и эффективности управления товариществами с ограниченной ответственностью с участием государства;</w:t>
       </w:r>
     </w:p>
     <w:p>
@@ -4224,7 +4299,133 @@
           <w:sz w:val="28"/>
           <w:szCs w:val="28"/>
         </w:rPr>
-        <w:t>по решению местного исполнительного органа выступает участником товариществ с ограниченной ответственностью;</w:t>
+        <w:t>своевременное принятие решения о распределении полученного товариществом</w:t>
+      </w:r>
+      <w:r>
+        <w:rPr>
+          <w:sz w:val="28"/>
+          <w:szCs w:val="28"/>
+        </w:rPr>
+        <w:t xml:space="preserve">   </w:t>
+      </w:r>
+      <w:r>
+        <w:rPr>
+          <w:sz w:val="28"/>
+          <w:szCs w:val="28"/>
+        </w:rPr>
+        <w:t xml:space="preserve"> с</w:t>
+      </w:r>
+      <w:r>
+        <w:rPr>
+          <w:sz w:val="28"/>
+          <w:szCs w:val="28"/>
+        </w:rPr>
+        <w:t xml:space="preserve">  </w:t>
+      </w:r>
+      <w:r>
+        <w:rPr>
+          <w:sz w:val="28"/>
+          <w:szCs w:val="28"/>
+        </w:rPr>
+        <w:t xml:space="preserve"> </w:t>
+      </w:r>
+      <w:r>
+        <w:rPr>
+          <w:sz w:val="28"/>
+          <w:szCs w:val="28"/>
+        </w:rPr>
+        <w:t xml:space="preserve"> </w:t>
+      </w:r>
+      <w:r>
+        <w:rPr>
+          <w:sz w:val="28"/>
+          <w:szCs w:val="28"/>
+        </w:rPr>
+        <w:t>ограниченной</w:t>
+      </w:r>
+      <w:r>
+        <w:rPr>
+          <w:sz w:val="28"/>
+          <w:szCs w:val="28"/>
+        </w:rPr>
+        <w:t xml:space="preserve"> </w:t>
+      </w:r>
+      <w:r>
+        <w:rPr>
+          <w:sz w:val="28"/>
+          <w:szCs w:val="28"/>
+        </w:rPr>
+        <w:t xml:space="preserve"> </w:t>
+      </w:r>
+      <w:r>
+        <w:rPr>
+          <w:sz w:val="28"/>
+          <w:szCs w:val="28"/>
+        </w:rPr>
+        <w:t xml:space="preserve">  </w:t>
+      </w:r>
+      <w:r>
+        <w:rPr>
+          <w:sz w:val="28"/>
+          <w:szCs w:val="28"/>
+        </w:rPr>
+        <w:t xml:space="preserve">ответственностью </w:t>
+      </w:r>
+      <w:r>
+        <w:rPr>
+          <w:sz w:val="28"/>
+          <w:szCs w:val="28"/>
+        </w:rPr>
+        <w:t xml:space="preserve">   </w:t>
+      </w:r>
+      <w:r>
+        <w:rPr>
+          <w:sz w:val="28"/>
+          <w:szCs w:val="28"/>
+        </w:rPr>
+        <w:t xml:space="preserve">чистого </w:t>
+      </w:r>
+      <w:r>
+        <w:rPr>
+          <w:sz w:val="28"/>
+          <w:szCs w:val="28"/>
+        </w:rPr>
+        <w:t xml:space="preserve">   </w:t>
+      </w:r>
+      <w:r>
+        <w:rPr>
+          <w:sz w:val="28"/>
+          <w:szCs w:val="28"/>
+        </w:rPr>
+        <w:t>дохода</w:t>
+      </w:r>
+      <w:r>
+        <w:rPr>
+          <w:sz w:val="28"/>
+          <w:szCs w:val="28"/>
+        </w:rPr>
+        <w:t xml:space="preserve">    </w:t>
+      </w:r>
+      <w:r>
+        <w:rPr>
+          <w:sz w:val="28"/>
+          <w:szCs w:val="28"/>
+        </w:rPr>
+        <w:t>и</w:t>
+      </w:r>
+      <w:r>
+        <w:rPr>
+          <w:sz w:val="28"/>
+          <w:szCs w:val="28"/>
+        </w:rPr>
+        <w:t xml:space="preserve"> </w:t>
+      </w:r>
+      <w:r>
+        <w:rPr>
+          <w:sz w:val="28"/>
+          <w:szCs w:val="28"/>
+        </w:rPr>
+        <w:t>перечисление товариществом с ограниченной ответственностью дивидендов (части чистого дохода товарищества с ограниченной ответственностью) на принадлежащие государству доли участия в уставном капитале товарищества с ограниченной ответственностью в течение десяти дней с даты принятия решения единственного участника;</w:t>
       </w:r>
     </w:p>
     <w:p>
@@ -4252,7 +4453,7 @@
           <w:sz w:val="28"/>
           <w:szCs w:val="28"/>
         </w:rPr>
-        <w:t>осуществление от лица местного исполнительного органа права на участие государства как участника в управлении товариществом с ограниченной ответственностью;</w:t>
+        <w:t>при проведении годовых общих собраний участников принятие мер для направления части чистого дохода товарищества с ограниченной ответственностью на выплату дивидендов (дохода) в размерах, установленных местным исполнительным органом;</w:t>
       </w:r>
     </w:p>
     <w:p>
@@ -4280,7 +4481,15 @@
           <w:sz w:val="28"/>
           <w:szCs w:val="28"/>
         </w:rPr>
-        <w:t>организация и проведение мониторинга функционирования и эффективности управления товариществами с ограниченной ответственностью с участием государства;</w:t>
+        <w:t xml:space="preserve">по решению местного исполнительного органа осуществляет внесение вклада в уставный капитал товариществ с ограниченной ответственностью путем внесения денег в соответствии с Бюджетным кодексом </w:t>
+      </w:r>
+      <w:r>
+        <w:rPr>
+          <w:sz w:val="28"/>
+          <w:szCs w:val="28"/>
+        </w:rPr>
+        <w:lastRenderedPageBreak/>
+        <w:t>Республики Казахстан, а также коммунального имущества, в том числе долей участия в уставном капитале товариществ с ограниченной ответственностью;</w:t>
       </w:r>
     </w:p>
     <w:p>
@@ -4308,263 +4517,21 @@
           <w:sz w:val="28"/>
           <w:szCs w:val="28"/>
         </w:rPr>
-        <w:t>своевременное принятие решения о распределении полученного товариществом</w:t>
-      </w:r>
-      <w:r>
-        <w:rPr>
-          <w:sz w:val="28"/>
-          <w:szCs w:val="28"/>
-        </w:rPr>
-        <w:t xml:space="preserve">   </w:t>
-      </w:r>
-      <w:r>
-        <w:rPr>
-          <w:sz w:val="28"/>
-          <w:szCs w:val="28"/>
-        </w:rPr>
-        <w:t xml:space="preserve"> с</w:t>
-      </w:r>
-      <w:r>
-        <w:rPr>
-          <w:sz w:val="28"/>
-          <w:szCs w:val="28"/>
-        </w:rPr>
-        <w:t xml:space="preserve">  </w:t>
-      </w:r>
-      <w:r>
-        <w:rPr>
-          <w:sz w:val="28"/>
-          <w:szCs w:val="28"/>
-        </w:rPr>
-        <w:t xml:space="preserve"> </w:t>
-      </w:r>
-      <w:r>
-        <w:rPr>
-          <w:sz w:val="28"/>
-          <w:szCs w:val="28"/>
-        </w:rPr>
-        <w:t xml:space="preserve"> </w:t>
-      </w:r>
-      <w:r>
-        <w:rPr>
-          <w:sz w:val="28"/>
-          <w:szCs w:val="28"/>
-        </w:rPr>
-        <w:t>ограниченной</w:t>
-      </w:r>
-      <w:r>
-        <w:rPr>
-          <w:sz w:val="28"/>
-          <w:szCs w:val="28"/>
-        </w:rPr>
-        <w:t xml:space="preserve"> </w:t>
-      </w:r>
-      <w:r>
-        <w:rPr>
-          <w:sz w:val="28"/>
-          <w:szCs w:val="28"/>
-        </w:rPr>
-        <w:t xml:space="preserve"> </w:t>
-      </w:r>
-      <w:r>
-        <w:rPr>
-          <w:sz w:val="28"/>
-          <w:szCs w:val="28"/>
-        </w:rPr>
-        <w:t xml:space="preserve">  </w:t>
-      </w:r>
-      <w:r>
-        <w:rPr>
-          <w:sz w:val="28"/>
-          <w:szCs w:val="28"/>
-        </w:rPr>
-        <w:t xml:space="preserve">ответственностью </w:t>
-      </w:r>
-      <w:r>
-        <w:rPr>
-          <w:sz w:val="28"/>
-          <w:szCs w:val="28"/>
-        </w:rPr>
-        <w:t xml:space="preserve">   </w:t>
-      </w:r>
-      <w:r>
-        <w:rPr>
-          <w:sz w:val="28"/>
-          <w:szCs w:val="28"/>
-        </w:rPr>
-        <w:t xml:space="preserve">чистого </w:t>
-      </w:r>
-      <w:r>
-        <w:rPr>
-          <w:sz w:val="28"/>
-          <w:szCs w:val="28"/>
-        </w:rPr>
-        <w:t xml:space="preserve">   </w:t>
-      </w:r>
-      <w:r>
-        <w:rPr>
-          <w:sz w:val="28"/>
-          <w:szCs w:val="28"/>
-        </w:rPr>
-        <w:t>дохода</w:t>
-      </w:r>
-      <w:r>
-        <w:rPr>
-          <w:sz w:val="28"/>
-          <w:szCs w:val="28"/>
-        </w:rPr>
-        <w:t xml:space="preserve">    </w:t>
-      </w:r>
-      <w:r>
-        <w:rPr>
-          <w:sz w:val="28"/>
-          <w:szCs w:val="28"/>
-        </w:rPr>
-        <w:t xml:space="preserve">и </w:t>
-      </w:r>
-    </w:p>
-    <w:p>
-      <w:pPr>
-        <w:tabs>
-          <w:tab w:val="left" w:pos="4303"/>
-        </w:tabs>
-        <w:ind w:left="855" w:hanging="855"/>
-        <w:jc w:val="center"/>
-        <w:rPr>
-          <w:rFonts w:ascii="Times New Roman" w:hAnsi="Times New Roman" w:cs="Times New Roman"/>
-          <w:sz w:val="24"/>
-          <w:szCs w:val="24"/>
-        </w:rPr>
-      </w:pPr>
-      <w:r>
-        <w:rPr>
-          <w:rFonts w:ascii="Times New Roman" w:hAnsi="Times New Roman" w:cs="Times New Roman"/>
-          <w:sz w:val="24"/>
-          <w:szCs w:val="24"/>
-        </w:rPr>
-        <w:lastRenderedPageBreak/>
-        <w:t>9</w:t>
+        <w:t>предложение общему собранию участников товариществ с ограниченной ответственностью кандидатуры для избрания в совет директоров (наблюдательный совет) товариществ с ограниченной ответственностью и формирование с местным исполнительным органом состава директоров (наблюдательного совета) товариществ с ограниченной ответственностью, в которых единственным участником является государство;</w:t>
       </w:r>
     </w:p>
     <w:p>
       <w:pPr>
         <w:pStyle w:val="a5"/>
+        <w:numPr>
+          <w:ilvl w:val="0"/>
+          <w:numId w:val="8"/>
+        </w:numPr>
         <w:tabs>
           <w:tab w:val="left" w:pos="0"/>
           <w:tab w:val="left" w:pos="851"/>
         </w:tabs>
         <w:spacing w:before="0" w:beforeAutospacing="0" w:after="0" w:afterAutospacing="0"/>
-        <w:jc w:val="both"/>
-        <w:rPr>
-          <w:color w:val="000000"/>
-          <w:sz w:val="28"/>
-          <w:szCs w:val="28"/>
-        </w:rPr>
-      </w:pPr>
-      <w:r>
-        <w:rPr>
-          <w:sz w:val="28"/>
-          <w:szCs w:val="28"/>
-        </w:rPr>
-        <w:t>перечисление товариществом с ограниченной ответственностью дивидендов (части чистого дохода товарищества с ограниченной ответственностью) на принадлежащие государству доли участия в уставном капитале товарищества с ограниченной ответственностью в течение десяти дней с даты принятия решения единственного участника;</w:t>
-      </w:r>
-    </w:p>
-    <w:p>
-      <w:pPr>
-        <w:pStyle w:val="a5"/>
-        <w:numPr>
-          <w:ilvl w:val="0"/>
-          <w:numId w:val="8"/>
-        </w:numPr>
-        <w:tabs>
-          <w:tab w:val="left" w:pos="0"/>
-          <w:tab w:val="left" w:pos="851"/>
-        </w:tabs>
-        <w:spacing w:before="0" w:beforeAutospacing="0" w:after="0" w:afterAutospacing="0"/>
-        <w:ind w:left="0" w:firstLine="709"/>
-        <w:jc w:val="both"/>
-        <w:rPr>
-          <w:color w:val="000000"/>
-          <w:sz w:val="28"/>
-          <w:szCs w:val="28"/>
-        </w:rPr>
-      </w:pPr>
-      <w:r>
-        <w:rPr>
-          <w:sz w:val="28"/>
-          <w:szCs w:val="28"/>
-        </w:rPr>
-        <w:t>при проведении годовых общих собраний участников принятие мер для направления части чистого дохода товарищества с ограниченной ответственностью на выплату дивидендов (дохода) в размерах, установленных местным исполнительным органом;</w:t>
-      </w:r>
-    </w:p>
-    <w:p>
-      <w:pPr>
-        <w:pStyle w:val="a5"/>
-        <w:numPr>
-          <w:ilvl w:val="0"/>
-          <w:numId w:val="8"/>
-        </w:numPr>
-        <w:tabs>
-          <w:tab w:val="left" w:pos="0"/>
-          <w:tab w:val="left" w:pos="851"/>
-        </w:tabs>
-        <w:spacing w:before="0" w:beforeAutospacing="0" w:after="0" w:afterAutospacing="0"/>
-        <w:ind w:left="0" w:firstLine="709"/>
-        <w:jc w:val="both"/>
-        <w:rPr>
-          <w:color w:val="000000"/>
-          <w:sz w:val="28"/>
-          <w:szCs w:val="28"/>
-        </w:rPr>
-      </w:pPr>
-      <w:r>
-        <w:rPr>
-          <w:sz w:val="28"/>
-          <w:szCs w:val="28"/>
-        </w:rPr>
-        <w:t>по решению местного исполнительного органа осуществляет внесение вклада в уставный капитал товариществ с ограниченной ответственностью путем внесения денег в соответствии с Бюджетным кодексом Республики Казахстан, а также коммунального имущества, в том числе долей участия в уставном капитале товариществ с ограниченной ответственностью;</w:t>
-      </w:r>
-    </w:p>
-    <w:p>
-      <w:pPr>
-        <w:pStyle w:val="a5"/>
-        <w:numPr>
-          <w:ilvl w:val="0"/>
-          <w:numId w:val="8"/>
-        </w:numPr>
-        <w:tabs>
-          <w:tab w:val="left" w:pos="0"/>
-          <w:tab w:val="left" w:pos="851"/>
-        </w:tabs>
-        <w:spacing w:before="0" w:beforeAutospacing="0" w:after="0" w:afterAutospacing="0"/>
-        <w:ind w:left="0" w:firstLine="709"/>
-        <w:jc w:val="both"/>
-        <w:rPr>
-          <w:color w:val="000000"/>
-          <w:sz w:val="28"/>
-          <w:szCs w:val="28"/>
-        </w:rPr>
-      </w:pPr>
-      <w:r>
-        <w:rPr>
-          <w:sz w:val="28"/>
-          <w:szCs w:val="28"/>
-        </w:rPr>
-        <w:t>предложение общему собранию участников товариществ с ограниченной ответственностью кандидатуры для избрания в совет директоров (наблюдательный совет) товариществ с ограниченной ответственностью и формирование с местным исполнительным органом состава директоров (наблюдательного совета) товариществ с ограниченной ответственностью, в которых единственным участником является государство;</w:t>
-      </w:r>
-    </w:p>
-    <w:p>
-      <w:pPr>
-        <w:pStyle w:val="a5"/>
-        <w:numPr>
-          <w:ilvl w:val="0"/>
-          <w:numId w:val="8"/>
-        </w:numPr>
-        <w:tabs>
-          <w:tab w:val="left" w:pos="0"/>
-          <w:tab w:val="left" w:pos="851"/>
-        </w:tabs>
-        <w:spacing w:before="0" w:beforeAutospacing="0" w:after="0" w:afterAutospacing="0"/>
         <w:ind w:left="0" w:firstLine="709"/>
         <w:jc w:val="both"/>
         <w:rPr>
@@ -4624,8 +4591,19 @@
           <w:sz w:val="28"/>
           <w:szCs w:val="28"/>
         </w:rPr>
-        <w:t>Статус, полномочия первого руководителя  Управления</w:t>
-      </w:r>
+        <w:t xml:space="preserve">Статус, полномочия первого </w:t>
+      </w:r>
+      <w:proofErr w:type="gramStart"/>
+      <w:r>
+        <w:rPr>
+          <w:rFonts w:ascii="Times New Roman" w:hAnsi="Times New Roman" w:cs="Times New Roman"/>
+          <w:b/>
+          <w:sz w:val="28"/>
+          <w:szCs w:val="28"/>
+        </w:rPr>
+        <w:t>руководителя  Управления</w:t>
+      </w:r>
+      <w:proofErr w:type="gramEnd"/>
     </w:p>
     <w:p>
       <w:pPr>
@@ -4679,7 +4657,25 @@
           <w:sz w:val="28"/>
           <w:szCs w:val="28"/>
         </w:rPr>
-        <w:t>16. Первый руководитель Управления назначается на должность и освобождается от должности  в соответствии с законодательством Республики Казахстан.</w:t>
+        <w:t xml:space="preserve">16. Первый руководитель Управления назначается на должность и освобождается от </w:t>
+      </w:r>
+      <w:proofErr w:type="gramStart"/>
+      <w:r>
+        <w:rPr>
+          <w:rFonts w:ascii="Times New Roman" w:hAnsi="Times New Roman" w:cs="Times New Roman"/>
+          <w:sz w:val="28"/>
+          <w:szCs w:val="28"/>
+        </w:rPr>
+        <w:t>должности  в</w:t>
+      </w:r>
+      <w:proofErr w:type="gramEnd"/>
+      <w:r>
+        <w:rPr>
+          <w:rFonts w:ascii="Times New Roman" w:hAnsi="Times New Roman" w:cs="Times New Roman"/>
+          <w:sz w:val="28"/>
+          <w:szCs w:val="28"/>
+        </w:rPr>
+        <w:t xml:space="preserve"> соответствии с законодательством Республики Казахстан.</w:t>
       </w:r>
     </w:p>
     <w:p>
@@ -4700,7 +4696,25 @@
           <w:sz w:val="28"/>
           <w:szCs w:val="28"/>
         </w:rPr>
-        <w:t>17. Первый руководитель Управления имеет заместителей, которые назначаются на должности и освобождаются от должностей  в соответствии с законодательством Республики Казахстан.</w:t>
+        <w:t xml:space="preserve">17. Первый руководитель Управления имеет заместителей, которые назначаются на должности и освобождаются от </w:t>
+      </w:r>
+      <w:proofErr w:type="gramStart"/>
+      <w:r>
+        <w:rPr>
+          <w:rFonts w:ascii="Times New Roman" w:hAnsi="Times New Roman" w:cs="Times New Roman"/>
+          <w:sz w:val="28"/>
+          <w:szCs w:val="28"/>
+        </w:rPr>
+        <w:t>должностей  в</w:t>
+      </w:r>
+      <w:proofErr w:type="gramEnd"/>
+      <w:r>
+        <w:rPr>
+          <w:rFonts w:ascii="Times New Roman" w:hAnsi="Times New Roman" w:cs="Times New Roman"/>
+          <w:sz w:val="28"/>
+          <w:szCs w:val="28"/>
+        </w:rPr>
+        <w:t xml:space="preserve"> соответствии с законодательством Республики Казахстан.</w:t>
       </w:r>
     </w:p>
     <w:p>
@@ -4836,22 +4850,187 @@
       <w:pPr>
         <w:pStyle w:val="a4"/>
         <w:spacing w:after="0" w:line="240" w:lineRule="atLeast"/>
-        <w:ind w:left="0"/>
-        <w:jc w:val="center"/>
-        <w:rPr>
-          <w:rFonts w:ascii="Times New Roman" w:hAnsi="Times New Roman" w:cs="Times New Roman"/>
-          <w:sz w:val="24"/>
-          <w:szCs w:val="24"/>
-        </w:rPr>
-      </w:pPr>
-      <w:r>
-        <w:rPr>
-          <w:rFonts w:ascii="Times New Roman" w:hAnsi="Times New Roman" w:cs="Times New Roman"/>
-          <w:sz w:val="24"/>
-          <w:szCs w:val="24"/>
+        <w:ind w:left="0" w:firstLine="709"/>
+        <w:jc w:val="both"/>
+        <w:rPr>
+          <w:rFonts w:ascii="Times New Roman" w:hAnsi="Times New Roman" w:cs="Times New Roman"/>
+          <w:sz w:val="28"/>
+          <w:szCs w:val="28"/>
+        </w:rPr>
+      </w:pPr>
+      <w:r>
+        <w:rPr>
+          <w:rFonts w:ascii="Times New Roman" w:hAnsi="Times New Roman" w:cs="Times New Roman"/>
+          <w:sz w:val="28"/>
+          <w:szCs w:val="28"/>
+        </w:rPr>
+        <w:t>6) открывает банковские счета;</w:t>
+      </w:r>
+    </w:p>
+    <w:p>
+      <w:pPr>
+        <w:pStyle w:val="a4"/>
+        <w:spacing w:after="0" w:line="240" w:lineRule="atLeast"/>
+        <w:ind w:left="0" w:firstLine="709"/>
+        <w:jc w:val="both"/>
+        <w:rPr>
+          <w:rFonts w:ascii="Times New Roman" w:hAnsi="Times New Roman" w:cs="Times New Roman"/>
+          <w:sz w:val="28"/>
+          <w:szCs w:val="28"/>
+        </w:rPr>
+      </w:pPr>
+      <w:r>
+        <w:rPr>
+          <w:rFonts w:ascii="Times New Roman" w:hAnsi="Times New Roman" w:cs="Times New Roman"/>
+          <w:sz w:val="28"/>
+          <w:szCs w:val="28"/>
+        </w:rPr>
+        <w:t>7) определяет обязанности сотрудников Управления;</w:t>
+      </w:r>
+    </w:p>
+    <w:p>
+      <w:pPr>
+        <w:pStyle w:val="a4"/>
+        <w:spacing w:after="0" w:line="240" w:lineRule="atLeast"/>
+        <w:ind w:left="0" w:firstLine="709"/>
+        <w:jc w:val="both"/>
+        <w:rPr>
+          <w:rFonts w:ascii="Times New Roman" w:hAnsi="Times New Roman" w:cs="Times New Roman"/>
+          <w:sz w:val="28"/>
+          <w:szCs w:val="28"/>
+        </w:rPr>
+      </w:pPr>
+      <w:r>
+        <w:rPr>
+          <w:rFonts w:ascii="Times New Roman" w:hAnsi="Times New Roman" w:cs="Times New Roman"/>
+          <w:sz w:val="28"/>
+          <w:szCs w:val="28"/>
+        </w:rPr>
+        <w:t xml:space="preserve">8) принимает меры, направленные на противодействие коррупционным правонарушениям </w:t>
+      </w:r>
+      <w:proofErr w:type="gramStart"/>
+      <w:r>
+        <w:rPr>
+          <w:rFonts w:ascii="Times New Roman" w:hAnsi="Times New Roman" w:cs="Times New Roman"/>
+          <w:sz w:val="28"/>
+          <w:szCs w:val="28"/>
+        </w:rPr>
+        <w:t>в Управлении</w:t>
+      </w:r>
+      <w:proofErr w:type="gramEnd"/>
+      <w:r>
+        <w:rPr>
+          <w:rFonts w:ascii="Times New Roman" w:hAnsi="Times New Roman" w:cs="Times New Roman"/>
+          <w:sz w:val="28"/>
+          <w:szCs w:val="28"/>
+        </w:rPr>
+        <w:t xml:space="preserve"> и несет персональную ответственность за принятие данных мер;</w:t>
+      </w:r>
+    </w:p>
+    <w:p>
+      <w:pPr>
+        <w:pStyle w:val="a4"/>
+        <w:spacing w:after="0" w:line="240" w:lineRule="atLeast"/>
+        <w:ind w:left="0" w:firstLine="709"/>
+        <w:jc w:val="both"/>
+        <w:rPr>
+          <w:rFonts w:ascii="Times New Roman" w:hAnsi="Times New Roman" w:cs="Times New Roman"/>
+          <w:sz w:val="28"/>
+          <w:szCs w:val="28"/>
+        </w:rPr>
+      </w:pPr>
+      <w:r>
+        <w:rPr>
+          <w:rFonts w:ascii="Times New Roman" w:hAnsi="Times New Roman" w:cs="Times New Roman"/>
+          <w:sz w:val="28"/>
+          <w:szCs w:val="28"/>
+        </w:rPr>
+        <w:t>9) в соответствии с законодательством назначает на должности и освобождает от должностей работников Управления;</w:t>
+      </w:r>
+    </w:p>
+    <w:p>
+      <w:pPr>
+        <w:pStyle w:val="a4"/>
+        <w:spacing w:after="0" w:line="240" w:lineRule="atLeast"/>
+        <w:ind w:left="0" w:firstLine="709"/>
+        <w:jc w:val="both"/>
+        <w:rPr>
+          <w:rFonts w:ascii="Times New Roman" w:hAnsi="Times New Roman" w:cs="Times New Roman"/>
+          <w:sz w:val="28"/>
+          <w:szCs w:val="28"/>
+        </w:rPr>
+      </w:pPr>
+      <w:r>
+        <w:rPr>
+          <w:rFonts w:ascii="Times New Roman" w:hAnsi="Times New Roman" w:cs="Times New Roman"/>
+          <w:sz w:val="28"/>
+          <w:szCs w:val="28"/>
+        </w:rPr>
+        <w:t>10) в установленном законодательством Республики Казахстан порядке применяет меры поощрения и налагает дисциплинарные взыскания на сотрудников Управления;</w:t>
+      </w:r>
+    </w:p>
+    <w:p>
+      <w:pPr>
+        <w:pStyle w:val="a4"/>
+        <w:spacing w:after="0" w:line="240" w:lineRule="atLeast"/>
+        <w:ind w:left="0" w:firstLine="709"/>
+        <w:jc w:val="both"/>
+        <w:rPr>
+          <w:rFonts w:ascii="Times New Roman" w:hAnsi="Times New Roman" w:cs="Times New Roman"/>
+          <w:sz w:val="28"/>
+          <w:szCs w:val="28"/>
+        </w:rPr>
+      </w:pPr>
+      <w:r>
+        <w:rPr>
+          <w:rFonts w:ascii="Times New Roman" w:hAnsi="Times New Roman" w:cs="Times New Roman"/>
+          <w:sz w:val="28"/>
+          <w:szCs w:val="28"/>
+        </w:rPr>
+        <w:t>11) издает приказы в пределах своих полномочий;</w:t>
+      </w:r>
+    </w:p>
+    <w:p>
+      <w:pPr>
+        <w:pStyle w:val="a4"/>
+        <w:spacing w:after="0" w:line="240" w:lineRule="atLeast"/>
+        <w:ind w:left="0" w:firstLine="709"/>
+        <w:jc w:val="both"/>
+        <w:rPr>
+          <w:rFonts w:ascii="Times New Roman" w:hAnsi="Times New Roman" w:cs="Times New Roman"/>
+          <w:sz w:val="28"/>
+          <w:szCs w:val="28"/>
+        </w:rPr>
+      </w:pPr>
+      <w:r>
+        <w:rPr>
+          <w:rFonts w:ascii="Times New Roman" w:hAnsi="Times New Roman" w:cs="Times New Roman"/>
+          <w:sz w:val="28"/>
+          <w:szCs w:val="28"/>
+        </w:rPr>
+        <w:t>12) утверждает структуру Управления и положения об отделах Управления;</w:t>
+      </w:r>
+    </w:p>
+    <w:p>
+      <w:pPr>
+        <w:pStyle w:val="a4"/>
+        <w:spacing w:after="0" w:line="240" w:lineRule="atLeast"/>
+        <w:ind w:left="0" w:firstLine="709"/>
+        <w:jc w:val="both"/>
+        <w:rPr>
+          <w:rFonts w:ascii="Times New Roman" w:hAnsi="Times New Roman" w:cs="Times New Roman"/>
+          <w:sz w:val="28"/>
+          <w:szCs w:val="28"/>
+        </w:rPr>
+      </w:pPr>
+      <w:r>
+        <w:rPr>
+          <w:rFonts w:ascii="Times New Roman" w:hAnsi="Times New Roman" w:cs="Times New Roman"/>
+          <w:sz w:val="28"/>
+          <w:szCs w:val="28"/>
         </w:rPr>
         <w:lastRenderedPageBreak/>
-        <w:t>10</w:t>
+        <w:t>13) представляет Управление в государственных органах, иных организациях;</w:t>
       </w:r>
     </w:p>
     <w:p>
@@ -4866,194 +5045,22 @@
           <w:szCs w:val="28"/>
         </w:rPr>
       </w:pPr>
-    </w:p>
-    <w:p>
-      <w:pPr>
-        <w:pStyle w:val="a4"/>
-        <w:spacing w:after="0" w:line="240" w:lineRule="atLeast"/>
-        <w:ind w:left="0" w:firstLine="709"/>
-        <w:jc w:val="both"/>
-        <w:rPr>
-          <w:rFonts w:ascii="Times New Roman" w:hAnsi="Times New Roman" w:cs="Times New Roman"/>
-          <w:sz w:val="28"/>
-          <w:szCs w:val="28"/>
-        </w:rPr>
-      </w:pPr>
-      <w:r>
-        <w:rPr>
-          <w:rFonts w:ascii="Times New Roman" w:hAnsi="Times New Roman" w:cs="Times New Roman"/>
-          <w:sz w:val="28"/>
-          <w:szCs w:val="28"/>
-        </w:rPr>
-        <w:t>6) открывает банковские счета;</w:t>
-      </w:r>
-    </w:p>
-    <w:p>
-      <w:pPr>
-        <w:pStyle w:val="a4"/>
-        <w:spacing w:after="0" w:line="240" w:lineRule="atLeast"/>
-        <w:ind w:left="0" w:firstLine="709"/>
-        <w:jc w:val="both"/>
-        <w:rPr>
-          <w:rFonts w:ascii="Times New Roman" w:hAnsi="Times New Roman" w:cs="Times New Roman"/>
-          <w:sz w:val="28"/>
-          <w:szCs w:val="28"/>
-        </w:rPr>
-      </w:pPr>
-      <w:r>
-        <w:rPr>
-          <w:rFonts w:ascii="Times New Roman" w:hAnsi="Times New Roman" w:cs="Times New Roman"/>
-          <w:sz w:val="28"/>
-          <w:szCs w:val="28"/>
-        </w:rPr>
-        <w:t>7) определяет обязанности сотрудников Управления;</w:t>
-      </w:r>
-    </w:p>
-    <w:p>
-      <w:pPr>
-        <w:pStyle w:val="a4"/>
-        <w:spacing w:after="0" w:line="240" w:lineRule="atLeast"/>
-        <w:ind w:left="0" w:firstLine="709"/>
-        <w:jc w:val="both"/>
-        <w:rPr>
-          <w:rFonts w:ascii="Times New Roman" w:hAnsi="Times New Roman" w:cs="Times New Roman"/>
-          <w:sz w:val="28"/>
-          <w:szCs w:val="28"/>
-        </w:rPr>
-      </w:pPr>
-      <w:r>
-        <w:rPr>
-          <w:rFonts w:ascii="Times New Roman" w:hAnsi="Times New Roman" w:cs="Times New Roman"/>
-          <w:sz w:val="28"/>
-          <w:szCs w:val="28"/>
-        </w:rPr>
-        <w:t>8) принимает меры, направленные на противодействие коррупционным правонарушениям в Управлении и несет персональную ответственность за принятие данных мер;</w:t>
-      </w:r>
-    </w:p>
-    <w:p>
-      <w:pPr>
-        <w:pStyle w:val="a4"/>
-        <w:spacing w:after="0" w:line="240" w:lineRule="atLeast"/>
-        <w:ind w:left="0" w:firstLine="709"/>
-        <w:jc w:val="both"/>
-        <w:rPr>
-          <w:rFonts w:ascii="Times New Roman" w:hAnsi="Times New Roman" w:cs="Times New Roman"/>
-          <w:sz w:val="28"/>
-          <w:szCs w:val="28"/>
-        </w:rPr>
-      </w:pPr>
-      <w:r>
-        <w:rPr>
-          <w:rFonts w:ascii="Times New Roman" w:hAnsi="Times New Roman" w:cs="Times New Roman"/>
-          <w:sz w:val="28"/>
-          <w:szCs w:val="28"/>
-        </w:rPr>
-        <w:t>9) в соответствии с законодательством назначает на должности и освобождает от должностей работников Управления;</w:t>
-      </w:r>
-    </w:p>
-    <w:p>
-      <w:pPr>
-        <w:pStyle w:val="a4"/>
-        <w:spacing w:after="0" w:line="240" w:lineRule="atLeast"/>
-        <w:ind w:left="0" w:firstLine="709"/>
-        <w:jc w:val="both"/>
-        <w:rPr>
-          <w:rFonts w:ascii="Times New Roman" w:hAnsi="Times New Roman" w:cs="Times New Roman"/>
-          <w:sz w:val="28"/>
-          <w:szCs w:val="28"/>
-        </w:rPr>
-      </w:pPr>
-      <w:r>
-        <w:rPr>
-          <w:rFonts w:ascii="Times New Roman" w:hAnsi="Times New Roman" w:cs="Times New Roman"/>
-          <w:sz w:val="28"/>
-          <w:szCs w:val="28"/>
-        </w:rPr>
-        <w:t>10) в установленном законодательством Республики Казахстан порядке применяет меры поощрения и налагает дисциплинарные взыскания на сотрудников Управления;</w:t>
-      </w:r>
-    </w:p>
-    <w:p>
-      <w:pPr>
-        <w:pStyle w:val="a4"/>
-        <w:spacing w:after="0" w:line="240" w:lineRule="atLeast"/>
-        <w:ind w:left="0" w:firstLine="709"/>
-        <w:jc w:val="both"/>
-        <w:rPr>
-          <w:rFonts w:ascii="Times New Roman" w:hAnsi="Times New Roman" w:cs="Times New Roman"/>
-          <w:sz w:val="28"/>
-          <w:szCs w:val="28"/>
-        </w:rPr>
-      </w:pPr>
-      <w:r>
-        <w:rPr>
-          <w:rFonts w:ascii="Times New Roman" w:hAnsi="Times New Roman" w:cs="Times New Roman"/>
-          <w:sz w:val="28"/>
-          <w:szCs w:val="28"/>
-        </w:rPr>
-        <w:t>11) издает приказы в пределах своих полномочий;</w:t>
-      </w:r>
-    </w:p>
-    <w:p>
-      <w:pPr>
-        <w:pStyle w:val="a4"/>
-        <w:spacing w:after="0" w:line="240" w:lineRule="atLeast"/>
-        <w:ind w:left="0" w:firstLine="709"/>
-        <w:jc w:val="both"/>
-        <w:rPr>
-          <w:rFonts w:ascii="Times New Roman" w:hAnsi="Times New Roman" w:cs="Times New Roman"/>
-          <w:sz w:val="28"/>
-          <w:szCs w:val="28"/>
-        </w:rPr>
-      </w:pPr>
-      <w:r>
-        <w:rPr>
-          <w:rFonts w:ascii="Times New Roman" w:hAnsi="Times New Roman" w:cs="Times New Roman"/>
-          <w:sz w:val="28"/>
-          <w:szCs w:val="28"/>
-        </w:rPr>
-        <w:t>12) утверждает структуру Управления и положения об отделах Управления;</w:t>
-      </w:r>
-    </w:p>
-    <w:p>
-      <w:pPr>
-        <w:pStyle w:val="a4"/>
-        <w:spacing w:after="0" w:line="240" w:lineRule="atLeast"/>
-        <w:ind w:left="0" w:firstLine="709"/>
-        <w:jc w:val="both"/>
-        <w:rPr>
-          <w:rFonts w:ascii="Times New Roman" w:hAnsi="Times New Roman" w:cs="Times New Roman"/>
-          <w:sz w:val="28"/>
-          <w:szCs w:val="28"/>
-        </w:rPr>
-      </w:pPr>
-      <w:r>
-        <w:rPr>
-          <w:rFonts w:ascii="Times New Roman" w:hAnsi="Times New Roman" w:cs="Times New Roman"/>
-          <w:sz w:val="28"/>
-          <w:szCs w:val="28"/>
-        </w:rPr>
-        <w:t>13) представляет Управление в государственных органах, иных организациях;</w:t>
-      </w:r>
-    </w:p>
-    <w:p>
-      <w:pPr>
-        <w:pStyle w:val="a4"/>
-        <w:spacing w:after="0" w:line="240" w:lineRule="atLeast"/>
-        <w:ind w:left="0" w:firstLine="709"/>
-        <w:jc w:val="both"/>
-        <w:rPr>
-          <w:rFonts w:ascii="Times New Roman" w:hAnsi="Times New Roman" w:cs="Times New Roman"/>
-          <w:sz w:val="28"/>
-          <w:szCs w:val="28"/>
-        </w:rPr>
-      </w:pPr>
-      <w:r>
-        <w:rPr>
-          <w:rFonts w:ascii="Times New Roman" w:hAnsi="Times New Roman" w:cs="Times New Roman"/>
-          <w:sz w:val="28"/>
-          <w:szCs w:val="28"/>
-        </w:rPr>
-        <w:t>14) осуществляет иные полномочия в соответствии с законодательством Республики</w:t>
+      <w:r>
+        <w:rPr>
+          <w:rFonts w:ascii="Times New Roman" w:hAnsi="Times New Roman" w:cs="Times New Roman"/>
+          <w:sz w:val="28"/>
+          <w:szCs w:val="28"/>
+        </w:rPr>
+        <w:t xml:space="preserve">14) осуществляет иные полномочия в соответствии с законодательством </w:t>
+      </w:r>
+      <w:proofErr w:type="gramStart"/>
+      <w:r>
+        <w:rPr>
+          <w:rFonts w:ascii="Times New Roman" w:hAnsi="Times New Roman" w:cs="Times New Roman"/>
+          <w:sz w:val="28"/>
+          <w:szCs w:val="28"/>
+        </w:rPr>
+        <w:t>Республики</w:t>
       </w:r>
       <w:r>
         <w:rPr>
@@ -5069,7 +5076,16 @@
           <w:sz w:val="28"/>
           <w:szCs w:val="28"/>
         </w:rPr>
-        <w:t xml:space="preserve"> Казахстан.</w:t>
+        <w:t xml:space="preserve"> Казахстан</w:t>
+      </w:r>
+      <w:proofErr w:type="gramEnd"/>
+      <w:r>
+        <w:rPr>
+          <w:rFonts w:ascii="Times New Roman" w:hAnsi="Times New Roman" w:cs="Times New Roman"/>
+          <w:sz w:val="28"/>
+          <w:szCs w:val="28"/>
+        </w:rPr>
+        <w:t>.</w:t>
       </w:r>
     </w:p>
     <w:p>
@@ -5373,26 +5389,6 @@
     <w:p>
       <w:pPr>
         <w:spacing w:after="0" w:line="240" w:lineRule="atLeast"/>
-        <w:jc w:val="center"/>
-        <w:rPr>
-          <w:rFonts w:ascii="Times New Roman" w:hAnsi="Times New Roman" w:cs="Times New Roman"/>
-          <w:sz w:val="24"/>
-          <w:szCs w:val="24"/>
-        </w:rPr>
-      </w:pPr>
-      <w:r>
-        <w:rPr>
-          <w:rFonts w:ascii="Times New Roman" w:hAnsi="Times New Roman" w:cs="Times New Roman"/>
-          <w:sz w:val="24"/>
-          <w:szCs w:val="24"/>
-        </w:rPr>
-        <w:lastRenderedPageBreak/>
-        <w:t>11</w:t>
-      </w:r>
-    </w:p>
-    <w:p>
-      <w:pPr>
-        <w:spacing w:after="0" w:line="240" w:lineRule="atLeast"/>
         <w:ind w:firstLine="708"/>
         <w:jc w:val="both"/>
         <w:rPr>
@@ -5402,26 +5398,31 @@
           <w:lang w:val="kk-KZ"/>
         </w:rPr>
       </w:pPr>
-    </w:p>
-    <w:p>
-      <w:pPr>
-        <w:spacing w:after="0" w:line="240" w:lineRule="atLeast"/>
-        <w:ind w:firstLine="708"/>
-        <w:jc w:val="both"/>
-        <w:rPr>
-          <w:rFonts w:ascii="Times New Roman" w:hAnsi="Times New Roman" w:cs="Times New Roman"/>
-          <w:sz w:val="28"/>
-          <w:szCs w:val="28"/>
-          <w:lang w:val="kk-KZ"/>
-        </w:rPr>
-      </w:pPr>
-      <w:r>
-        <w:rPr>
-          <w:rFonts w:ascii="Times New Roman" w:hAnsi="Times New Roman" w:cs="Times New Roman"/>
-          <w:sz w:val="28"/>
-          <w:szCs w:val="28"/>
-        </w:rPr>
-        <w:t>Перечень организаций, находящихся в ведении  Управления:</w:t>
+      <w:r>
+        <w:rPr>
+          <w:rFonts w:ascii="Times New Roman" w:hAnsi="Times New Roman" w:cs="Times New Roman"/>
+          <w:sz w:val="28"/>
+          <w:szCs w:val="28"/>
+        </w:rPr>
+        <w:t xml:space="preserve">Перечень организаций, находящихся в </w:t>
+      </w:r>
+      <w:proofErr w:type="gramStart"/>
+      <w:r>
+        <w:rPr>
+          <w:rFonts w:ascii="Times New Roman" w:hAnsi="Times New Roman" w:cs="Times New Roman"/>
+          <w:sz w:val="28"/>
+          <w:szCs w:val="28"/>
+        </w:rPr>
+        <w:t>ведении  Управления</w:t>
+      </w:r>
+      <w:proofErr w:type="gramEnd"/>
+      <w:r>
+        <w:rPr>
+          <w:rFonts w:ascii="Times New Roman" w:hAnsi="Times New Roman" w:cs="Times New Roman"/>
+          <w:sz w:val="28"/>
+          <w:szCs w:val="28"/>
+        </w:rPr>
+        <w:t>:</w:t>
       </w:r>
     </w:p>
     <w:p>
@@ -5446,7 +5447,25 @@
           <w:sz w:val="28"/>
           <w:szCs w:val="28"/>
         </w:rPr>
-        <w:t xml:space="preserve">государственное коммунальное предприятие на праве хозяйственного ведения «Алматы тазалық» акимата города </w:t>
+        <w:t xml:space="preserve">государственное коммунальное предприятие на праве хозяйственного ведения «Алматы </w:t>
+      </w:r>
+      <w:proofErr w:type="spellStart"/>
+      <w:r>
+        <w:rPr>
+          <w:rFonts w:ascii="Times New Roman" w:hAnsi="Times New Roman" w:cs="Times New Roman"/>
+          <w:sz w:val="28"/>
+          <w:szCs w:val="28"/>
+        </w:rPr>
+        <w:t>тазалық</w:t>
+      </w:r>
+      <w:proofErr w:type="spellEnd"/>
+      <w:r>
+        <w:rPr>
+          <w:rFonts w:ascii="Times New Roman" w:hAnsi="Times New Roman" w:cs="Times New Roman"/>
+          <w:sz w:val="28"/>
+          <w:szCs w:val="28"/>
+        </w:rPr>
+        <w:t xml:space="preserve">» акимата города </w:t>
       </w:r>
       <w:r>
         <w:rPr>
@@ -5479,7 +5498,43 @@
           <w:sz w:val="28"/>
           <w:szCs w:val="28"/>
         </w:rPr>
-        <w:t>товарищество с ограниченной ответственностью «Алматы тұрғын үй»;</w:t>
+        <w:t xml:space="preserve">товарищество с ограниченной ответственностью «Алматы </w:t>
+      </w:r>
+      <w:proofErr w:type="spellStart"/>
+      <w:r>
+        <w:rPr>
+          <w:rFonts w:ascii="Times New Roman" w:hAnsi="Times New Roman" w:cs="Times New Roman"/>
+          <w:sz w:val="28"/>
+          <w:szCs w:val="28"/>
+        </w:rPr>
+        <w:t>тұрғын</w:t>
+      </w:r>
+      <w:proofErr w:type="spellEnd"/>
+      <w:r>
+        <w:rPr>
+          <w:rFonts w:ascii="Times New Roman" w:hAnsi="Times New Roman" w:cs="Times New Roman"/>
+          <w:sz w:val="28"/>
+          <w:szCs w:val="28"/>
+        </w:rPr>
+        <w:t xml:space="preserve"> </w:t>
+      </w:r>
+      <w:proofErr w:type="spellStart"/>
+      <w:r>
+        <w:rPr>
+          <w:rFonts w:ascii="Times New Roman" w:hAnsi="Times New Roman" w:cs="Times New Roman"/>
+          <w:sz w:val="28"/>
+          <w:szCs w:val="28"/>
+        </w:rPr>
+        <w:t>үй</w:t>
+      </w:r>
+      <w:proofErr w:type="spellEnd"/>
+      <w:r>
+        <w:rPr>
+          <w:rFonts w:ascii="Times New Roman" w:hAnsi="Times New Roman" w:cs="Times New Roman"/>
+          <w:sz w:val="28"/>
+          <w:szCs w:val="28"/>
+        </w:rPr>
+        <w:t>»;</w:t>
       </w:r>
     </w:p>
     <w:p>
@@ -5519,1005 +5574,24 @@
           <w:szCs w:val="28"/>
         </w:rPr>
       </w:pPr>
-      <w:r>
-        <w:rPr>
-          <w:rFonts w:ascii="Times New Roman" w:hAnsi="Times New Roman" w:cs="Times New Roman"/>
-          <w:sz w:val="28"/>
-          <w:szCs w:val="28"/>
-        </w:rPr>
-        <w:t>ный комбинат ритуальных услуг».</w:t>
-      </w:r>
-    </w:p>
-    <w:p>
-      <w:pPr>
-        <w:spacing w:after="0" w:line="240" w:lineRule="atLeast"/>
-        <w:ind w:firstLine="708"/>
-        <w:jc w:val="both"/>
-        <w:rPr>
-          <w:rFonts w:ascii="Times New Roman" w:hAnsi="Times New Roman" w:cs="Times New Roman"/>
-          <w:sz w:val="28"/>
-          <w:szCs w:val="28"/>
-          <w:lang w:val="kk-KZ"/>
-        </w:rPr>
-      </w:pPr>
-    </w:p>
-    <w:p>
-      <w:pPr>
-        <w:spacing w:after="0" w:line="240" w:lineRule="atLeast"/>
-        <w:ind w:firstLine="708"/>
-        <w:jc w:val="both"/>
-        <w:rPr>
-          <w:rFonts w:ascii="Times New Roman" w:hAnsi="Times New Roman" w:cs="Times New Roman"/>
-          <w:sz w:val="28"/>
-          <w:szCs w:val="28"/>
-          <w:lang w:val="kk-KZ"/>
-        </w:rPr>
-      </w:pPr>
-    </w:p>
-    <w:p>
-      <w:pPr>
-        <w:spacing w:after="0" w:line="240" w:lineRule="atLeast"/>
-        <w:ind w:firstLine="708"/>
-        <w:jc w:val="both"/>
-        <w:rPr>
-          <w:rFonts w:ascii="Times New Roman" w:hAnsi="Times New Roman" w:cs="Times New Roman"/>
-          <w:sz w:val="28"/>
-          <w:szCs w:val="28"/>
-          <w:lang w:val="kk-KZ"/>
-        </w:rPr>
-      </w:pPr>
-    </w:p>
-    <w:p>
-      <w:pPr>
-        <w:spacing w:after="0" w:line="240" w:lineRule="atLeast"/>
-        <w:ind w:firstLine="708"/>
-        <w:jc w:val="both"/>
-        <w:rPr>
-          <w:rFonts w:ascii="Times New Roman" w:hAnsi="Times New Roman" w:cs="Times New Roman"/>
-          <w:sz w:val="28"/>
-          <w:szCs w:val="28"/>
-          <w:lang w:val="kk-KZ"/>
-        </w:rPr>
-      </w:pPr>
-    </w:p>
-    <w:p>
-      <w:pPr>
-        <w:spacing w:after="0" w:line="240" w:lineRule="atLeast"/>
-        <w:ind w:firstLine="708"/>
-        <w:jc w:val="both"/>
-        <w:rPr>
-          <w:rFonts w:ascii="Times New Roman" w:hAnsi="Times New Roman" w:cs="Times New Roman"/>
-          <w:sz w:val="28"/>
-          <w:szCs w:val="28"/>
-          <w:lang w:val="kk-KZ"/>
-        </w:rPr>
-      </w:pPr>
-    </w:p>
-    <w:p>
-      <w:pPr>
-        <w:spacing w:after="0" w:line="240" w:lineRule="atLeast"/>
-        <w:ind w:firstLine="708"/>
-        <w:jc w:val="both"/>
-        <w:rPr>
-          <w:rFonts w:ascii="Times New Roman" w:hAnsi="Times New Roman" w:cs="Times New Roman"/>
-          <w:sz w:val="28"/>
-          <w:szCs w:val="28"/>
-          <w:lang w:val="kk-KZ"/>
-        </w:rPr>
-      </w:pPr>
-    </w:p>
-    <w:p>
-      <w:pPr>
-        <w:spacing w:after="0" w:line="240" w:lineRule="atLeast"/>
-        <w:ind w:firstLine="708"/>
-        <w:jc w:val="both"/>
-        <w:rPr>
-          <w:rFonts w:ascii="Times New Roman" w:hAnsi="Times New Roman" w:cs="Times New Roman"/>
-          <w:sz w:val="28"/>
-          <w:szCs w:val="28"/>
-          <w:lang w:val="kk-KZ"/>
-        </w:rPr>
-      </w:pPr>
-    </w:p>
-    <w:p>
-      <w:pPr>
-        <w:spacing w:after="0" w:line="240" w:lineRule="atLeast"/>
-        <w:ind w:firstLine="708"/>
-        <w:jc w:val="both"/>
-        <w:rPr>
-          <w:rFonts w:ascii="Times New Roman" w:hAnsi="Times New Roman" w:cs="Times New Roman"/>
-          <w:sz w:val="28"/>
-          <w:szCs w:val="28"/>
-          <w:lang w:val="kk-KZ"/>
-        </w:rPr>
-      </w:pPr>
-    </w:p>
-    <w:p>
-      <w:pPr>
-        <w:spacing w:after="0" w:line="240" w:lineRule="atLeast"/>
-        <w:ind w:firstLine="708"/>
-        <w:jc w:val="both"/>
-        <w:rPr>
-          <w:rFonts w:ascii="Times New Roman" w:hAnsi="Times New Roman" w:cs="Times New Roman"/>
-          <w:sz w:val="28"/>
-          <w:szCs w:val="28"/>
-          <w:lang w:val="kk-KZ"/>
-        </w:rPr>
-      </w:pPr>
-    </w:p>
-    <w:p>
-      <w:pPr>
-        <w:spacing w:after="0" w:line="240" w:lineRule="atLeast"/>
-        <w:ind w:firstLine="708"/>
-        <w:jc w:val="both"/>
-        <w:rPr>
-          <w:rFonts w:ascii="Times New Roman" w:hAnsi="Times New Roman" w:cs="Times New Roman"/>
-          <w:sz w:val="28"/>
-          <w:szCs w:val="28"/>
-          <w:lang w:val="kk-KZ"/>
-        </w:rPr>
-      </w:pPr>
-    </w:p>
-    <w:p>
-      <w:pPr>
-        <w:spacing w:after="0" w:line="240" w:lineRule="atLeast"/>
-        <w:ind w:firstLine="708"/>
-        <w:jc w:val="both"/>
-        <w:rPr>
-          <w:rFonts w:ascii="Times New Roman" w:hAnsi="Times New Roman" w:cs="Times New Roman"/>
-          <w:sz w:val="28"/>
-          <w:szCs w:val="28"/>
-          <w:lang w:val="kk-KZ"/>
-        </w:rPr>
-      </w:pPr>
-    </w:p>
-    <w:p>
-      <w:pPr>
-        <w:spacing w:after="0" w:line="240" w:lineRule="atLeast"/>
-        <w:ind w:firstLine="708"/>
-        <w:jc w:val="both"/>
-        <w:rPr>
-          <w:rFonts w:ascii="Times New Roman" w:hAnsi="Times New Roman" w:cs="Times New Roman"/>
-          <w:sz w:val="28"/>
-          <w:szCs w:val="28"/>
-          <w:lang w:val="kk-KZ"/>
-        </w:rPr>
-      </w:pPr>
-    </w:p>
-    <w:p>
-      <w:pPr>
-        <w:spacing w:after="0" w:line="240" w:lineRule="atLeast"/>
-        <w:ind w:firstLine="708"/>
-        <w:jc w:val="both"/>
-        <w:rPr>
-          <w:rFonts w:ascii="Times New Roman" w:hAnsi="Times New Roman" w:cs="Times New Roman"/>
-          <w:sz w:val="28"/>
-          <w:szCs w:val="28"/>
-          <w:lang w:val="kk-KZ"/>
-        </w:rPr>
-      </w:pPr>
-    </w:p>
-    <w:p>
-      <w:pPr>
-        <w:spacing w:after="0" w:line="240" w:lineRule="atLeast"/>
-        <w:ind w:firstLine="708"/>
-        <w:jc w:val="both"/>
-        <w:rPr>
-          <w:rFonts w:ascii="Times New Roman" w:hAnsi="Times New Roman" w:cs="Times New Roman"/>
-          <w:sz w:val="28"/>
-          <w:szCs w:val="28"/>
-          <w:lang w:val="kk-KZ"/>
-        </w:rPr>
-      </w:pPr>
-    </w:p>
-    <w:p>
-      <w:pPr>
-        <w:spacing w:after="0" w:line="240" w:lineRule="atLeast"/>
-        <w:ind w:firstLine="708"/>
-        <w:jc w:val="both"/>
-        <w:rPr>
-          <w:rFonts w:ascii="Times New Roman" w:hAnsi="Times New Roman" w:cs="Times New Roman"/>
-          <w:sz w:val="28"/>
-          <w:szCs w:val="28"/>
-          <w:lang w:val="kk-KZ"/>
-        </w:rPr>
-      </w:pPr>
-    </w:p>
-    <w:p>
-      <w:pPr>
-        <w:spacing w:after="0" w:line="240" w:lineRule="atLeast"/>
-        <w:ind w:firstLine="708"/>
-        <w:jc w:val="both"/>
-        <w:rPr>
-          <w:rFonts w:ascii="Times New Roman" w:hAnsi="Times New Roman" w:cs="Times New Roman"/>
-          <w:sz w:val="28"/>
-          <w:szCs w:val="28"/>
-          <w:lang w:val="kk-KZ"/>
-        </w:rPr>
-      </w:pPr>
-    </w:p>
-    <w:p>
-      <w:pPr>
-        <w:spacing w:after="0" w:line="240" w:lineRule="atLeast"/>
-        <w:ind w:firstLine="708"/>
-        <w:jc w:val="both"/>
-        <w:rPr>
-          <w:rFonts w:ascii="Times New Roman" w:hAnsi="Times New Roman" w:cs="Times New Roman"/>
-          <w:sz w:val="28"/>
-          <w:szCs w:val="28"/>
-          <w:lang w:val="kk-KZ"/>
-        </w:rPr>
-      </w:pPr>
-    </w:p>
-    <w:p>
-      <w:pPr>
-        <w:spacing w:after="0" w:line="240" w:lineRule="atLeast"/>
-        <w:ind w:firstLine="708"/>
-        <w:jc w:val="both"/>
-        <w:rPr>
-          <w:rFonts w:ascii="Times New Roman" w:hAnsi="Times New Roman" w:cs="Times New Roman"/>
-          <w:sz w:val="28"/>
-          <w:szCs w:val="28"/>
-          <w:lang w:val="kk-KZ"/>
-        </w:rPr>
-      </w:pPr>
-    </w:p>
-    <w:p>
-      <w:pPr>
-        <w:spacing w:after="0" w:line="240" w:lineRule="atLeast"/>
-        <w:ind w:firstLine="708"/>
-        <w:jc w:val="both"/>
-        <w:rPr>
-          <w:rFonts w:ascii="Times New Roman" w:hAnsi="Times New Roman" w:cs="Times New Roman"/>
-          <w:sz w:val="28"/>
-          <w:szCs w:val="28"/>
-          <w:lang w:val="kk-KZ"/>
-        </w:rPr>
-      </w:pPr>
-    </w:p>
-    <w:p>
-      <w:pPr>
-        <w:spacing w:after="0" w:line="240" w:lineRule="atLeast"/>
-        <w:ind w:firstLine="708"/>
-        <w:jc w:val="both"/>
-        <w:rPr>
-          <w:rFonts w:ascii="Times New Roman" w:hAnsi="Times New Roman" w:cs="Times New Roman"/>
-          <w:sz w:val="28"/>
-          <w:szCs w:val="28"/>
-          <w:lang w:val="kk-KZ"/>
-        </w:rPr>
-      </w:pPr>
-    </w:p>
-    <w:p>
-      <w:pPr>
-        <w:spacing w:after="0" w:line="240" w:lineRule="atLeast"/>
-        <w:ind w:firstLine="708"/>
-        <w:jc w:val="both"/>
-        <w:rPr>
-          <w:rFonts w:ascii="Times New Roman" w:hAnsi="Times New Roman" w:cs="Times New Roman"/>
-          <w:sz w:val="28"/>
-          <w:szCs w:val="28"/>
-          <w:lang w:val="kk-KZ"/>
-        </w:rPr>
-      </w:pPr>
-    </w:p>
-    <w:p>
-      <w:pPr>
-        <w:spacing w:after="0" w:line="240" w:lineRule="atLeast"/>
-        <w:ind w:firstLine="708"/>
-        <w:jc w:val="both"/>
-        <w:rPr>
-          <w:rFonts w:ascii="Times New Roman" w:hAnsi="Times New Roman" w:cs="Times New Roman"/>
-          <w:sz w:val="28"/>
-          <w:szCs w:val="28"/>
-          <w:lang w:val="kk-KZ"/>
-        </w:rPr>
-      </w:pPr>
-    </w:p>
-    <w:p>
-      <w:pPr>
-        <w:spacing w:after="0" w:line="240" w:lineRule="atLeast"/>
-        <w:ind w:firstLine="708"/>
-        <w:jc w:val="both"/>
-        <w:rPr>
-          <w:rFonts w:ascii="Times New Roman" w:hAnsi="Times New Roman" w:cs="Times New Roman"/>
-          <w:sz w:val="28"/>
-          <w:szCs w:val="28"/>
-          <w:lang w:val="kk-KZ"/>
-        </w:rPr>
-      </w:pPr>
-    </w:p>
-    <w:p>
-      <w:pPr>
-        <w:spacing w:after="0" w:line="240" w:lineRule="atLeast"/>
-        <w:ind w:firstLine="708"/>
-        <w:jc w:val="both"/>
-        <w:rPr>
-          <w:rFonts w:ascii="Times New Roman" w:hAnsi="Times New Roman" w:cs="Times New Roman"/>
-          <w:sz w:val="28"/>
-          <w:szCs w:val="28"/>
-          <w:lang w:val="kk-KZ"/>
-        </w:rPr>
-      </w:pPr>
-    </w:p>
-    <w:p>
-      <w:pPr>
-        <w:spacing w:after="0" w:line="240" w:lineRule="atLeast"/>
-        <w:ind w:firstLine="708"/>
-        <w:jc w:val="both"/>
-        <w:rPr>
-          <w:rFonts w:ascii="Times New Roman" w:hAnsi="Times New Roman" w:cs="Times New Roman"/>
-          <w:sz w:val="28"/>
-          <w:szCs w:val="28"/>
-          <w:lang w:val="kk-KZ"/>
-        </w:rPr>
-      </w:pPr>
-    </w:p>
-    <w:p>
-      <w:pPr>
-        <w:spacing w:after="0" w:line="240" w:lineRule="atLeast"/>
-        <w:ind w:firstLine="708"/>
-        <w:jc w:val="both"/>
-        <w:rPr>
-          <w:rFonts w:ascii="Times New Roman" w:hAnsi="Times New Roman" w:cs="Times New Roman"/>
-          <w:sz w:val="28"/>
-          <w:szCs w:val="28"/>
-          <w:lang w:val="kk-KZ"/>
-        </w:rPr>
-      </w:pPr>
-    </w:p>
-    <w:p>
-      <w:pPr>
-        <w:spacing w:after="0" w:line="240" w:lineRule="atLeast"/>
-        <w:ind w:firstLine="708"/>
-        <w:jc w:val="both"/>
-        <w:rPr>
-          <w:rFonts w:ascii="Times New Roman" w:hAnsi="Times New Roman" w:cs="Times New Roman"/>
-          <w:sz w:val="28"/>
-          <w:szCs w:val="28"/>
-          <w:lang w:val="kk-KZ"/>
-        </w:rPr>
-      </w:pPr>
-    </w:p>
-    <w:p>
-      <w:pPr>
-        <w:spacing w:after="0" w:line="240" w:lineRule="atLeast"/>
-        <w:ind w:firstLine="708"/>
-        <w:jc w:val="both"/>
-        <w:rPr>
-          <w:rFonts w:ascii="Times New Roman" w:hAnsi="Times New Roman" w:cs="Times New Roman"/>
-          <w:sz w:val="28"/>
-          <w:szCs w:val="28"/>
-          <w:lang w:val="kk-KZ"/>
-        </w:rPr>
-      </w:pPr>
-    </w:p>
-    <w:p>
-      <w:pPr>
-        <w:spacing w:after="0" w:line="240" w:lineRule="atLeast"/>
-        <w:ind w:firstLine="708"/>
-        <w:jc w:val="both"/>
-        <w:rPr>
-          <w:rFonts w:ascii="Times New Roman" w:hAnsi="Times New Roman" w:cs="Times New Roman"/>
-          <w:sz w:val="28"/>
-          <w:szCs w:val="28"/>
-          <w:lang w:val="kk-KZ"/>
-        </w:rPr>
-      </w:pPr>
-    </w:p>
-    <w:p>
-      <w:pPr>
-        <w:spacing w:after="0" w:line="240" w:lineRule="atLeast"/>
-        <w:ind w:firstLine="708"/>
-        <w:jc w:val="both"/>
-        <w:rPr>
-          <w:rFonts w:ascii="Times New Roman" w:hAnsi="Times New Roman" w:cs="Times New Roman"/>
-          <w:sz w:val="28"/>
-          <w:szCs w:val="28"/>
-          <w:lang w:val="kk-KZ"/>
-        </w:rPr>
-      </w:pPr>
-    </w:p>
-    <w:p>
-      <w:pPr>
-        <w:spacing w:after="0" w:line="240" w:lineRule="atLeast"/>
-        <w:ind w:firstLine="708"/>
-        <w:jc w:val="both"/>
-        <w:rPr>
-          <w:rFonts w:ascii="Times New Roman" w:hAnsi="Times New Roman" w:cs="Times New Roman"/>
-          <w:sz w:val="28"/>
-          <w:szCs w:val="28"/>
-          <w:lang w:val="kk-KZ"/>
-        </w:rPr>
-      </w:pPr>
-    </w:p>
-    <w:p>
-      <w:pPr>
-        <w:spacing w:after="0" w:line="240" w:lineRule="atLeast"/>
-        <w:ind w:firstLine="708"/>
-        <w:jc w:val="both"/>
-        <w:rPr>
-          <w:rFonts w:ascii="Times New Roman" w:hAnsi="Times New Roman" w:cs="Times New Roman"/>
-          <w:sz w:val="28"/>
-          <w:szCs w:val="28"/>
-          <w:lang w:val="kk-KZ"/>
-        </w:rPr>
-      </w:pPr>
-    </w:p>
-    <w:p>
-      <w:pPr>
-        <w:spacing w:after="0" w:line="240" w:lineRule="atLeast"/>
-        <w:ind w:firstLine="708"/>
-        <w:jc w:val="both"/>
-        <w:rPr>
-          <w:rFonts w:ascii="Times New Roman" w:hAnsi="Times New Roman" w:cs="Times New Roman"/>
-          <w:sz w:val="28"/>
-          <w:szCs w:val="28"/>
-          <w:lang w:val="kk-KZ"/>
-        </w:rPr>
-      </w:pPr>
-    </w:p>
-    <w:p>
-      <w:pPr>
-        <w:spacing w:after="0" w:line="240" w:lineRule="atLeast"/>
-        <w:ind w:firstLine="708"/>
-        <w:jc w:val="both"/>
-        <w:rPr>
-          <w:rFonts w:ascii="Times New Roman" w:hAnsi="Times New Roman" w:cs="Times New Roman"/>
-          <w:sz w:val="28"/>
-          <w:szCs w:val="28"/>
-          <w:lang w:val="kk-KZ"/>
-        </w:rPr>
-      </w:pPr>
-    </w:p>
-    <w:p>
-      <w:pPr>
-        <w:spacing w:after="0" w:line="240" w:lineRule="atLeast"/>
-        <w:ind w:firstLine="708"/>
-        <w:jc w:val="both"/>
-        <w:rPr>
-          <w:rFonts w:ascii="Times New Roman" w:hAnsi="Times New Roman" w:cs="Times New Roman"/>
-          <w:sz w:val="28"/>
-          <w:szCs w:val="28"/>
-          <w:lang w:val="kk-KZ"/>
-        </w:rPr>
-      </w:pPr>
-    </w:p>
-    <w:p>
-      <w:pPr>
-        <w:spacing w:after="0" w:line="240" w:lineRule="atLeast"/>
-        <w:ind w:firstLine="708"/>
-        <w:jc w:val="both"/>
-        <w:rPr>
-          <w:rFonts w:ascii="Times New Roman" w:hAnsi="Times New Roman" w:cs="Times New Roman"/>
-          <w:sz w:val="28"/>
-          <w:szCs w:val="28"/>
-          <w:lang w:val="kk-KZ"/>
-        </w:rPr>
-      </w:pPr>
-    </w:p>
-    <w:p>
-      <w:pPr>
-        <w:spacing w:after="0" w:line="240" w:lineRule="atLeast"/>
-        <w:jc w:val="center"/>
-        <w:rPr>
-          <w:rFonts w:ascii="Times New Roman" w:hAnsi="Times New Roman" w:cs="Times New Roman"/>
-          <w:sz w:val="24"/>
-          <w:szCs w:val="24"/>
-          <w:lang w:val="kk-KZ"/>
-        </w:rPr>
-      </w:pPr>
-      <w:r>
-        <w:rPr>
-          <w:rFonts w:ascii="Times New Roman" w:hAnsi="Times New Roman" w:cs="Times New Roman"/>
-          <w:sz w:val="24"/>
-          <w:szCs w:val="24"/>
-        </w:rPr>
-        <w:lastRenderedPageBreak/>
-        <w:t>1</w:t>
-      </w:r>
-      <w:r>
-        <w:rPr>
-          <w:rFonts w:ascii="Times New Roman" w:hAnsi="Times New Roman" w:cs="Times New Roman"/>
-          <w:sz w:val="24"/>
-          <w:szCs w:val="24"/>
-          <w:lang w:val="kk-KZ"/>
-        </w:rPr>
-        <w:t>2</w:t>
-      </w:r>
-    </w:p>
-    <w:p>
-      <w:pPr>
-        <w:spacing w:after="0" w:line="240" w:lineRule="auto"/>
-        <w:ind w:firstLine="709"/>
-        <w:jc w:val="right"/>
-        <w:rPr>
-          <w:rFonts w:ascii="Times New Roman" w:hAnsi="Times New Roman"/>
-          <w:sz w:val="24"/>
-          <w:szCs w:val="24"/>
-        </w:rPr>
-      </w:pPr>
-      <w:r>
-        <w:rPr>
-          <w:rFonts w:ascii="Times New Roman" w:hAnsi="Times New Roman"/>
-          <w:sz w:val="24"/>
-          <w:szCs w:val="24"/>
-        </w:rPr>
-        <w:t>Приложение 2</w:t>
-      </w:r>
-    </w:p>
-    <w:p>
-      <w:pPr>
-        <w:spacing w:after="0" w:line="240" w:lineRule="auto"/>
-        <w:ind w:firstLine="709"/>
-        <w:jc w:val="right"/>
-        <w:rPr>
-          <w:rFonts w:ascii="Times New Roman" w:hAnsi="Times New Roman"/>
-          <w:sz w:val="24"/>
-          <w:szCs w:val="24"/>
-        </w:rPr>
-      </w:pPr>
-      <w:r>
-        <w:rPr>
-          <w:rFonts w:ascii="Times New Roman" w:hAnsi="Times New Roman"/>
-          <w:sz w:val="24"/>
-          <w:szCs w:val="24"/>
-        </w:rPr>
-        <w:t xml:space="preserve">к постановлению акимата города Алматы </w:t>
-      </w:r>
-    </w:p>
-    <w:p>
-      <w:pPr>
-        <w:spacing w:after="0" w:line="240" w:lineRule="auto"/>
-        <w:ind w:firstLine="709"/>
-        <w:jc w:val="right"/>
-        <w:rPr>
-          <w:rFonts w:ascii="Times New Roman" w:hAnsi="Times New Roman"/>
-          <w:sz w:val="24"/>
-          <w:szCs w:val="24"/>
-        </w:rPr>
-      </w:pPr>
-      <w:r>
-        <w:rPr>
-          <w:rFonts w:ascii="Times New Roman" w:hAnsi="Times New Roman"/>
-          <w:sz w:val="24"/>
-          <w:szCs w:val="24"/>
-        </w:rPr>
-        <w:t>от __________ 2025 года № ___</w:t>
-      </w:r>
-    </w:p>
-    <w:p>
-      <w:pPr>
-        <w:tabs>
-          <w:tab w:val="left" w:pos="993"/>
-        </w:tabs>
-        <w:spacing w:after="0" w:line="240" w:lineRule="auto"/>
-        <w:ind w:firstLine="567"/>
-        <w:jc w:val="both"/>
-        <w:rPr>
-          <w:rFonts w:ascii="Times New Roman" w:hAnsi="Times New Roman" w:cs="Times New Roman"/>
-          <w:sz w:val="28"/>
-        </w:rPr>
-      </w:pPr>
-      <w:r>
-        <w:rPr>
-          <w:rFonts w:ascii="Times New Roman" w:hAnsi="Times New Roman" w:cs="Times New Roman"/>
-          <w:sz w:val="28"/>
-        </w:rPr>
-        <w:t xml:space="preserve"> </w:t>
-      </w:r>
-    </w:p>
-    <w:p>
-      <w:pPr>
-        <w:tabs>
-          <w:tab w:val="left" w:pos="993"/>
-        </w:tabs>
-        <w:spacing w:after="0" w:line="240" w:lineRule="auto"/>
-        <w:ind w:firstLine="567"/>
-        <w:jc w:val="both"/>
-        <w:rPr>
-          <w:rFonts w:ascii="Times New Roman" w:hAnsi="Times New Roman" w:cs="Times New Roman"/>
-          <w:sz w:val="28"/>
-        </w:rPr>
-      </w:pPr>
-    </w:p>
-    <w:p>
-      <w:pPr>
-        <w:tabs>
-          <w:tab w:val="left" w:pos="993"/>
-        </w:tabs>
-        <w:spacing w:after="0" w:line="240" w:lineRule="auto"/>
-        <w:ind w:firstLine="567"/>
-        <w:jc w:val="center"/>
-        <w:rPr>
-          <w:rFonts w:ascii="Times New Roman" w:eastAsia="Calibri" w:hAnsi="Times New Roman" w:cs="Times New Roman"/>
-          <w:b/>
-          <w:sz w:val="28"/>
-          <w:szCs w:val="28"/>
-          <w:lang w:eastAsia="en-US"/>
-        </w:rPr>
-      </w:pPr>
-      <w:r>
-        <w:rPr>
-          <w:rFonts w:ascii="Times New Roman" w:hAnsi="Times New Roman" w:cs="Times New Roman"/>
-          <w:b/>
-          <w:sz w:val="28"/>
-        </w:rPr>
-        <w:t>Перечень п</w:t>
-      </w:r>
-      <w:r>
-        <w:rPr>
-          <w:rFonts w:ascii="Times New Roman" w:eastAsia="Calibri" w:hAnsi="Times New Roman" w:cs="Times New Roman"/>
-          <w:b/>
-          <w:sz w:val="28"/>
-          <w:szCs w:val="28"/>
-          <w:lang w:eastAsia="en-US"/>
-        </w:rPr>
-        <w:t xml:space="preserve">ризнанных утратившими силу </w:t>
-      </w:r>
-    </w:p>
-    <w:p>
-      <w:pPr>
-        <w:tabs>
-          <w:tab w:val="left" w:pos="993"/>
-        </w:tabs>
-        <w:spacing w:after="0" w:line="240" w:lineRule="auto"/>
-        <w:ind w:firstLine="567"/>
-        <w:jc w:val="center"/>
-        <w:rPr>
-          <w:rFonts w:ascii="Times New Roman" w:eastAsia="Calibri" w:hAnsi="Times New Roman" w:cs="Times New Roman"/>
-          <w:b/>
-          <w:sz w:val="28"/>
-          <w:szCs w:val="28"/>
-          <w:lang w:eastAsia="en-US"/>
-        </w:rPr>
-      </w:pPr>
-      <w:r>
-        <w:rPr>
-          <w:rFonts w:ascii="Times New Roman" w:eastAsia="Calibri" w:hAnsi="Times New Roman" w:cs="Times New Roman"/>
-          <w:b/>
-          <w:sz w:val="28"/>
-          <w:szCs w:val="28"/>
-          <w:lang w:eastAsia="en-US"/>
-        </w:rPr>
-        <w:t>постановлении акимата города Алматы</w:t>
-      </w:r>
-    </w:p>
-    <w:p>
-      <w:pPr>
-        <w:tabs>
-          <w:tab w:val="left" w:pos="993"/>
-        </w:tabs>
-        <w:spacing w:after="0" w:line="240" w:lineRule="auto"/>
-        <w:ind w:firstLine="567"/>
-        <w:jc w:val="center"/>
-        <w:rPr>
-          <w:rFonts w:ascii="Times New Roman" w:eastAsia="Calibri" w:hAnsi="Times New Roman" w:cs="Times New Roman"/>
-          <w:b/>
-          <w:sz w:val="28"/>
-          <w:szCs w:val="28"/>
-          <w:lang w:eastAsia="en-US"/>
-        </w:rPr>
-      </w:pPr>
-    </w:p>
-    <w:p>
-      <w:pPr>
-        <w:tabs>
-          <w:tab w:val="left" w:pos="993"/>
-        </w:tabs>
-        <w:spacing w:after="0" w:line="240" w:lineRule="auto"/>
-        <w:ind w:firstLine="567"/>
-        <w:jc w:val="both"/>
-        <w:rPr>
-          <w:rFonts w:ascii="Times New Roman" w:eastAsia="Calibri" w:hAnsi="Times New Roman" w:cs="Times New Roman"/>
-          <w:sz w:val="28"/>
-          <w:szCs w:val="28"/>
-          <w:lang w:eastAsia="en-US"/>
-        </w:rPr>
-      </w:pPr>
-    </w:p>
-    <w:p>
-      <w:pPr>
-        <w:tabs>
-          <w:tab w:val="left" w:pos="993"/>
-        </w:tabs>
-        <w:spacing w:after="0" w:line="240" w:lineRule="auto"/>
-        <w:ind w:firstLine="567"/>
-        <w:jc w:val="both"/>
-        <w:rPr>
-          <w:rFonts w:ascii="Times New Roman" w:hAnsi="Times New Roman" w:cs="Times New Roman"/>
-          <w:sz w:val="28"/>
-        </w:rPr>
-      </w:pPr>
-      <w:r>
-        <w:rPr>
-          <w:rFonts w:ascii="Times New Roman" w:eastAsia="Calibri" w:hAnsi="Times New Roman" w:cs="Times New Roman"/>
-          <w:sz w:val="28"/>
-          <w:szCs w:val="28"/>
-          <w:lang w:eastAsia="en-US"/>
-        </w:rPr>
-        <w:t>1. от 1 июня 2022 года №2/245 «Об утверждении Положения о коммунальном государственном учреждении «Управление развития коммунальной инфраструктуры города Алматы»;</w:t>
-      </w:r>
-      <w:r>
-        <w:rPr>
-          <w:rFonts w:ascii="Times New Roman" w:hAnsi="Times New Roman" w:cs="Times New Roman"/>
-          <w:sz w:val="28"/>
-        </w:rPr>
-        <w:t xml:space="preserve"> </w:t>
-      </w:r>
-    </w:p>
-    <w:p>
-      <w:pPr>
-        <w:tabs>
-          <w:tab w:val="left" w:pos="993"/>
-        </w:tabs>
-        <w:spacing w:after="0" w:line="240" w:lineRule="auto"/>
-        <w:ind w:firstLine="567"/>
-        <w:jc w:val="both"/>
-        <w:rPr>
-          <w:rFonts w:ascii="Times New Roman" w:hAnsi="Times New Roman" w:cs="Times New Roman"/>
-          <w:sz w:val="28"/>
-        </w:rPr>
-      </w:pPr>
-      <w:r>
-        <w:rPr>
-          <w:rFonts w:ascii="Times New Roman" w:hAnsi="Times New Roman" w:cs="Times New Roman"/>
-          <w:sz w:val="28"/>
-        </w:rPr>
-        <w:t xml:space="preserve">2. </w:t>
-      </w:r>
-      <w:r>
-        <w:rPr>
-          <w:rFonts w:ascii="Times New Roman" w:eastAsia="Calibri" w:hAnsi="Times New Roman" w:cs="Times New Roman"/>
-          <w:sz w:val="28"/>
-          <w:szCs w:val="28"/>
-          <w:lang w:eastAsia="en-US"/>
-        </w:rPr>
-        <w:t>подпункт 13) пункта 1 постановления акимата города Алматы от 26 апреля 2024 года №2/279 «О внесений изменений и дополнений в некоторые постановления акимата Алматы»;</w:t>
-      </w:r>
-    </w:p>
-    <w:p>
-      <w:pPr>
-        <w:tabs>
-          <w:tab w:val="left" w:pos="993"/>
-        </w:tabs>
-        <w:spacing w:after="0" w:line="240" w:lineRule="auto"/>
-        <w:ind w:firstLine="567"/>
-        <w:jc w:val="both"/>
-        <w:rPr>
-          <w:rFonts w:ascii="Times New Roman" w:hAnsi="Times New Roman" w:cs="Times New Roman"/>
-          <w:sz w:val="28"/>
-        </w:rPr>
-      </w:pPr>
-      <w:r>
-        <w:rPr>
-          <w:rFonts w:ascii="Times New Roman" w:hAnsi="Times New Roman" w:cs="Times New Roman"/>
-          <w:sz w:val="28"/>
-        </w:rPr>
-        <w:t xml:space="preserve">3. </w:t>
-      </w:r>
-      <w:r>
-        <w:rPr>
-          <w:rFonts w:ascii="Times New Roman" w:eastAsia="Calibri" w:hAnsi="Times New Roman" w:cs="Times New Roman"/>
-          <w:sz w:val="28"/>
-          <w:szCs w:val="28"/>
-          <w:lang w:eastAsia="en-US"/>
-        </w:rPr>
-        <w:t>подпункт 14) пункта 1 постановления акимата города Алматы от 14 июня 2024 года №2/345 «О внесений изменений и дополнений в некоторые постановления акимата Алматы»;</w:t>
-      </w:r>
-    </w:p>
-    <w:p>
-      <w:pPr>
-        <w:tabs>
-          <w:tab w:val="left" w:pos="567"/>
-          <w:tab w:val="left" w:pos="993"/>
-        </w:tabs>
-        <w:spacing w:after="0" w:line="240" w:lineRule="auto"/>
-        <w:ind w:firstLine="567"/>
-        <w:jc w:val="both"/>
-        <w:rPr>
-          <w:rFonts w:ascii="Times New Roman" w:hAnsi="Times New Roman" w:cs="Times New Roman"/>
-          <w:sz w:val="28"/>
-        </w:rPr>
-      </w:pPr>
-      <w:r>
-        <w:rPr>
-          <w:rFonts w:ascii="Times New Roman" w:hAnsi="Times New Roman" w:cs="Times New Roman"/>
-          <w:sz w:val="28"/>
-        </w:rPr>
-        <w:t xml:space="preserve">4. </w:t>
-      </w:r>
-      <w:r>
-        <w:rPr>
-          <w:rFonts w:ascii="Times New Roman" w:eastAsia="Calibri" w:hAnsi="Times New Roman" w:cs="Times New Roman"/>
-          <w:sz w:val="28"/>
-          <w:szCs w:val="28"/>
-          <w:lang w:eastAsia="en-US"/>
-        </w:rPr>
-        <w:t>от 1 июля 2025 года №3/471 «О внесении изменений в постановление акимата города</w:t>
-      </w:r>
-      <w:r>
-        <w:rPr>
-          <w:rFonts w:ascii="Times New Roman" w:hAnsi="Times New Roman" w:cs="Times New Roman"/>
-          <w:sz w:val="28"/>
-        </w:rPr>
-        <w:t xml:space="preserve"> Алматы от 1 июня 2022 года № 2/245 «Об утверждении Положения о коммунальном государственном учреждении «Управление развития коммунальной инфраструктуры города Алматы».</w:t>
-      </w:r>
-    </w:p>
-    <w:p>
-      <w:pPr>
-        <w:spacing w:after="0" w:line="240" w:lineRule="atLeast"/>
-        <w:ind w:firstLine="708"/>
-        <w:jc w:val="both"/>
-        <w:rPr>
-          <w:rFonts w:ascii="Times New Roman" w:hAnsi="Times New Roman" w:cs="Times New Roman"/>
-          <w:sz w:val="28"/>
-          <w:szCs w:val="28"/>
-        </w:rPr>
-      </w:pPr>
-    </w:p>
-    <w:p>
-      <w:pPr>
-        <w:rPr>
-          <w:lang w:val="kk-KZ"/>
-        </w:rPr>
-      </w:pPr>
-    </w:p>
-    <w:p>
-      <w:pPr>
-        <w:rPr>
-          <w:lang w:val="kk-KZ"/>
-        </w:rPr>
-      </w:pPr>
-    </w:p>
-    <w:p>
-      <w:pPr>
-        <w:rPr>
-          <w:lang w:val="kk-KZ"/>
-        </w:rPr>
-      </w:pPr>
-    </w:p>
-    <w:p>
-      <w:pPr>
-        <w:rPr>
-          <w:lang w:val="kk-KZ"/>
-        </w:rPr>
-      </w:pPr>
-    </w:p>
-    <w:p>
-      <w:pPr>
-        <w:rPr>
-          <w:lang w:val="kk-KZ"/>
-        </w:rPr>
-      </w:pPr>
-    </w:p>
-    <w:p>
-      <w:pPr>
-        <w:rPr>
-          <w:lang w:val="kk-KZ"/>
-        </w:rPr>
-      </w:pPr>
-    </w:p>
-    <w:p>
-      <w:pPr>
-        <w:rPr>
-          <w:lang w:val="kk-KZ"/>
-        </w:rPr>
-      </w:pPr>
-    </w:p>
-    <w:p>
-      <w:pPr>
-        <w:rPr>
-          <w:lang w:val="kk-KZ"/>
-        </w:rPr>
-      </w:pPr>
-    </w:p>
-    <w:p>
-      <w:pPr>
-        <w:rPr>
-          <w:lang w:val="kk-KZ"/>
-        </w:rPr>
-      </w:pPr>
-    </w:p>
-    <w:p>
-      <w:pPr>
-        <w:rPr>
-          <w:lang w:val="kk-KZ"/>
-        </w:rPr>
-      </w:pPr>
-    </w:p>
-    <w:p>
-      <w:pPr>
-        <w:rPr>
-          <w:lang w:val="kk-KZ"/>
-        </w:rPr>
-      </w:pPr>
-    </w:p>
-    <w:p>
-      <w:pPr>
-        <w:rPr>
-          <w:lang w:val="kk-KZ"/>
-        </w:rPr>
-      </w:pPr>
-    </w:p>
-    <w:p>
-      <w:pPr>
-        <w:rPr>
-          <w:lang w:val="kk-KZ"/>
-        </w:rPr>
-      </w:pPr>
-    </w:p>
-    <w:p>
-      <w:pPr>
-        <w:rPr>
-          <w:lang w:val="kk-KZ"/>
-        </w:rPr>
-      </w:pPr>
-    </w:p>
-    <w:p>
-      <w:pPr>
-        <w:rPr>
-          <w:lang w:val="kk-KZ"/>
-        </w:rPr>
-      </w:pPr>
-    </w:p>
-    <w:p>
-      <w:pPr>
-        <w:rPr>
-          <w:lang w:val="kk-KZ"/>
-        </w:rPr>
-      </w:pPr>
-    </w:p>
-    <w:p>
-      <w:pPr>
-        <w:rPr>
-          <w:lang w:val="kk-KZ"/>
-        </w:rPr>
-      </w:pPr>
-    </w:p>
-    <w:p>
-      <w:pPr>
-        <w:rPr>
-          <w:lang w:val="kk-KZ"/>
-        </w:rPr>
-      </w:pPr>
-    </w:p>
-    <w:p>
-      <w:pPr>
-        <w:rPr>
-          <w:lang w:val="kk-KZ"/>
-        </w:rPr>
-      </w:pPr>
-    </w:p>
-    <w:p>
-      <w:pPr>
-        <w:rPr>
-          <w:lang w:val="kk-KZ"/>
-        </w:rPr>
-      </w:pPr>
-    </w:p>
-    <w:p>
-      <w:pPr>
-        <w:rPr>
-          <w:lang w:val="kk-KZ"/>
-        </w:rPr>
-      </w:pPr>
-    </w:p>
-    <w:p>
-      <w:pPr>
-        <w:rPr>
-          <w:lang w:val="kk-KZ"/>
-        </w:rPr>
-      </w:pPr>
-    </w:p>
-    <w:p>
-      <w:pPr>
-        <w:rPr>
-          <w:rFonts w:ascii="Times New Roman" w:hAnsi="Times New Roman" w:cs="Times New Roman"/>
-          <w:sz w:val="24"/>
-          <w:szCs w:val="24"/>
-        </w:rPr>
-      </w:pPr>
+      <w:proofErr w:type="spellStart"/>
+      <w:r>
+        <w:rPr>
+          <w:rFonts w:ascii="Times New Roman" w:hAnsi="Times New Roman" w:cs="Times New Roman"/>
+          <w:sz w:val="28"/>
+          <w:szCs w:val="28"/>
+        </w:rPr>
+        <w:t>ный</w:t>
+      </w:r>
+      <w:proofErr w:type="spellEnd"/>
+      <w:r>
+        <w:rPr>
+          <w:rFonts w:ascii="Times New Roman" w:hAnsi="Times New Roman" w:cs="Times New Roman"/>
+          <w:sz w:val="28"/>
+          <w:szCs w:val="28"/>
+        </w:rPr>
+        <w:t xml:space="preserve"> комбинат ритуальных услуг».</w:t>
+      </w:r>
     </w:p>
     <w:sectPr>
       <w:pgSz w:w="11906" w:h="16838"/>
@@ -7586,7 +6660,7 @@
     <w:lsdException w:name="Table Web 2" w:semiHidden="1" w:unhideWhenUsed="1"/>
     <w:lsdException w:name="Table Web 3" w:semiHidden="1" w:unhideWhenUsed="1"/>
     <w:lsdException w:name="Balloon Text" w:semiHidden="1" w:unhideWhenUsed="1"/>
-    <w:lsdException w:name="Table Grid" w:semiHidden="1" w:uiPriority="59" w:unhideWhenUsed="1"/>
+    <w:lsdException w:name="Table Grid" w:uiPriority="59"/>
     <w:lsdException w:name="Table Theme" w:semiHidden="1" w:unhideWhenUsed="1"/>
     <w:lsdException w:name="Placeholder Text" w:semiHidden="1"/>
     <w:lsdException w:name="No Spacing" w:uiPriority="1" w:qFormat="1"/>

</xml_diff>